<commit_message>
adição da pasta serviço
</commit_message>
<xml_diff>
--- a/DOC/Escopo Patinhas Felizes.docx
+++ b/DOC/Escopo Patinhas Felizes.docx
@@ -1,18 +1,18 @@
 
 <file path=word/document.xml><?xml version="1.0" encoding="utf-8"?>
-<w:document xmlns:wpc="http://schemas.microsoft.com/office/word/2010/wordprocessingCanvas" xmlns:cx="http://schemas.microsoft.com/office/drawing/2014/chartex" xmlns:cx1="http://schemas.microsoft.com/office/drawing/2015/9/8/chartex" xmlns:cx2="http://schemas.microsoft.com/office/drawing/2015/10/21/chartex" xmlns:cx3="http://schemas.microsoft.com/office/drawing/2016/5/9/chartex" xmlns:cx4="http://schemas.microsoft.com/office/drawing/2016/5/10/chartex" xmlns:cx5="http://schemas.microsoft.com/office/drawing/2016/5/11/chartex" xmlns:cx6="http://schemas.microsoft.com/office/drawing/2016/5/12/chartex" xmlns:cx7="http://schemas.microsoft.com/office/drawing/2016/5/13/chartex" xmlns:cx8="http://schemas.microsoft.com/office/drawing/2016/5/14/chartex" xmlns:mc="http://schemas.openxmlformats.org/markup-compatibility/2006" xmlns:aink="http://schemas.microsoft.com/office/drawing/2016/ink" xmlns:am3d="http://schemas.microsoft.com/office/drawing/2017/model3d" xmlns:o="urn:schemas-microsoft-com:office:office" xmlns:oel="http://schemas.microsoft.com/office/2019/extlst" xmlns:r="http://schemas.openxmlformats.org/officeDocument/2006/relationships" xmlns:m="http://schemas.openxmlformats.org/officeDocument/2006/math" xmlns:v="urn:schemas-microsoft-com:vml" xmlns:wp14="http://schemas.microsoft.com/office/word/2010/wordprocessingDrawing" xmlns:wp="http://schemas.openxmlformats.org/drawingml/2006/wordprocessingDrawing" xmlns:w10="urn:schemas-microsoft-com:office:word" xmlns:w="http://schemas.openxmlformats.org/wordprocessingml/2006/main" xmlns:w14="http://schemas.microsoft.com/office/word/2010/wordml" xmlns:w15="http://schemas.microsoft.com/office/word/2012/wordml" xmlns:w16cex="http://schemas.microsoft.com/office/word/2018/wordml/cex" xmlns:w16cid="http://schemas.microsoft.com/office/word/2016/wordml/cid" xmlns:w16="http://schemas.microsoft.com/office/word/2018/wordml" xmlns:w16du="http://schemas.microsoft.com/office/word/2023/wordml/word16du" xmlns:w16sdtdh="http://schemas.microsoft.com/office/word/2020/wordml/sdtdatahash" xmlns:w16sdtfl="http://schemas.microsoft.com/office/word/2024/wordml/sdtformatlock" xmlns:w16se="http://schemas.microsoft.com/office/word/2015/wordml/symex" xmlns:wpg="http://schemas.microsoft.com/office/word/2010/wordprocessingGroup" xmlns:wpi="http://schemas.microsoft.com/office/word/2010/wordprocessingInk" xmlns:wne="http://schemas.microsoft.com/office/word/2006/wordml" xmlns:wps="http://schemas.microsoft.com/office/word/2010/wordprocessingShape" xmlns:a="http://schemas.openxmlformats.org/drawingml/2006/main" xmlns:pic="http://schemas.openxmlformats.org/drawingml/2006/picture" xmlns:a14="http://schemas.microsoft.com/office/drawing/2010/main" mc:Ignorable="w14 w15 w16se w16cid w16 w16cex w16sdtdh w16sdtfl w16du wp14">
+<w:document xmlns:wpc="http://schemas.microsoft.com/office/word/2010/wordprocessingCanvas" xmlns:cx="http://schemas.microsoft.com/office/drawing/2014/chartex" xmlns:cx1="http://schemas.microsoft.com/office/drawing/2015/9/8/chartex" xmlns:cx2="http://schemas.microsoft.com/office/drawing/2015/10/21/chartex" xmlns:cx3="http://schemas.microsoft.com/office/drawing/2016/5/9/chartex" xmlns:cx4="http://schemas.microsoft.com/office/drawing/2016/5/10/chartex" xmlns:cx5="http://schemas.microsoft.com/office/drawing/2016/5/11/chartex" xmlns:cx6="http://schemas.microsoft.com/office/drawing/2016/5/12/chartex" xmlns:cx7="http://schemas.microsoft.com/office/drawing/2016/5/13/chartex" xmlns:cx8="http://schemas.microsoft.com/office/drawing/2016/5/14/chartex" xmlns:mc="http://schemas.openxmlformats.org/markup-compatibility/2006" xmlns:aink="http://schemas.microsoft.com/office/drawing/2016/ink" xmlns:am3d="http://schemas.microsoft.com/office/drawing/2017/model3d" xmlns:o="urn:schemas-microsoft-com:office:office" xmlns:oel="http://schemas.microsoft.com/office/2019/extlst" xmlns:r="http://schemas.openxmlformats.org/officeDocument/2006/relationships" xmlns:m="http://schemas.openxmlformats.org/officeDocument/2006/math" xmlns:v="urn:schemas-microsoft-com:vml" xmlns:wp14="http://schemas.microsoft.com/office/word/2010/wordprocessingDrawing" xmlns:wp="http://schemas.openxmlformats.org/drawingml/2006/wordprocessingDrawing" xmlns:w10="urn:schemas-microsoft-com:office:word" xmlns:w="http://schemas.openxmlformats.org/wordprocessingml/2006/main" xmlns:w14="http://schemas.microsoft.com/office/word/2010/wordml" xmlns:w15="http://schemas.microsoft.com/office/word/2012/wordml" xmlns:w16cex="http://schemas.microsoft.com/office/word/2018/wordml/cex" xmlns:w16cid="http://schemas.microsoft.com/office/word/2016/wordml/cid" xmlns:w16="http://schemas.microsoft.com/office/word/2018/wordml" xmlns:w16du="http://schemas.microsoft.com/office/word/2023/wordml/word16du" xmlns:w16sdtdh="http://schemas.microsoft.com/office/word/2020/wordml/sdtdatahash" xmlns:w16sdtfl="http://schemas.microsoft.com/office/word/2024/wordml/sdtformatlock" xmlns:w16se="http://schemas.microsoft.com/office/word/2015/wordml/symex" xmlns:wpg="http://schemas.microsoft.com/office/word/2010/wordprocessingGroup" xmlns:wpi="http://schemas.microsoft.com/office/word/2010/wordprocessingInk" xmlns:wne="http://schemas.microsoft.com/office/word/2006/wordml" xmlns:wps="http://schemas.microsoft.com/office/word/2010/wordprocessingShape" mc:Ignorable="w14 w15 w16se w16cid w16 w16cex w16sdtdh w16sdtfl w16du wp14">
   <w:body>
     <w:tbl>
       <w:tblPr>
         <w:tblpPr w:leftFromText="141" w:rightFromText="141" w:vertAnchor="page" w:horzAnchor="margin" w:tblpY="505"/>
         <w:tblW w:w="8495" w:type="dxa"/>
         <w:tblBorders>
-          <w:top w:val="single" w:color="000000" w:sz="8" w:space="0"/>
-          <w:left w:val="single" w:color="000000" w:sz="8" w:space="0"/>
-          <w:bottom w:val="single" w:color="000000" w:sz="8" w:space="0"/>
-          <w:right w:val="single" w:color="000000" w:sz="8" w:space="0"/>
-          <w:insideH w:val="single" w:color="000000" w:sz="8" w:space="0"/>
-          <w:insideV w:val="single" w:color="000000" w:sz="8" w:space="0"/>
+          <w:top w:val="single" w:sz="8" w:space="0" w:color="000000"/>
+          <w:left w:val="single" w:sz="8" w:space="0" w:color="000000"/>
+          <w:bottom w:val="single" w:sz="8" w:space="0" w:color="000000"/>
+          <w:right w:val="single" w:sz="8" w:space="0" w:color="000000"/>
+          <w:insideH w:val="single" w:sz="8" w:space="0" w:color="000000"/>
+          <w:insideV w:val="single" w:sz="8" w:space="0" w:color="000000"/>
         </w:tblBorders>
         <w:tblLayout w:type="fixed"/>
         <w:tblCellMar>
@@ -280,12 +280,12 @@
         <w:tblW w:w="9495" w:type="dxa"/>
         <w:tblInd w:w="1" w:type="dxa"/>
         <w:tblBorders>
-          <w:top w:val="single" w:color="000000" w:themeColor="text1" w:sz="8" w:space="0"/>
-          <w:left w:val="single" w:color="000000" w:themeColor="text1" w:sz="8" w:space="0"/>
-          <w:bottom w:val="single" w:color="000000" w:themeColor="text1" w:sz="8" w:space="0"/>
-          <w:right w:val="single" w:color="000000" w:themeColor="text1" w:sz="8" w:space="0"/>
-          <w:insideH w:val="single" w:color="000000" w:themeColor="text1" w:sz="8" w:space="0"/>
-          <w:insideV w:val="single" w:color="000000" w:themeColor="text1" w:sz="8" w:space="0"/>
+          <w:top w:val="single" w:sz="8" w:space="0" w:color="000000" w:themeColor="text1"/>
+          <w:left w:val="single" w:sz="8" w:space="0" w:color="000000" w:themeColor="text1"/>
+          <w:bottom w:val="single" w:sz="8" w:space="0" w:color="000000" w:themeColor="text1"/>
+          <w:right w:val="single" w:sz="8" w:space="0" w:color="000000" w:themeColor="text1"/>
+          <w:insideH w:val="single" w:sz="8" w:space="0" w:color="000000" w:themeColor="text1"/>
+          <w:insideV w:val="single" w:sz="8" w:space="0" w:color="000000" w:themeColor="text1"/>
         </w:tblBorders>
         <w:tblLayout w:type="fixed"/>
         <w:tblCellMar>
@@ -319,7 +319,7 @@
           </w:tcPr>
           <w:p>
             <w:pPr>
-              <w:pStyle w:val="NoSpacing"/>
+              <w:pStyle w:val="SemEspaamento"/>
               <w:ind w:left="2880"/>
               <w:rPr>
                 <w:b/>
@@ -354,7 +354,7 @@
           </w:tcPr>
           <w:p>
             <w:pPr>
-              <w:pStyle w:val="NoSpacing"/>
+              <w:pStyle w:val="SemEspaamento"/>
               <w:rPr>
                 <w:color w:val="000000" w:themeColor="text1"/>
               </w:rPr>
@@ -1595,7 +1595,7 @@
             </w:pPr>
             <w:r>
               <w:rPr>
-                <w:color w:val="000000" w:themeColor="text1" w:themeTint="FF" w:themeShade="FF"/>
+                <w:color w:val="000000" w:themeColor="text1"/>
                 <w:sz w:val="24"/>
                 <w:szCs w:val="24"/>
               </w:rPr>
@@ -1603,7 +1603,7 @@
             </w:r>
             <w:r>
               <w:rPr>
-                <w:color w:val="000000" w:themeColor="text1" w:themeTint="FF" w:themeShade="FF"/>
+                <w:color w:val="000000" w:themeColor="text1"/>
                 <w:sz w:val="24"/>
                 <w:szCs w:val="24"/>
               </w:rPr>
@@ -1611,7 +1611,7 @@
             </w:r>
             <w:r>
               <w:rPr>
-                <w:color w:val="000000" w:themeColor="text1" w:themeTint="FF" w:themeShade="FF"/>
+                <w:color w:val="000000" w:themeColor="text1"/>
                 <w:sz w:val="24"/>
                 <w:szCs w:val="24"/>
               </w:rPr>
@@ -1714,11 +1714,11 @@
     </w:p>
     <w:p>
       <w:pPr>
-        <w:pStyle w:val="ListParagraph"/>
+        <w:pStyle w:val="PargrafodaLista"/>
         <w:widowControl w:val="0"/>
         <w:numPr>
           <w:ilvl w:val="0"/>
-          <w:numId w:val="1"/>
+          <w:numId w:val="2"/>
         </w:numPr>
         <w:pBdr>
           <w:top w:val="nil"/>
@@ -1746,14 +1746,14 @@
     </w:p>
     <w:p>
       <w:pPr>
-        <w:pStyle w:val="ListParagraph"/>
-        <w:widowControl w:val="0"/>
-        <w:pBdr>
-          <w:top w:val="nil" w:color="FF000000" w:sz="0" w:space="0"/>
-          <w:left w:val="nil" w:color="FF000000" w:sz="0" w:space="0"/>
-          <w:bottom w:val="nil" w:color="FF000000" w:sz="0" w:space="0"/>
-          <w:right w:val="nil" w:color="FF000000" w:sz="0" w:space="0"/>
-          <w:between w:val="nil" w:color="FF000000" w:sz="0" w:space="0"/>
+        <w:pStyle w:val="PargrafodaLista"/>
+        <w:widowControl w:val="0"/>
+        <w:pBdr>
+          <w:top w:val="nil"/>
+          <w:left w:val="nil"/>
+          <w:bottom w:val="nil"/>
+          <w:right w:val="nil"/>
+          <w:between w:val="nil"/>
         </w:pBdr>
         <w:spacing w:line="360" w:lineRule="auto"/>
         <w:ind w:firstLine="283"/>
@@ -1761,7 +1761,7 @@
       </w:pPr>
       <w:r>
         <w:rPr>
-          <w:color w:val="000000" w:themeColor="text1" w:themeTint="FF" w:themeShade="FF"/>
+          <w:color w:val="000000" w:themeColor="text1"/>
           <w:sz w:val="24"/>
           <w:szCs w:val="24"/>
         </w:rPr>
@@ -1769,7 +1769,7 @@
       </w:r>
       <w:r>
         <w:rPr>
-          <w:color w:val="000000" w:themeColor="text1" w:themeTint="FF" w:themeShade="FF"/>
+          <w:color w:val="000000" w:themeColor="text1"/>
           <w:sz w:val="24"/>
           <w:szCs w:val="24"/>
         </w:rPr>
@@ -1777,7 +1777,7 @@
       </w:r>
       <w:r>
         <w:rPr>
-          <w:color w:val="000000" w:themeColor="text1" w:themeTint="FF" w:themeShade="FF"/>
+          <w:color w:val="000000" w:themeColor="text1"/>
           <w:sz w:val="24"/>
           <w:szCs w:val="24"/>
         </w:rPr>
@@ -1785,7 +1785,7 @@
       </w:r>
       <w:r>
         <w:rPr>
-          <w:color w:val="000000" w:themeColor="text1" w:themeTint="FF" w:themeShade="FF"/>
+          <w:color w:val="000000" w:themeColor="text1"/>
           <w:sz w:val="24"/>
           <w:szCs w:val="24"/>
         </w:rPr>
@@ -1793,7 +1793,7 @@
       </w:r>
       <w:r>
         <w:rPr>
-          <w:color w:val="000000" w:themeColor="text1" w:themeTint="FF" w:themeShade="FF"/>
+          <w:color w:val="000000" w:themeColor="text1"/>
           <w:sz w:val="24"/>
           <w:szCs w:val="24"/>
         </w:rPr>
@@ -1801,7 +1801,7 @@
       </w:r>
       <w:r>
         <w:rPr>
-          <w:color w:val="000000" w:themeColor="text1" w:themeTint="FF" w:themeShade="FF"/>
+          <w:color w:val="000000" w:themeColor="text1"/>
           <w:sz w:val="24"/>
           <w:szCs w:val="24"/>
         </w:rPr>
@@ -1809,7 +1809,7 @@
       </w:r>
       <w:r>
         <w:rPr>
-          <w:color w:val="000000" w:themeColor="text1" w:themeTint="FF" w:themeShade="FF"/>
+          <w:color w:val="000000" w:themeColor="text1"/>
           <w:sz w:val="24"/>
           <w:szCs w:val="24"/>
         </w:rPr>
@@ -1817,7 +1817,7 @@
       </w:r>
       <w:r>
         <w:rPr>
-          <w:color w:val="000000" w:themeColor="text1" w:themeTint="FF" w:themeShade="FF"/>
+          <w:color w:val="000000" w:themeColor="text1"/>
           <w:sz w:val="24"/>
           <w:szCs w:val="24"/>
         </w:rPr>
@@ -1825,7 +1825,7 @@
       </w:r>
       <w:r>
         <w:rPr>
-          <w:color w:val="000000" w:themeColor="text1" w:themeTint="FF" w:themeShade="FF"/>
+          <w:color w:val="000000" w:themeColor="text1"/>
           <w:sz w:val="24"/>
           <w:szCs w:val="24"/>
         </w:rPr>
@@ -1833,7 +1833,7 @@
       </w:r>
       <w:r>
         <w:rPr>
-          <w:color w:val="000000" w:themeColor="text1" w:themeTint="FF" w:themeShade="FF"/>
+          <w:color w:val="000000" w:themeColor="text1"/>
           <w:sz w:val="24"/>
           <w:szCs w:val="24"/>
         </w:rPr>
@@ -1841,7 +1841,7 @@
       </w:r>
       <w:r>
         <w:rPr>
-          <w:color w:val="000000" w:themeColor="text1" w:themeTint="FF" w:themeShade="FF"/>
+          <w:color w:val="000000" w:themeColor="text1"/>
           <w:sz w:val="24"/>
           <w:szCs w:val="24"/>
         </w:rPr>
@@ -1856,7 +1856,7 @@
       </w:r>
       <w:r>
         <w:rPr>
-          <w:color w:val="000000" w:themeColor="text1" w:themeTint="FF" w:themeShade="FF"/>
+          <w:color w:val="000000" w:themeColor="text1"/>
           <w:sz w:val="24"/>
           <w:szCs w:val="24"/>
         </w:rPr>
@@ -1864,7 +1864,7 @@
       </w:r>
       <w:r>
         <w:rPr>
-          <w:color w:val="000000" w:themeColor="text1" w:themeTint="FF" w:themeShade="FF"/>
+          <w:color w:val="000000" w:themeColor="text1"/>
           <w:sz w:val="24"/>
           <w:szCs w:val="24"/>
         </w:rPr>
@@ -1872,15 +1872,36 @@
       </w:r>
       <w:r>
         <w:rPr>
-          <w:color w:val="000000" w:themeColor="text1" w:themeTint="FF" w:themeShade="FF"/>
-          <w:sz w:val="24"/>
-          <w:szCs w:val="24"/>
-        </w:rPr>
-        <w:t>pet’s</w:t>
-      </w:r>
-      <w:r>
-        <w:rPr>
-          <w:color w:val="000000" w:themeColor="text1" w:themeTint="FF" w:themeShade="FF"/>
+          <w:color w:val="000000" w:themeColor="text1"/>
+          <w:sz w:val="24"/>
+          <w:szCs w:val="24"/>
+        </w:rPr>
+        <w:t xml:space="preserve">pet’s </w:t>
+      </w:r>
+      <w:r>
+        <w:rPr>
+          <w:sz w:val="24"/>
+          <w:szCs w:val="24"/>
+        </w:rPr>
+        <w:t>através</w:t>
+      </w:r>
+      <w:r>
+        <w:rPr>
+          <w:sz w:val="24"/>
+          <w:szCs w:val="24"/>
+        </w:rPr>
+        <w:t xml:space="preserve"> de uma compra online </w:t>
+      </w:r>
+      <w:r>
+        <w:rPr>
+          <w:sz w:val="24"/>
+          <w:szCs w:val="24"/>
+        </w:rPr>
+        <w:t>(para compras de</w:t>
+      </w:r>
+      <w:r>
+        <w:rPr>
+          <w:color w:val="FF0000"/>
           <w:sz w:val="24"/>
           <w:szCs w:val="24"/>
         </w:rPr>
@@ -1891,44 +1912,10 @@
           <w:sz w:val="24"/>
           <w:szCs w:val="24"/>
         </w:rPr>
-        <w:t>através</w:t>
-      </w:r>
-      <w:r>
-        <w:rPr>
-          <w:sz w:val="24"/>
-          <w:szCs w:val="24"/>
-        </w:rPr>
-        <w:t xml:space="preserve"> de uma compra online </w:t>
-      </w:r>
-      <w:r>
-        <w:rPr>
-          <w:sz w:val="24"/>
-          <w:szCs w:val="24"/>
-        </w:rPr>
-        <w:t>(para compras de</w:t>
-      </w:r>
-      <w:r>
-        <w:rPr>
-          <w:color w:val="FF0000"/>
-          <w:sz w:val="24"/>
-          <w:szCs w:val="24"/>
-        </w:rPr>
-        <w:t xml:space="preserve"> </w:t>
-      </w:r>
-      <w:r>
-        <w:rPr>
-          <w:sz w:val="24"/>
-          <w:szCs w:val="24"/>
-        </w:rPr>
         <w:t>antimicrobianos</w:t>
       </w:r>
       <w:r>
-        <w:rPr/>
-        <w:t>,</w:t>
-      </w:r>
-      <w:r>
-        <w:rPr/>
-        <w:t xml:space="preserve"> </w:t>
+        <w:t xml:space="preserve">, </w:t>
       </w:r>
       <w:r>
         <w:rPr>
@@ -1942,69 +1929,25 @@
           <w:sz w:val="24"/>
           <w:szCs w:val="24"/>
         </w:rPr>
-        <w:t xml:space="preserve">, </w:t>
-      </w:r>
-      <w:r>
-        <w:rPr>
-          <w:sz w:val="24"/>
-          <w:szCs w:val="24"/>
-        </w:rPr>
-        <w:t>só</w:t>
-      </w:r>
-      <w:r>
-        <w:rPr>
-          <w:sz w:val="24"/>
-          <w:szCs w:val="24"/>
-        </w:rPr>
-        <w:t xml:space="preserve"> </w:t>
-      </w:r>
-      <w:r>
-        <w:rPr>
-          <w:sz w:val="24"/>
-          <w:szCs w:val="24"/>
-        </w:rPr>
-        <w:t xml:space="preserve">serão aceitas </w:t>
-      </w:r>
-      <w:r>
-        <w:rPr>
-          <w:sz w:val="24"/>
-          <w:szCs w:val="24"/>
-        </w:rPr>
-        <w:t xml:space="preserve">com </w:t>
-      </w:r>
-      <w:r>
-        <w:rPr>
-          <w:sz w:val="24"/>
-          <w:szCs w:val="24"/>
-        </w:rPr>
-        <w:t xml:space="preserve">prescrição </w:t>
-      </w:r>
-      <w:r>
-        <w:rPr>
-          <w:sz w:val="24"/>
-          <w:szCs w:val="24"/>
-        </w:rPr>
-        <w:t>veterinária</w:t>
-      </w:r>
-      <w:r>
-        <w:rPr/>
+        <w:t>, só serão aceitas com prescrição veterinária</w:t>
+      </w:r>
+      <w:r>
         <w:t>)</w:t>
       </w:r>
       <w:r>
-        <w:rPr/>
         <w:t>.</w:t>
       </w:r>
     </w:p>
     <w:p>
       <w:pPr>
-        <w:pStyle w:val="ListParagraph"/>
-        <w:widowControl w:val="0"/>
-        <w:pBdr>
-          <w:top w:val="nil" w:color="FF000000" w:sz="0" w:space="0"/>
-          <w:left w:val="nil" w:color="FF000000" w:sz="0" w:space="0"/>
-          <w:bottom w:val="nil" w:color="FF000000" w:sz="0" w:space="0"/>
-          <w:right w:val="nil" w:color="FF000000" w:sz="0" w:space="0"/>
-          <w:between w:val="nil" w:color="FF000000" w:sz="0" w:space="0"/>
+        <w:pStyle w:val="PargrafodaLista"/>
+        <w:widowControl w:val="0"/>
+        <w:pBdr>
+          <w:top w:val="nil"/>
+          <w:left w:val="nil"/>
+          <w:bottom w:val="nil"/>
+          <w:right w:val="nil"/>
+          <w:between w:val="nil"/>
         </w:pBdr>
         <w:jc w:val="both"/>
         <w:rPr>
@@ -2016,7 +1959,7 @@
     </w:p>
     <w:p>
       <w:pPr>
-        <w:pStyle w:val="ListParagraph"/>
+        <w:pStyle w:val="PargrafodaLista"/>
         <w:widowControl w:val="0"/>
         <w:pBdr>
           <w:top w:val="nil"/>
@@ -2035,11 +1978,11 @@
     </w:p>
     <w:p>
       <w:pPr>
-        <w:pStyle w:val="ListParagraph"/>
+        <w:pStyle w:val="PargrafodaLista"/>
         <w:widowControl w:val="0"/>
         <w:numPr>
           <w:ilvl w:val="0"/>
-          <w:numId w:val="1"/>
+          <w:numId w:val="2"/>
         </w:numPr>
         <w:pBdr>
           <w:top w:val="nil"/>
@@ -2067,165 +2010,147 @@
     </w:p>
     <w:p>
       <w:pPr>
-        <w:pStyle w:val="ListParagraph"/>
-        <w:widowControl w:val="0"/>
+        <w:pStyle w:val="PargrafodaLista"/>
+        <w:rPr>
+          <w:sz w:val="24"/>
+          <w:szCs w:val="24"/>
+        </w:rPr>
+      </w:pPr>
+      <w:r>
+        <w:rPr>
+          <w:color w:val="000000" w:themeColor="text1"/>
+          <w:sz w:val="24"/>
+          <w:szCs w:val="24"/>
+        </w:rPr>
+        <w:t>O projeto consiste em</w:t>
+      </w:r>
+      <w:r>
+        <w:rPr>
+          <w:color w:val="000000" w:themeColor="text1"/>
+          <w:sz w:val="24"/>
+          <w:szCs w:val="24"/>
+        </w:rPr>
+        <w:t xml:space="preserve"> u</w:t>
+      </w:r>
+      <w:r>
+        <w:rPr>
+          <w:color w:val="000000" w:themeColor="text1"/>
+          <w:sz w:val="24"/>
+          <w:szCs w:val="24"/>
+        </w:rPr>
+        <w:t>ma página web</w:t>
+      </w:r>
+      <w:r>
+        <w:rPr>
+          <w:color w:val="000000" w:themeColor="text1"/>
+          <w:sz w:val="24"/>
+          <w:szCs w:val="24"/>
+        </w:rPr>
+        <w:t xml:space="preserve"> </w:t>
+      </w:r>
+      <w:r>
+        <w:rPr>
+          <w:color w:val="000000" w:themeColor="text1"/>
+          <w:sz w:val="24"/>
+          <w:szCs w:val="24"/>
+        </w:rPr>
+        <w:t>para cuidar</w:t>
+      </w:r>
+      <w:r>
+        <w:rPr>
+          <w:color w:val="000000" w:themeColor="text1"/>
+          <w:sz w:val="24"/>
+          <w:szCs w:val="24"/>
+        </w:rPr>
+        <w:t xml:space="preserve"> e </w:t>
+      </w:r>
+      <w:r>
+        <w:rPr>
+          <w:color w:val="000000" w:themeColor="text1"/>
+          <w:sz w:val="24"/>
+          <w:szCs w:val="24"/>
+        </w:rPr>
+        <w:t>envia</w:t>
+      </w:r>
+      <w:r>
+        <w:rPr>
+          <w:color w:val="000000" w:themeColor="text1"/>
+          <w:sz w:val="24"/>
+          <w:szCs w:val="24"/>
+        </w:rPr>
+        <w:t>r</w:t>
+      </w:r>
+      <w:r>
+        <w:rPr>
+          <w:color w:val="000000" w:themeColor="text1"/>
+          <w:sz w:val="24"/>
+          <w:szCs w:val="24"/>
+        </w:rPr>
+        <w:t xml:space="preserve"> produtos</w:t>
+      </w:r>
+      <w:r>
+        <w:rPr>
+          <w:color w:val="000000" w:themeColor="text1"/>
+          <w:sz w:val="24"/>
+          <w:szCs w:val="24"/>
+        </w:rPr>
+        <w:t xml:space="preserve"> para seu </w:t>
+      </w:r>
+      <w:r>
+        <w:rPr>
+          <w:color w:val="000000" w:themeColor="text1"/>
+          <w:sz w:val="24"/>
+          <w:szCs w:val="24"/>
+        </w:rPr>
+        <w:t>bichinho de estimação</w:t>
+      </w:r>
+      <w:r>
+        <w:rPr>
+          <w:color w:val="000000" w:themeColor="text1"/>
+          <w:sz w:val="24"/>
+          <w:szCs w:val="24"/>
+        </w:rPr>
+        <w:t xml:space="preserve">. </w:t>
+      </w:r>
+      <w:r>
+        <w:rPr>
+          <w:color w:val="000000" w:themeColor="text1"/>
+          <w:sz w:val="24"/>
+          <w:szCs w:val="24"/>
+        </w:rPr>
+        <w:t>Oferecendo um</w:t>
+      </w:r>
+      <w:r>
+        <w:rPr>
+          <w:sz w:val="24"/>
+          <w:szCs w:val="24"/>
+        </w:rPr>
+        <w:t xml:space="preserve"> plantão e atendimento online 24 horas por dia por meio de chat com um médico veterinário</w:t>
+      </w:r>
+      <w:r>
+        <w:rPr>
+          <w:sz w:val="24"/>
+          <w:szCs w:val="24"/>
+        </w:rPr>
+        <w:t xml:space="preserve">. </w:t>
+      </w:r>
+    </w:p>
+    <w:p>
+      <w:pPr>
+        <w:widowControl w:val="0"/>
+        <w:pBdr>
+          <w:top w:val="nil"/>
+          <w:left w:val="nil"/>
+          <w:bottom w:val="nil"/>
+          <w:right w:val="nil"/>
+          <w:between w:val="nil"/>
+        </w:pBdr>
         <w:spacing w:line="360" w:lineRule="auto"/>
         <w:ind w:left="720" w:firstLine="283"/>
         <w:jc w:val="both"/>
-      </w:pPr>
-      <w:r>
-        <w:rPr>
-          <w:color w:val="000000" w:themeColor="text1" w:themeTint="FF" w:themeShade="FF"/>
-          <w:sz w:val="24"/>
-          <w:szCs w:val="24"/>
-        </w:rPr>
-        <w:t>O projeto consiste em</w:t>
-      </w:r>
-      <w:r>
-        <w:rPr>
-          <w:color w:val="000000" w:themeColor="text1" w:themeTint="FF" w:themeShade="FF"/>
-          <w:sz w:val="24"/>
-          <w:szCs w:val="24"/>
-        </w:rPr>
-        <w:t xml:space="preserve"> u</w:t>
-      </w:r>
-      <w:r>
-        <w:rPr>
-          <w:color w:val="000000" w:themeColor="text1" w:themeTint="FF" w:themeShade="FF"/>
-          <w:sz w:val="24"/>
-          <w:szCs w:val="24"/>
-        </w:rPr>
-        <w:t>ma página web</w:t>
-      </w:r>
-      <w:r>
-        <w:rPr>
-          <w:color w:val="000000" w:themeColor="text1" w:themeTint="FF" w:themeShade="FF"/>
-          <w:sz w:val="24"/>
-          <w:szCs w:val="24"/>
-        </w:rPr>
-        <w:t xml:space="preserve"> </w:t>
-      </w:r>
-      <w:r>
-        <w:rPr>
-          <w:color w:val="000000" w:themeColor="text1" w:themeTint="FF" w:themeShade="FF"/>
-          <w:sz w:val="24"/>
-          <w:szCs w:val="24"/>
-        </w:rPr>
-        <w:t>para cuidar</w:t>
-      </w:r>
-      <w:r>
-        <w:rPr>
-          <w:color w:val="000000" w:themeColor="text1" w:themeTint="FF" w:themeShade="FF"/>
-          <w:sz w:val="24"/>
-          <w:szCs w:val="24"/>
-        </w:rPr>
-        <w:t xml:space="preserve"> e </w:t>
-      </w:r>
-      <w:r>
-        <w:rPr>
-          <w:color w:val="000000" w:themeColor="text1" w:themeTint="FF" w:themeShade="FF"/>
-          <w:sz w:val="24"/>
-          <w:szCs w:val="24"/>
-        </w:rPr>
-        <w:t>envia</w:t>
-      </w:r>
-      <w:r>
-        <w:rPr>
-          <w:color w:val="000000" w:themeColor="text1" w:themeTint="FF" w:themeShade="FF"/>
-          <w:sz w:val="24"/>
-          <w:szCs w:val="24"/>
-        </w:rPr>
-        <w:t>r</w:t>
-      </w:r>
-      <w:r>
-        <w:rPr>
-          <w:color w:val="000000" w:themeColor="text1" w:themeTint="FF" w:themeShade="FF"/>
-          <w:sz w:val="24"/>
-          <w:szCs w:val="24"/>
-        </w:rPr>
-        <w:t xml:space="preserve"> produtos</w:t>
-      </w:r>
-      <w:r>
-        <w:rPr>
-          <w:color w:val="000000" w:themeColor="text1" w:themeTint="FF" w:themeShade="FF"/>
-          <w:sz w:val="24"/>
-          <w:szCs w:val="24"/>
-        </w:rPr>
-        <w:t xml:space="preserve"> para seu </w:t>
-      </w:r>
-      <w:r>
-        <w:rPr>
-          <w:color w:val="000000" w:themeColor="text1" w:themeTint="FF" w:themeShade="FF"/>
-          <w:sz w:val="24"/>
-          <w:szCs w:val="24"/>
-        </w:rPr>
-        <w:t>bichinho de estimação</w:t>
-      </w:r>
-      <w:r>
-        <w:rPr>
-          <w:color w:val="000000" w:themeColor="text1" w:themeTint="FF" w:themeShade="FF"/>
-          <w:sz w:val="24"/>
-          <w:szCs w:val="24"/>
-        </w:rPr>
-        <w:t xml:space="preserve">. </w:t>
-      </w:r>
-      <w:r>
-        <w:rPr>
-          <w:color w:val="000000" w:themeColor="text1" w:themeTint="FF" w:themeShade="FF"/>
-          <w:sz w:val="24"/>
-          <w:szCs w:val="24"/>
-        </w:rPr>
-        <w:t>Oferecendo um</w:t>
-      </w:r>
-      <w:r>
-        <w:rPr/>
-        <w:t xml:space="preserve"> </w:t>
-      </w:r>
-      <w:r>
-        <w:rPr/>
-        <w:t>plantão e atendimento online 24 horas por dia por meio de chat</w:t>
-      </w:r>
-      <w:r>
-        <w:rPr/>
-        <w:t xml:space="preserve"> </w:t>
-      </w:r>
-      <w:r>
-        <w:rPr/>
-        <w:t xml:space="preserve">com um </w:t>
-      </w:r>
-      <w:r>
-        <w:rPr/>
-        <w:t>médico</w:t>
-      </w:r>
-      <w:r>
-        <w:rPr/>
-        <w:t xml:space="preserve"> </w:t>
-      </w:r>
-      <w:r>
-        <w:rPr/>
-        <w:t>veterinário</w:t>
-      </w:r>
-      <w:r>
-        <w:rPr/>
-        <w:t xml:space="preserve">. </w:t>
-      </w:r>
-    </w:p>
-    <w:p>
-      <w:pPr>
-        <w:widowControl w:val="0"/>
-        <w:pBdr>
-          <w:top w:val="nil" w:color="FF000000" w:sz="0" w:space="0"/>
-          <w:left w:val="nil" w:color="FF000000" w:sz="0" w:space="0"/>
-          <w:bottom w:val="nil" w:color="FF000000" w:sz="0" w:space="0"/>
-          <w:right w:val="nil" w:color="FF000000" w:sz="0" w:space="0"/>
-          <w:between w:val="nil" w:color="FF000000" w:sz="0" w:space="0"/>
-        </w:pBdr>
-        <w:spacing w:line="360" w:lineRule="auto"/>
-        <w:ind w:left="720" w:firstLine="283"/>
-        <w:jc w:val="both"/>
-        <w:rPr>
-          <w:b w:val="1"/>
-          <w:bCs w:val="1"/>
+        <w:rPr>
+          <w:b/>
+          <w:bCs/>
           <w:color w:val="000000" w:themeColor="text1"/>
           <w:sz w:val="24"/>
           <w:szCs w:val="24"/>
@@ -2311,12 +2236,12 @@
       <w:tblPr>
         <w:tblW w:w="0" w:type="auto"/>
         <w:tblBorders>
-          <w:top w:val="single" w:color="000000" w:themeColor="text1" w:sz="8" w:space="0"/>
-          <w:left w:val="single" w:color="000000" w:themeColor="text1" w:sz="8" w:space="0"/>
-          <w:bottom w:val="single" w:color="000000" w:themeColor="text1" w:sz="8" w:space="0"/>
-          <w:right w:val="single" w:color="000000" w:themeColor="text1" w:sz="8" w:space="0"/>
-          <w:insideH w:val="single" w:color="000000" w:themeColor="text1" w:sz="8" w:space="0"/>
-          <w:insideV w:val="single" w:color="000000" w:themeColor="text1" w:sz="8" w:space="0"/>
+          <w:top w:val="single" w:sz="8" w:space="0" w:color="000000" w:themeColor="text1"/>
+          <w:left w:val="single" w:sz="8" w:space="0" w:color="000000" w:themeColor="text1"/>
+          <w:bottom w:val="single" w:sz="8" w:space="0" w:color="000000" w:themeColor="text1"/>
+          <w:right w:val="single" w:sz="8" w:space="0" w:color="000000" w:themeColor="text1"/>
+          <w:insideH w:val="single" w:sz="8" w:space="0" w:color="000000" w:themeColor="text1"/>
+          <w:insideV w:val="single" w:sz="8" w:space="0" w:color="000000" w:themeColor="text1"/>
         </w:tblBorders>
         <w:tblLook w:val="0600" w:firstRow="0" w:lastRow="0" w:firstColumn="0" w:lastColumn="0" w:noHBand="1" w:noVBand="1"/>
       </w:tblPr>
@@ -2548,11 +2473,11 @@
     </w:p>
     <w:p>
       <w:pPr>
-        <w:pStyle w:val="ListParagraph"/>
+        <w:pStyle w:val="PargrafodaLista"/>
         <w:widowControl w:val="0"/>
         <w:numPr>
           <w:ilvl w:val="0"/>
-          <w:numId w:val="3"/>
+          <w:numId w:val="4"/>
         </w:numPr>
         <w:pBdr>
           <w:top w:val="nil"/>
@@ -2581,9 +2506,9 @@
     <w:p>
       <w:pPr>
         <w:widowControl w:val="0"/>
-        <w:spacing w:before="0" w:beforeAutospacing="off" w:after="0" w:afterAutospacing="off" w:line="360" w:lineRule="auto"/>
+        <w:spacing w:line="360" w:lineRule="auto"/>
         <w:ind w:left="720" w:firstLine="283"/>
-        <w:contextualSpacing w:val="1"/>
+        <w:contextualSpacing/>
         <w:jc w:val="both"/>
       </w:pPr>
       <w:r>
@@ -2598,52 +2523,90 @@
           <w:sz w:val="24"/>
           <w:szCs w:val="24"/>
         </w:rPr>
-        <w:t xml:space="preserve">tem </w:t>
-      </w:r>
-      <w:r>
-        <w:rPr>
-          <w:sz w:val="24"/>
-          <w:szCs w:val="24"/>
-        </w:rPr>
-        <w:t xml:space="preserve">o intuito de </w:t>
-      </w:r>
-      <w:r>
-        <w:rPr>
-          <w:sz w:val="24"/>
-          <w:szCs w:val="24"/>
-        </w:rPr>
-        <w:t xml:space="preserve">oferecer um </w:t>
-      </w:r>
-      <w:r>
-        <w:rPr>
-          <w:sz w:val="24"/>
-          <w:szCs w:val="24"/>
-        </w:rPr>
-        <w:t xml:space="preserve">atendimento especializado e </w:t>
-      </w:r>
-      <w:r>
-        <w:rPr>
-          <w:sz w:val="24"/>
-          <w:szCs w:val="24"/>
-        </w:rPr>
-        <w:t xml:space="preserve">diferenciado </w:t>
-      </w:r>
-      <w:r>
-        <w:rPr>
-          <w:sz w:val="24"/>
-          <w:szCs w:val="24"/>
-        </w:rPr>
-        <w:t xml:space="preserve">para os clientes em </w:t>
-      </w:r>
-      <w:r>
-        <w:rPr>
-          <w:sz w:val="24"/>
-          <w:szCs w:val="24"/>
-        </w:rPr>
-        <w:t>horários</w:t>
-      </w:r>
-      <w:r>
-        <w:rPr>
+        <w:t xml:space="preserve">tem o intuito de oferecer um atendimento especializado e diferenciado para os clientes em horários noturnos, permitindo uma maior facilidade na aquisição de produtos e medicamentos </w:t>
+      </w:r>
+      <w:r>
+        <w:rPr>
+          <w:sz w:val="24"/>
+          <w:szCs w:val="24"/>
+        </w:rPr>
+        <w:t>para os animais</w:t>
+      </w:r>
+      <w:r>
+        <w:rPr>
+          <w:sz w:val="24"/>
+          <w:szCs w:val="24"/>
+        </w:rPr>
+        <w:t xml:space="preserve">. O diferencial da página web é poder atender os clientes 24 horas por dia e 7 dias na semana, permitindo uma maior experiência </w:t>
+      </w:r>
+      <w:r>
+        <w:rPr>
+          <w:sz w:val="24"/>
+          <w:szCs w:val="24"/>
+        </w:rPr>
+        <w:t>com diversos produtos disponíveis para atender as necessidades.</w:t>
+      </w:r>
+    </w:p>
+    <w:p>
+      <w:pPr>
+        <w:pStyle w:val="PargrafodaLista"/>
+        <w:widowControl w:val="0"/>
+        <w:numPr>
+          <w:ilvl w:val="0"/>
+          <w:numId w:val="2"/>
+        </w:numPr>
+        <w:pBdr>
+          <w:top w:val="nil"/>
+          <w:left w:val="nil"/>
+          <w:bottom w:val="nil"/>
+          <w:right w:val="nil"/>
+          <w:between w:val="nil"/>
+        </w:pBdr>
+        <w:rPr>
+          <w:b/>
+          <w:bCs/>
+          <w:color w:val="000000" w:themeColor="text1"/>
+          <w:sz w:val="24"/>
+          <w:szCs w:val="24"/>
+        </w:rPr>
+      </w:pPr>
+      <w:r>
+        <w:rPr>
+          <w:b/>
+          <w:bCs/>
+          <w:color w:val="000000" w:themeColor="text1"/>
+          <w:sz w:val="24"/>
+          <w:szCs w:val="24"/>
+        </w:rPr>
+        <w:t>Objetivos</w:t>
+      </w:r>
+    </w:p>
+    <w:p>
+      <w:pPr>
+        <w:pStyle w:val="PargrafodaLista"/>
+        <w:widowControl w:val="0"/>
+        <w:numPr>
+          <w:ilvl w:val="1"/>
+          <w:numId w:val="2"/>
+        </w:numPr>
+        <w:pBdr>
+          <w:top w:val="nil"/>
+          <w:left w:val="nil"/>
+          <w:bottom w:val="nil"/>
+          <w:right w:val="nil"/>
+          <w:between w:val="nil"/>
+        </w:pBdr>
+        <w:rPr>
+          <w:b/>
+          <w:color w:val="000000"/>
+          <w:sz w:val="24"/>
+          <w:szCs w:val="24"/>
+        </w:rPr>
+      </w:pPr>
+      <w:r>
+        <w:rPr>
+          <w:b/>
+          <w:color w:val="000000" w:themeColor="text1"/>
           <w:sz w:val="24"/>
           <w:szCs w:val="24"/>
         </w:rPr>
@@ -2651,641 +2614,303 @@
       </w:r>
       <w:r>
         <w:rPr>
-          <w:sz w:val="24"/>
-          <w:szCs w:val="24"/>
-        </w:rPr>
-        <w:t xml:space="preserve">noturnos, </w:t>
-      </w:r>
-      <w:r>
-        <w:rPr>
-          <w:sz w:val="24"/>
-          <w:szCs w:val="24"/>
-        </w:rPr>
-        <w:t xml:space="preserve">permitindo uma maior facilidade </w:t>
-      </w:r>
-      <w:r>
-        <w:rPr>
-          <w:sz w:val="24"/>
-          <w:szCs w:val="24"/>
-        </w:rPr>
-        <w:t xml:space="preserve">na aquisição de </w:t>
-      </w:r>
-      <w:r>
-        <w:rPr>
-          <w:sz w:val="24"/>
-          <w:szCs w:val="24"/>
-        </w:rPr>
-        <w:t xml:space="preserve">produtos e </w:t>
-      </w:r>
-      <w:r>
-        <w:rPr>
-          <w:sz w:val="24"/>
-          <w:szCs w:val="24"/>
-        </w:rPr>
-        <w:t xml:space="preserve">medicamentos </w:t>
-      </w:r>
-      <w:r>
-        <w:rPr>
-          <w:sz w:val="24"/>
-          <w:szCs w:val="24"/>
-        </w:rPr>
-        <w:t>para os animais</w:t>
-      </w:r>
-      <w:r>
-        <w:rPr>
-          <w:sz w:val="24"/>
-          <w:szCs w:val="24"/>
-        </w:rPr>
-        <w:t xml:space="preserve">. O diferencial </w:t>
-      </w:r>
-      <w:r>
-        <w:rPr>
-          <w:sz w:val="24"/>
-          <w:szCs w:val="24"/>
-        </w:rPr>
-        <w:t>da</w:t>
-      </w:r>
-      <w:r>
-        <w:rPr>
-          <w:sz w:val="24"/>
-          <w:szCs w:val="24"/>
-        </w:rPr>
-        <w:t xml:space="preserve"> página web é poder </w:t>
-      </w:r>
-      <w:r>
-        <w:rPr>
-          <w:sz w:val="24"/>
-          <w:szCs w:val="24"/>
-        </w:rPr>
-        <w:t xml:space="preserve">atender os </w:t>
-      </w:r>
-      <w:r>
-        <w:rPr>
-          <w:sz w:val="24"/>
-          <w:szCs w:val="24"/>
-        </w:rPr>
-        <w:t xml:space="preserve">clientes </w:t>
-      </w:r>
-      <w:r>
-        <w:rPr>
-          <w:sz w:val="24"/>
-          <w:szCs w:val="24"/>
-        </w:rPr>
-        <w:t>24 horas por dia</w:t>
-      </w:r>
-      <w:r>
-        <w:rPr>
-          <w:sz w:val="24"/>
-          <w:szCs w:val="24"/>
-        </w:rPr>
-        <w:t xml:space="preserve"> e</w:t>
-      </w:r>
-      <w:r>
-        <w:rPr>
-          <w:sz w:val="24"/>
-          <w:szCs w:val="24"/>
-        </w:rPr>
-        <w:t xml:space="preserve"> 7 dias na </w:t>
-      </w:r>
-      <w:r>
-        <w:rPr>
-          <w:sz w:val="24"/>
-          <w:szCs w:val="24"/>
-        </w:rPr>
-        <w:t xml:space="preserve">semana, </w:t>
-      </w:r>
-      <w:r>
-        <w:rPr>
-          <w:sz w:val="24"/>
-          <w:szCs w:val="24"/>
-        </w:rPr>
-        <w:t xml:space="preserve">permitindo uma maior </w:t>
-      </w:r>
-      <w:r>
-        <w:rPr>
-          <w:sz w:val="24"/>
-          <w:szCs w:val="24"/>
-        </w:rPr>
-        <w:t xml:space="preserve">experiência </w:t>
-      </w:r>
-      <w:r>
-        <w:rPr>
-          <w:sz w:val="24"/>
-          <w:szCs w:val="24"/>
-        </w:rPr>
-        <w:t xml:space="preserve">com </w:t>
-      </w:r>
-      <w:r>
-        <w:rPr>
-          <w:sz w:val="24"/>
-          <w:szCs w:val="24"/>
-        </w:rPr>
-        <w:t xml:space="preserve">diversos produtos </w:t>
-      </w:r>
-      <w:r>
-        <w:rPr>
-          <w:sz w:val="24"/>
-          <w:szCs w:val="24"/>
-        </w:rPr>
-        <w:t xml:space="preserve">disponíveis para atender as </w:t>
-      </w:r>
-      <w:r>
-        <w:rPr>
-          <w:sz w:val="24"/>
-          <w:szCs w:val="24"/>
-        </w:rPr>
-        <w:t>necessidades</w:t>
-      </w:r>
-      <w:r>
-        <w:rPr>
-          <w:sz w:val="24"/>
-          <w:szCs w:val="24"/>
-        </w:rPr>
-        <w:t>.</w:t>
-      </w:r>
-    </w:p>
-    <w:p>
-      <w:pPr>
-        <w:pStyle w:val="ListParagraph"/>
+          <w:b/>
+          <w:color w:val="000000" w:themeColor="text1"/>
+          <w:sz w:val="24"/>
+          <w:szCs w:val="24"/>
+        </w:rPr>
+        <w:t>Objetivos</w:t>
+      </w:r>
+      <w:r>
+        <w:rPr>
+          <w:b/>
+          <w:color w:val="000000" w:themeColor="text1"/>
+          <w:sz w:val="24"/>
+          <w:szCs w:val="24"/>
+        </w:rPr>
+        <w:t xml:space="preserve"> </w:t>
+      </w:r>
+      <w:r>
+        <w:rPr>
+          <w:b/>
+          <w:color w:val="000000" w:themeColor="text1"/>
+          <w:sz w:val="24"/>
+          <w:szCs w:val="24"/>
+        </w:rPr>
+        <w:t xml:space="preserve">Gerais </w:t>
+      </w:r>
+    </w:p>
+    <w:p>
+      <w:pPr>
+        <w:widowControl w:val="0"/>
+        <w:pBdr>
+          <w:top w:val="nil"/>
+          <w:left w:val="nil"/>
+          <w:bottom w:val="nil"/>
+          <w:right w:val="nil"/>
+          <w:between w:val="nil"/>
+        </w:pBdr>
+        <w:spacing w:line="360" w:lineRule="auto"/>
+        <w:ind w:left="720" w:firstLine="283"/>
+        <w:contextualSpacing/>
+        <w:jc w:val="both"/>
+        <w:rPr>
+          <w:color w:val="000000" w:themeColor="text1"/>
+          <w:sz w:val="24"/>
+          <w:szCs w:val="24"/>
+        </w:rPr>
+      </w:pPr>
+      <w:r>
+        <w:rPr>
+          <w:color w:val="000000" w:themeColor="text1"/>
+          <w:sz w:val="24"/>
+          <w:szCs w:val="24"/>
+        </w:rPr>
+        <w:t>O objetivo do</w:t>
+      </w:r>
+      <w:r>
+        <w:rPr>
+          <w:color w:val="000000" w:themeColor="text1"/>
+          <w:sz w:val="24"/>
+          <w:szCs w:val="24"/>
+        </w:rPr>
+        <w:t xml:space="preserve"> website </w:t>
+      </w:r>
+      <w:r>
+        <w:rPr>
+          <w:color w:val="000000" w:themeColor="text1"/>
+          <w:sz w:val="24"/>
+          <w:szCs w:val="24"/>
+        </w:rPr>
+        <w:t xml:space="preserve">é </w:t>
+      </w:r>
+      <w:r>
+        <w:rPr>
+          <w:color w:val="000000" w:themeColor="text1"/>
+          <w:sz w:val="24"/>
+          <w:szCs w:val="24"/>
+        </w:rPr>
+        <w:t>divulgar os</w:t>
+      </w:r>
+      <w:r>
+        <w:rPr>
+          <w:color w:val="000000" w:themeColor="text1"/>
+          <w:sz w:val="24"/>
+          <w:szCs w:val="24"/>
+        </w:rPr>
+        <w:t xml:space="preserve"> serviço</w:t>
+      </w:r>
+      <w:r>
+        <w:rPr>
+          <w:color w:val="000000" w:themeColor="text1"/>
+          <w:sz w:val="24"/>
+          <w:szCs w:val="24"/>
+        </w:rPr>
+        <w:t>s</w:t>
+      </w:r>
+      <w:r>
+        <w:rPr>
+          <w:color w:val="000000" w:themeColor="text1"/>
+          <w:sz w:val="24"/>
+          <w:szCs w:val="24"/>
+        </w:rPr>
+        <w:t>,</w:t>
+      </w:r>
+      <w:r>
+        <w:rPr>
+          <w:color w:val="000000" w:themeColor="text1"/>
+          <w:sz w:val="24"/>
+          <w:szCs w:val="24"/>
+        </w:rPr>
+        <w:t xml:space="preserve"> produtos </w:t>
+      </w:r>
+      <w:r>
+        <w:rPr>
+          <w:color w:val="000000" w:themeColor="text1"/>
+          <w:sz w:val="24"/>
+          <w:szCs w:val="24"/>
+        </w:rPr>
+        <w:t>e</w:t>
+      </w:r>
+      <w:r>
+        <w:rPr>
+          <w:color w:val="000000" w:themeColor="text1"/>
+          <w:sz w:val="24"/>
+          <w:szCs w:val="24"/>
+        </w:rPr>
+        <w:t xml:space="preserve"> atendimento</w:t>
+      </w:r>
+      <w:r>
+        <w:rPr>
+          <w:color w:val="000000" w:themeColor="text1"/>
+          <w:sz w:val="24"/>
+          <w:szCs w:val="24"/>
+        </w:rPr>
+        <w:t>s</w:t>
+      </w:r>
+      <w:r>
+        <w:rPr>
+          <w:color w:val="000000" w:themeColor="text1"/>
+          <w:sz w:val="24"/>
+          <w:szCs w:val="24"/>
+        </w:rPr>
+        <w:t xml:space="preserve"> d</w:t>
+      </w:r>
+      <w:r>
+        <w:rPr>
+          <w:color w:val="000000" w:themeColor="text1"/>
+          <w:sz w:val="24"/>
+          <w:szCs w:val="24"/>
+        </w:rPr>
+        <w:t>a empresa Patinhas Felizes</w:t>
+      </w:r>
+      <w:r>
+        <w:rPr>
+          <w:color w:val="000000" w:themeColor="text1"/>
+          <w:sz w:val="24"/>
+          <w:szCs w:val="24"/>
+        </w:rPr>
+        <w:t>, para que o</w:t>
+      </w:r>
+      <w:r>
+        <w:rPr>
+          <w:color w:val="000000" w:themeColor="text1"/>
+          <w:sz w:val="24"/>
+          <w:szCs w:val="24"/>
+        </w:rPr>
+        <w:t xml:space="preserve"> </w:t>
+      </w:r>
+      <w:r>
+        <w:rPr>
+          <w:color w:val="000000" w:themeColor="text1"/>
+          <w:sz w:val="24"/>
+          <w:szCs w:val="24"/>
+        </w:rPr>
+        <w:t xml:space="preserve">cliente </w:t>
+      </w:r>
+      <w:r>
+        <w:rPr>
+          <w:color w:val="000000" w:themeColor="text1"/>
+          <w:sz w:val="24"/>
+          <w:szCs w:val="24"/>
+        </w:rPr>
+        <w:t xml:space="preserve">consiga </w:t>
+      </w:r>
+      <w:r>
+        <w:rPr>
+          <w:color w:val="000000" w:themeColor="text1"/>
+          <w:sz w:val="24"/>
+          <w:szCs w:val="24"/>
+        </w:rPr>
+        <w:t>ter uma experiência positiva em poder navegar nas páginas com segurança, realizar a aquisição de produtos e serviços</w:t>
+      </w:r>
+      <w:r>
+        <w:rPr>
+          <w:color w:val="000000" w:themeColor="text1"/>
+          <w:sz w:val="24"/>
+          <w:szCs w:val="24"/>
+        </w:rPr>
+        <w:t xml:space="preserve"> e conhecer sobre a empresa.</w:t>
+      </w:r>
+    </w:p>
+    <w:p>
+      <w:pPr>
+        <w:widowControl w:val="0"/>
+        <w:pBdr>
+          <w:top w:val="nil"/>
+          <w:left w:val="nil"/>
+          <w:bottom w:val="nil"/>
+          <w:right w:val="nil"/>
+          <w:between w:val="nil"/>
+        </w:pBdr>
+        <w:rPr>
+          <w:b/>
+          <w:bCs/>
+          <w:color w:val="000000" w:themeColor="text1"/>
+          <w:sz w:val="24"/>
+          <w:szCs w:val="24"/>
+        </w:rPr>
+      </w:pPr>
+    </w:p>
+    <w:p>
+      <w:pPr>
+        <w:pStyle w:val="PargrafodaLista"/>
+        <w:widowControl w:val="0"/>
+        <w:numPr>
+          <w:ilvl w:val="1"/>
+          <w:numId w:val="2"/>
+        </w:numPr>
+        <w:pBdr>
+          <w:top w:val="nil"/>
+          <w:left w:val="nil"/>
+          <w:bottom w:val="nil"/>
+          <w:right w:val="nil"/>
+          <w:between w:val="nil"/>
+        </w:pBdr>
+        <w:rPr>
+          <w:b/>
+          <w:color w:val="000000"/>
+          <w:sz w:val="24"/>
+          <w:szCs w:val="24"/>
+        </w:rPr>
+      </w:pPr>
+      <w:r>
+        <w:rPr>
+          <w:b/>
+          <w:bCs/>
+          <w:color w:val="000000" w:themeColor="text1"/>
+          <w:sz w:val="24"/>
+          <w:szCs w:val="24"/>
+        </w:rPr>
+        <w:t>Objetivos E</w:t>
+      </w:r>
+      <w:r>
+        <w:rPr>
+          <w:b/>
+          <w:bCs/>
+          <w:color w:val="000000" w:themeColor="text1"/>
+          <w:sz w:val="24"/>
+          <w:szCs w:val="24"/>
+        </w:rPr>
+        <w:t>specíficos</w:t>
+      </w:r>
+    </w:p>
+    <w:p>
+      <w:pPr>
+        <w:pStyle w:val="PargrafodaLista"/>
         <w:widowControl w:val="0"/>
         <w:numPr>
           <w:ilvl w:val="0"/>
           <w:numId w:val="1"/>
         </w:numPr>
         <w:pBdr>
-          <w:top w:val="nil" w:color="FF000000" w:sz="0" w:space="0"/>
-          <w:left w:val="nil" w:color="FF000000" w:sz="0" w:space="0"/>
-          <w:bottom w:val="nil" w:color="FF000000" w:sz="0" w:space="0"/>
-          <w:right w:val="nil" w:color="FF000000" w:sz="0" w:space="0"/>
-          <w:between w:val="nil" w:color="FF000000" w:sz="0" w:space="0"/>
-        </w:pBdr>
-        <w:rPr>
-          <w:b w:val="1"/>
-          <w:bCs w:val="1"/>
-          <w:color w:val="000000" w:themeColor="text1" w:themeTint="FF" w:themeShade="FF"/>
-          <w:sz w:val="24"/>
-          <w:szCs w:val="24"/>
-        </w:rPr>
-      </w:pPr>
-      <w:r>
-        <w:rPr>
-          <w:b w:val="1"/>
-          <w:bCs w:val="1"/>
-          <w:color w:val="000000" w:themeColor="text1" w:themeTint="FF" w:themeShade="FF"/>
-          <w:sz w:val="24"/>
-          <w:szCs w:val="24"/>
-        </w:rPr>
-        <w:t>Objetivos</w:t>
-      </w:r>
-    </w:p>
-    <w:p>
-      <w:pPr>
-        <w:pStyle w:val="ListParagraph"/>
-        <w:widowControl w:val="0"/>
-        <w:numPr>
-          <w:ilvl w:val="1"/>
-          <w:numId w:val="1"/>
-        </w:numPr>
-        <w:pBdr>
-          <w:top w:val="nil"/>
-          <w:left w:val="nil"/>
-          <w:bottom w:val="nil"/>
-          <w:right w:val="nil"/>
-          <w:between w:val="nil"/>
-        </w:pBdr>
-        <w:rPr>
-          <w:b/>
-          <w:color w:val="000000"/>
-          <w:sz w:val="24"/>
-          <w:szCs w:val="24"/>
-        </w:rPr>
-      </w:pPr>
-      <w:r>
-        <w:rPr>
-          <w:b/>
-          <w:color w:val="000000" w:themeColor="text1"/>
-          <w:sz w:val="24"/>
-          <w:szCs w:val="24"/>
-        </w:rPr>
-        <w:t xml:space="preserve"> </w:t>
-      </w:r>
-      <w:r>
-        <w:rPr>
-          <w:b/>
-          <w:color w:val="000000" w:themeColor="text1"/>
-          <w:sz w:val="24"/>
-          <w:szCs w:val="24"/>
-        </w:rPr>
-        <w:t>Objetivos</w:t>
-      </w:r>
-      <w:r>
-        <w:rPr>
-          <w:b/>
-          <w:color w:val="000000" w:themeColor="text1"/>
-          <w:sz w:val="24"/>
-          <w:szCs w:val="24"/>
-        </w:rPr>
-        <w:t xml:space="preserve"> </w:t>
-      </w:r>
-      <w:r>
-        <w:rPr>
-          <w:b/>
-          <w:color w:val="000000" w:themeColor="text1"/>
-          <w:sz w:val="24"/>
-          <w:szCs w:val="24"/>
-        </w:rPr>
-        <w:t xml:space="preserve">Gerais </w:t>
-      </w:r>
-    </w:p>
-    <w:p>
-      <w:pPr>
-        <w:widowControl w:val="0"/>
-        <w:pBdr>
-          <w:top w:val="nil" w:color="FF000000" w:sz="0" w:space="0"/>
-          <w:left w:val="nil" w:color="FF000000" w:sz="0" w:space="0"/>
-          <w:bottom w:val="nil" w:color="FF000000" w:sz="0" w:space="0"/>
-          <w:right w:val="nil" w:color="FF000000" w:sz="0" w:space="0"/>
-          <w:between w:val="nil" w:color="FF000000" w:sz="0" w:space="0"/>
-        </w:pBdr>
-        <w:spacing w:line="360" w:lineRule="auto"/>
-        <w:ind w:left="720" w:firstLine="283"/>
-        <w:contextualSpacing w:val="1"/>
-        <w:jc w:val="both"/>
-        <w:rPr>
-          <w:color w:val="000000" w:themeColor="text1"/>
-          <w:sz w:val="24"/>
-          <w:szCs w:val="24"/>
-        </w:rPr>
-      </w:pPr>
-      <w:r>
-        <w:rPr>
-          <w:color w:val="000000" w:themeColor="text1" w:themeTint="FF" w:themeShade="FF"/>
-          <w:sz w:val="24"/>
-          <w:szCs w:val="24"/>
-        </w:rPr>
-        <w:t>O objetivo do</w:t>
-      </w:r>
-      <w:r>
-        <w:rPr>
-          <w:color w:val="000000" w:themeColor="text1" w:themeTint="FF" w:themeShade="FF"/>
-          <w:sz w:val="24"/>
-          <w:szCs w:val="24"/>
-        </w:rPr>
-        <w:t xml:space="preserve"> website </w:t>
-      </w:r>
-      <w:r>
-        <w:rPr>
-          <w:color w:val="000000" w:themeColor="text1" w:themeTint="FF" w:themeShade="FF"/>
-          <w:sz w:val="24"/>
-          <w:szCs w:val="24"/>
-        </w:rPr>
-        <w:t xml:space="preserve">é </w:t>
-      </w:r>
-      <w:r>
-        <w:rPr>
-          <w:color w:val="000000" w:themeColor="text1" w:themeTint="FF" w:themeShade="FF"/>
-          <w:sz w:val="24"/>
-          <w:szCs w:val="24"/>
-        </w:rPr>
-        <w:t>divulgar os</w:t>
-      </w:r>
-      <w:r>
-        <w:rPr>
-          <w:color w:val="000000" w:themeColor="text1" w:themeTint="FF" w:themeShade="FF"/>
-          <w:sz w:val="24"/>
-          <w:szCs w:val="24"/>
-        </w:rPr>
-        <w:t xml:space="preserve"> serviço</w:t>
-      </w:r>
-      <w:r>
-        <w:rPr>
-          <w:color w:val="000000" w:themeColor="text1" w:themeTint="FF" w:themeShade="FF"/>
-          <w:sz w:val="24"/>
-          <w:szCs w:val="24"/>
-        </w:rPr>
-        <w:t>s</w:t>
-      </w:r>
-      <w:r>
-        <w:rPr>
-          <w:color w:val="000000" w:themeColor="text1" w:themeTint="FF" w:themeShade="FF"/>
-          <w:sz w:val="24"/>
-          <w:szCs w:val="24"/>
-        </w:rPr>
-        <w:t>,</w:t>
-      </w:r>
-      <w:r>
-        <w:rPr>
-          <w:color w:val="000000" w:themeColor="text1" w:themeTint="FF" w:themeShade="FF"/>
-          <w:sz w:val="24"/>
-          <w:szCs w:val="24"/>
-        </w:rPr>
-        <w:t xml:space="preserve"> produtos </w:t>
-      </w:r>
-      <w:r>
-        <w:rPr>
-          <w:color w:val="000000" w:themeColor="text1" w:themeTint="FF" w:themeShade="FF"/>
-          <w:sz w:val="24"/>
-          <w:szCs w:val="24"/>
-        </w:rPr>
-        <w:t>e</w:t>
-      </w:r>
-      <w:r>
-        <w:rPr>
-          <w:color w:val="000000" w:themeColor="text1" w:themeTint="FF" w:themeShade="FF"/>
-          <w:sz w:val="24"/>
-          <w:szCs w:val="24"/>
-        </w:rPr>
-        <w:t xml:space="preserve"> atendimento</w:t>
-      </w:r>
-      <w:r>
-        <w:rPr>
-          <w:color w:val="000000" w:themeColor="text1" w:themeTint="FF" w:themeShade="FF"/>
-          <w:sz w:val="24"/>
-          <w:szCs w:val="24"/>
-        </w:rPr>
-        <w:t>s</w:t>
-      </w:r>
-      <w:r>
-        <w:rPr>
-          <w:color w:val="000000" w:themeColor="text1" w:themeTint="FF" w:themeShade="FF"/>
-          <w:sz w:val="24"/>
-          <w:szCs w:val="24"/>
-        </w:rPr>
-        <w:t xml:space="preserve"> d</w:t>
-      </w:r>
-      <w:r>
-        <w:rPr>
-          <w:color w:val="000000" w:themeColor="text1" w:themeTint="FF" w:themeShade="FF"/>
-          <w:sz w:val="24"/>
-          <w:szCs w:val="24"/>
-        </w:rPr>
-        <w:t>a empresa Patinhas Felizes</w:t>
-      </w:r>
-      <w:r>
-        <w:rPr>
-          <w:color w:val="000000" w:themeColor="text1" w:themeTint="FF" w:themeShade="FF"/>
-          <w:sz w:val="24"/>
-          <w:szCs w:val="24"/>
-        </w:rPr>
-        <w:t>, para que o</w:t>
-      </w:r>
-      <w:r>
-        <w:rPr>
-          <w:color w:val="000000" w:themeColor="text1" w:themeTint="FF" w:themeShade="FF"/>
-          <w:sz w:val="24"/>
-          <w:szCs w:val="24"/>
-        </w:rPr>
-        <w:t xml:space="preserve"> </w:t>
-      </w:r>
-      <w:r>
-        <w:rPr>
-          <w:color w:val="000000" w:themeColor="text1" w:themeTint="FF" w:themeShade="FF"/>
-          <w:sz w:val="24"/>
-          <w:szCs w:val="24"/>
-        </w:rPr>
-        <w:t xml:space="preserve">cliente </w:t>
-      </w:r>
-      <w:r>
-        <w:rPr>
-          <w:color w:val="000000" w:themeColor="text1" w:themeTint="FF" w:themeShade="FF"/>
-          <w:sz w:val="24"/>
-          <w:szCs w:val="24"/>
-        </w:rPr>
-        <w:t xml:space="preserve">consiga </w:t>
-      </w:r>
-      <w:r>
-        <w:rPr>
-          <w:color w:val="000000" w:themeColor="text1" w:themeTint="FF" w:themeShade="FF"/>
-          <w:sz w:val="24"/>
-          <w:szCs w:val="24"/>
-        </w:rPr>
-        <w:t>ter uma experiência positiva em poder navegar nas páginas com segurança, realizar a aquisição de produtos e serviços</w:t>
-      </w:r>
-      <w:r>
-        <w:rPr>
-          <w:color w:val="000000" w:themeColor="text1" w:themeTint="FF" w:themeShade="FF"/>
-          <w:sz w:val="24"/>
-          <w:szCs w:val="24"/>
-        </w:rPr>
-        <w:t xml:space="preserve"> e conhecer sobre a empresa.</w:t>
-      </w:r>
-    </w:p>
-    <w:p>
-      <w:pPr>
-        <w:widowControl w:val="0"/>
-        <w:pBdr>
-          <w:top w:val="nil"/>
-          <w:left w:val="nil"/>
-          <w:bottom w:val="nil"/>
-          <w:right w:val="nil"/>
-          <w:between w:val="nil"/>
-        </w:pBdr>
-        <w:rPr>
-          <w:b/>
-          <w:bCs/>
-          <w:color w:val="000000" w:themeColor="text1"/>
-          <w:sz w:val="24"/>
-          <w:szCs w:val="24"/>
-        </w:rPr>
-      </w:pPr>
-    </w:p>
-    <w:p>
-      <w:pPr>
-        <w:pStyle w:val="ListParagraph"/>
-        <w:widowControl w:val="0"/>
-        <w:numPr>
-          <w:ilvl w:val="1"/>
-          <w:numId w:val="1"/>
-        </w:numPr>
-        <w:pBdr>
-          <w:top w:val="nil"/>
-          <w:left w:val="nil"/>
-          <w:bottom w:val="nil"/>
-          <w:right w:val="nil"/>
-          <w:between w:val="nil"/>
-        </w:pBdr>
-        <w:rPr>
-          <w:b/>
-          <w:color w:val="000000"/>
-          <w:sz w:val="24"/>
-          <w:szCs w:val="24"/>
-        </w:rPr>
-      </w:pPr>
-      <w:r>
-        <w:rPr>
-          <w:b w:val="1"/>
-          <w:bCs w:val="1"/>
-          <w:color w:val="000000" w:themeColor="text1" w:themeTint="FF" w:themeShade="FF"/>
-          <w:sz w:val="24"/>
-          <w:szCs w:val="24"/>
-        </w:rPr>
-        <w:t>Objetivos E</w:t>
-      </w:r>
-      <w:r>
-        <w:rPr>
-          <w:b w:val="1"/>
-          <w:bCs w:val="1"/>
-          <w:color w:val="000000" w:themeColor="text1" w:themeTint="FF" w:themeShade="FF"/>
-          <w:sz w:val="24"/>
-          <w:szCs w:val="24"/>
-        </w:rPr>
-        <w:t>specíficos</w:t>
-      </w:r>
-    </w:p>
-    <w:p>
-      <w:pPr>
-        <w:pStyle w:val="ListParagraph"/>
-        <w:widowControl w:val="0"/>
-        <w:numPr>
-          <w:ilvl w:val="0"/>
-          <w:numId w:val="4"/>
-        </w:numPr>
-        <w:pBdr>
-          <w:top w:val="nil" w:color="000000" w:sz="0" w:space="0"/>
-          <w:left w:val="nil" w:color="000000" w:sz="0" w:space="0"/>
-          <w:bottom w:val="nil" w:color="000000" w:sz="0" w:space="0"/>
-          <w:right w:val="nil" w:color="000000" w:sz="0" w:space="0"/>
-          <w:between w:val="nil" w:color="000000" w:sz="0" w:space="0"/>
+          <w:top w:val="nil"/>
+          <w:left w:val="nil"/>
+          <w:bottom w:val="nil"/>
+          <w:right w:val="nil"/>
+          <w:between w:val="nil"/>
         </w:pBdr>
         <w:spacing w:line="360" w:lineRule="auto"/>
         <w:ind w:left="720" w:firstLine="283"/>
         <w:jc w:val="both"/>
         <w:rPr>
-          <w:color w:val="000000" w:themeColor="text1" w:themeTint="FF" w:themeShade="FF"/>
-          <w:sz w:val="24"/>
-          <w:szCs w:val="24"/>
-        </w:rPr>
-      </w:pPr>
-      <w:r>
-        <w:rPr>
-          <w:color w:val="000000" w:themeColor="text1" w:themeTint="FF" w:themeShade="FF"/>
-          <w:sz w:val="24"/>
-          <w:szCs w:val="24"/>
-        </w:rPr>
-        <w:t xml:space="preserve">Venda online de produtos para pets, </w:t>
-      </w:r>
-      <w:r>
-        <w:rPr>
-          <w:color w:val="000000" w:themeColor="text1" w:themeTint="FF" w:themeShade="FF"/>
-          <w:sz w:val="24"/>
-          <w:szCs w:val="24"/>
-        </w:rPr>
-        <w:t>a fim</w:t>
-      </w:r>
-      <w:r>
-        <w:rPr>
-          <w:color w:val="000000" w:themeColor="text1" w:themeTint="FF" w:themeShade="FF"/>
-          <w:sz w:val="24"/>
-          <w:szCs w:val="24"/>
-        </w:rPr>
-        <w:t xml:space="preserve"> de facilitar a compra desses produtos;</w:t>
-      </w:r>
-    </w:p>
-    <w:p>
-      <w:pPr>
-        <w:pStyle w:val="ListParagraph"/>
-        <w:widowControl w:val="0"/>
-        <w:numPr>
-          <w:ilvl w:val="0"/>
-          <w:numId w:val="4"/>
-        </w:numPr>
-        <w:pBdr>
-          <w:top w:val="nil" w:color="000000" w:sz="0" w:space="0"/>
-          <w:left w:val="nil" w:color="000000" w:sz="0" w:space="0"/>
-          <w:bottom w:val="nil" w:color="000000" w:sz="0" w:space="0"/>
-          <w:right w:val="nil" w:color="000000" w:sz="0" w:space="0"/>
-          <w:between w:val="nil" w:color="000000" w:sz="0" w:space="0"/>
-        </w:pBdr>
-        <w:spacing w:line="360" w:lineRule="auto"/>
-        <w:ind w:left="720" w:firstLine="283"/>
-        <w:jc w:val="both"/>
-        <w:rPr>
-          <w:color w:val="000000" w:themeColor="text1" w:themeTint="FF" w:themeShade="FF"/>
-          <w:sz w:val="24"/>
-          <w:szCs w:val="24"/>
-        </w:rPr>
-      </w:pPr>
-      <w:r>
-        <w:rPr>
-          <w:color w:val="000000" w:themeColor="text1" w:themeTint="FF" w:themeShade="FF"/>
-          <w:sz w:val="24"/>
-          <w:szCs w:val="24"/>
-        </w:rPr>
-        <w:t xml:space="preserve">Apartir do nosso </w:t>
-      </w:r>
-      <w:r>
-        <w:rPr>
-          <w:color w:val="000000" w:themeColor="text1" w:themeTint="FF" w:themeShade="FF"/>
-          <w:sz w:val="24"/>
-          <w:szCs w:val="24"/>
-        </w:rPr>
-        <w:t>chatbot</w:t>
-      </w:r>
-      <w:r>
-        <w:rPr>
-          <w:color w:val="000000" w:themeColor="text1" w:themeTint="FF" w:themeShade="FF"/>
-          <w:sz w:val="24"/>
-          <w:szCs w:val="24"/>
-        </w:rPr>
-        <w:t xml:space="preserve"> será possível tirar dúvidas sobre a saúde e o bem-estar do seu animalzinho;</w:t>
-      </w:r>
-    </w:p>
-    <w:p>
-      <w:pPr>
-        <w:pStyle w:val="ListParagraph"/>
-        <w:widowControl w:val="0"/>
-        <w:numPr>
-          <w:ilvl w:val="0"/>
-          <w:numId w:val="4"/>
-        </w:numPr>
-        <w:pBdr>
-          <w:top w:val="nil" w:color="000000" w:sz="0" w:space="0"/>
-          <w:left w:val="nil" w:color="000000" w:sz="0" w:space="0"/>
-          <w:bottom w:val="nil" w:color="000000" w:sz="0" w:space="0"/>
-          <w:right w:val="nil" w:color="000000" w:sz="0" w:space="0"/>
-          <w:between w:val="nil" w:color="000000" w:sz="0" w:space="0"/>
-        </w:pBdr>
-        <w:spacing w:line="360" w:lineRule="auto"/>
-        <w:ind w:left="720" w:firstLine="283"/>
-        <w:jc w:val="both"/>
-        <w:rPr>
-          <w:color w:val="000000" w:themeColor="text1" w:themeTint="FF" w:themeShade="FF"/>
-          <w:sz w:val="24"/>
-          <w:szCs w:val="24"/>
-        </w:rPr>
-      </w:pPr>
-      <w:r>
-        <w:rPr>
-          <w:color w:val="000000" w:themeColor="text1" w:themeTint="FF" w:themeShade="FF"/>
-          <w:sz w:val="24"/>
-          <w:szCs w:val="24"/>
-        </w:rPr>
-        <w:t>Criação de uma página no nosso site com contatos de veterinários confiáveis para melhor suporte e ajuda.</w:t>
-      </w:r>
-    </w:p>
-    <w:p>
-      <w:pPr>
-        <w:pStyle w:val="ListParagraph"/>
-        <w:widowControl w:val="0"/>
-        <w:pBdr>
-          <w:top w:val="nil"/>
-          <w:left w:val="nil"/>
-          <w:bottom w:val="nil"/>
-          <w:right w:val="nil"/>
-          <w:between w:val="nil"/>
-        </w:pBdr>
-        <w:rPr>
-          <w:b/>
-          <w:bCs/>
-          <w:color w:val="000000" w:themeColor="text1"/>
-          <w:sz w:val="24"/>
-          <w:szCs w:val="24"/>
-        </w:rPr>
-      </w:pPr>
-    </w:p>
-    <w:p>
-      <w:pPr>
-        <w:pStyle w:val="ListParagraph"/>
+          <w:color w:val="000000" w:themeColor="text1"/>
+          <w:sz w:val="24"/>
+          <w:szCs w:val="24"/>
+        </w:rPr>
+      </w:pPr>
+      <w:r>
+        <w:rPr>
+          <w:color w:val="000000" w:themeColor="text1"/>
+          <w:sz w:val="24"/>
+          <w:szCs w:val="24"/>
+        </w:rPr>
+        <w:t>Venda online de produtos para pets, a fim de facilitar a compra desses produtos;</w:t>
+      </w:r>
+    </w:p>
+    <w:p>
+      <w:pPr>
+        <w:pStyle w:val="PargrafodaLista"/>
         <w:widowControl w:val="0"/>
         <w:numPr>
           <w:ilvl w:val="0"/>
@@ -3298,6 +2923,92 @@
           <w:right w:val="nil"/>
           <w:between w:val="nil"/>
         </w:pBdr>
+        <w:spacing w:line="360" w:lineRule="auto"/>
+        <w:ind w:left="720" w:firstLine="283"/>
+        <w:jc w:val="both"/>
+        <w:rPr>
+          <w:color w:val="000000" w:themeColor="text1"/>
+          <w:sz w:val="24"/>
+          <w:szCs w:val="24"/>
+        </w:rPr>
+      </w:pPr>
+      <w:r>
+        <w:rPr>
+          <w:color w:val="000000" w:themeColor="text1"/>
+          <w:sz w:val="24"/>
+          <w:szCs w:val="24"/>
+        </w:rPr>
+        <w:t>Apartir do nosso chatbot será possível tirar dúvidas sobre a saúde e o bem-estar do seu animalzinho;</w:t>
+      </w:r>
+    </w:p>
+    <w:p>
+      <w:pPr>
+        <w:pStyle w:val="PargrafodaLista"/>
+        <w:widowControl w:val="0"/>
+        <w:numPr>
+          <w:ilvl w:val="0"/>
+          <w:numId w:val="1"/>
+        </w:numPr>
+        <w:pBdr>
+          <w:top w:val="nil"/>
+          <w:left w:val="nil"/>
+          <w:bottom w:val="nil"/>
+          <w:right w:val="nil"/>
+          <w:between w:val="nil"/>
+        </w:pBdr>
+        <w:spacing w:line="360" w:lineRule="auto"/>
+        <w:ind w:left="720" w:firstLine="283"/>
+        <w:jc w:val="both"/>
+        <w:rPr>
+          <w:color w:val="000000" w:themeColor="text1"/>
+          <w:sz w:val="24"/>
+          <w:szCs w:val="24"/>
+        </w:rPr>
+      </w:pPr>
+      <w:r>
+        <w:rPr>
+          <w:color w:val="000000" w:themeColor="text1"/>
+          <w:sz w:val="24"/>
+          <w:szCs w:val="24"/>
+        </w:rPr>
+        <w:t>Criação de uma página no nosso site com contatos de veterinários confiáveis para melhor suporte e ajuda.</w:t>
+      </w:r>
+    </w:p>
+    <w:p>
+      <w:pPr>
+        <w:pStyle w:val="PargrafodaLista"/>
+        <w:widowControl w:val="0"/>
+        <w:pBdr>
+          <w:top w:val="nil"/>
+          <w:left w:val="nil"/>
+          <w:bottom w:val="nil"/>
+          <w:right w:val="nil"/>
+          <w:between w:val="nil"/>
+        </w:pBdr>
+        <w:rPr>
+          <w:b/>
+          <w:bCs/>
+          <w:color w:val="000000" w:themeColor="text1"/>
+          <w:sz w:val="24"/>
+          <w:szCs w:val="24"/>
+        </w:rPr>
+      </w:pPr>
+    </w:p>
+    <w:p>
+      <w:pPr>
+        <w:pStyle w:val="PargrafodaLista"/>
+        <w:widowControl w:val="0"/>
+        <w:numPr>
+          <w:ilvl w:val="0"/>
+          <w:numId w:val="2"/>
+        </w:numPr>
+        <w:pBdr>
+          <w:top w:val="nil"/>
+          <w:left w:val="nil"/>
+          <w:bottom w:val="nil"/>
+          <w:right w:val="nil"/>
+          <w:between w:val="nil"/>
+        </w:pBdr>
         <w:rPr>
           <w:b/>
           <w:color w:val="000000"/>
@@ -3317,21 +3028,20 @@
     </w:p>
     <w:p>
       <w:pPr>
-        <w:pStyle w:val="Normal"/>
-        <w:widowControl w:val="0"/>
-        <w:pBdr>
-          <w:top w:val="nil" w:color="FF000000" w:sz="0" w:space="0"/>
-          <w:left w:val="nil" w:color="FF000000" w:sz="0" w:space="0"/>
-          <w:bottom w:val="nil" w:color="FF000000" w:sz="0" w:space="0"/>
-          <w:right w:val="nil" w:color="FF000000" w:sz="0" w:space="0"/>
-          <w:between w:val="nil" w:color="FF000000" w:sz="0" w:space="0"/>
+        <w:widowControl w:val="0"/>
+        <w:pBdr>
+          <w:top w:val="nil"/>
+          <w:left w:val="nil"/>
+          <w:bottom w:val="nil"/>
+          <w:right w:val="nil"/>
+          <w:between w:val="nil"/>
         </w:pBdr>
         <w:ind w:left="360"/>
       </w:pPr>
       <w:r>
         <w:rPr>
-          <w:b w:val="1"/>
-          <w:bCs w:val="1"/>
+          <w:b/>
+          <w:bCs/>
           <w:color w:val="000000" w:themeColor="text1"/>
           <w:sz w:val="24"/>
           <w:szCs w:val="24"/>
@@ -3340,9 +3050,9 @@
       </w:r>
       <w:r>
         <w:rPr>
-          <w:b w:val="1"/>
-          <w:bCs w:val="1"/>
-          <w:color w:val="000000" w:themeColor="text1" w:themeTint="FF" w:themeShade="FF"/>
+          <w:b/>
+          <w:bCs/>
+          <w:color w:val="000000" w:themeColor="text1"/>
           <w:sz w:val="24"/>
           <w:szCs w:val="24"/>
         </w:rPr>
@@ -3350,9 +3060,9 @@
       </w:r>
       <w:r>
         <w:rPr>
-          <w:b w:val="1"/>
-          <w:bCs w:val="1"/>
-          <w:color w:val="000000" w:themeColor="text1" w:themeTint="FF" w:themeShade="FF"/>
+          <w:b/>
+          <w:bCs/>
+          <w:color w:val="000000" w:themeColor="text1"/>
           <w:sz w:val="24"/>
           <w:szCs w:val="24"/>
         </w:rPr>
@@ -3361,40 +3071,42 @@
     </w:p>
     <w:p>
       <w:pPr>
-        <w:pStyle w:val="Normal"/>
-        <w:widowControl w:val="0"/>
-        <w:pBdr>
-          <w:top w:val="nil" w:color="000000" w:sz="0" w:space="0"/>
-          <w:left w:val="nil" w:color="000000" w:sz="0" w:space="0"/>
-          <w:bottom w:val="nil" w:color="000000" w:sz="0" w:space="0"/>
-          <w:right w:val="nil" w:color="000000" w:sz="0" w:space="0"/>
-          <w:between w:val="nil" w:color="000000" w:sz="0" w:space="0"/>
+        <w:widowControl w:val="0"/>
+        <w:pBdr>
+          <w:top w:val="nil"/>
+          <w:left w:val="nil"/>
+          <w:bottom w:val="nil"/>
+          <w:right w:val="nil"/>
+          <w:between w:val="nil"/>
         </w:pBdr>
         <w:ind w:left="360"/>
         <w:rPr>
-          <w:color w:val="000000" w:themeColor="text1" w:themeTint="FF" w:themeShade="FF"/>
+          <w:color w:val="000000" w:themeColor="text1"/>
           <w:sz w:val="16"/>
           <w:szCs w:val="16"/>
         </w:rPr>
       </w:pPr>
       <w:r>
+        <w:rPr>
+          <w:noProof/>
+        </w:rPr>
         <w:drawing>
-          <wp:inline wp14:editId="3A60D156" wp14:anchorId="6A533AA4">
+          <wp:inline distT="0" distB="0" distL="0" distR="0" wp14:anchorId="6A533AA4" wp14:editId="3A60D156">
             <wp:extent cx="6029325" cy="922707"/>
             <wp:effectExtent l="0" t="0" r="0" b="0"/>
             <wp:docPr id="1108366562" name="Imagem 10"/>
             <wp:cNvGraphicFramePr>
-              <a:graphicFrameLocks noChangeAspect="1"/>
+              <a:graphicFrameLocks xmlns:a="http://schemas.openxmlformats.org/drawingml/2006/main" noChangeAspect="1"/>
             </wp:cNvGraphicFramePr>
-            <a:graphic>
-              <a:graphicData xmlns:a="http://schemas.openxmlformats.org/drawingml/2006/main" uri="http://schemas.openxmlformats.org/drawingml/2006/picture">
+            <a:graphic xmlns:a="http://schemas.openxmlformats.org/drawingml/2006/main">
+              <a:graphicData uri="http://schemas.openxmlformats.org/drawingml/2006/picture">
                 <pic:pic xmlns:pic="http://schemas.openxmlformats.org/drawingml/2006/picture">
                   <pic:nvPicPr>
                     <pic:cNvPr id="1195897491" name="Imagem 1195897491"/>
                     <pic:cNvPicPr/>
                   </pic:nvPicPr>
                   <pic:blipFill>
-                    <a:blip xmlns:r="http://schemas.openxmlformats.org/officeDocument/2006/relationships" r:embed="rId9" cstate="print">
+                    <a:blip r:embed="rId9" cstate="print">
                       <a:extLst>
                         <a:ext uri="{28A0092B-C50C-407E-A947-70E740481C1C}">
                           <a14:useLocalDpi xmlns:a14="http://schemas.microsoft.com/office/drawing/2010/main"/>
@@ -3406,7 +3118,7 @@
                     </a:stretch>
                   </pic:blipFill>
                   <pic:spPr>
-                    <a:xfrm rot="0">
+                    <a:xfrm>
                       <a:off x="0" y="0"/>
                       <a:ext cx="6029325" cy="922707"/>
                     </a:xfrm>
@@ -3422,7 +3134,7 @@
       </w:r>
       <w:r>
         <w:rPr>
-          <w:color w:val="000000" w:themeColor="text1" w:themeTint="FF" w:themeShade="FF"/>
+          <w:color w:val="000000" w:themeColor="text1"/>
           <w:sz w:val="16"/>
           <w:szCs w:val="16"/>
         </w:rPr>
@@ -3431,17 +3143,16 @@
     </w:p>
     <w:p>
       <w:pPr>
-        <w:pStyle w:val="Normal"/>
-        <w:widowControl w:val="0"/>
-        <w:pBdr>
-          <w:top w:val="nil" w:color="FF000000" w:sz="0" w:space="0"/>
-          <w:left w:val="nil" w:color="FF000000" w:sz="0" w:space="0"/>
-          <w:bottom w:val="nil" w:color="FF000000" w:sz="0" w:space="0"/>
-          <w:right w:val="nil" w:color="FF000000" w:sz="0" w:space="0"/>
-          <w:between w:val="nil" w:color="FF000000" w:sz="0" w:space="0"/>
-        </w:pBdr>
-        <w:rPr>
-          <w:color w:val="000000" w:themeColor="text1" w:themeTint="FF" w:themeShade="FF"/>
+        <w:widowControl w:val="0"/>
+        <w:pBdr>
+          <w:top w:val="nil"/>
+          <w:left w:val="nil"/>
+          <w:bottom w:val="nil"/>
+          <w:right w:val="nil"/>
+          <w:between w:val="nil"/>
+        </w:pBdr>
+        <w:rPr>
+          <w:color w:val="000000" w:themeColor="text1"/>
           <w:sz w:val="18"/>
           <w:szCs w:val="18"/>
         </w:rPr>
@@ -3451,12 +3162,12 @@
       <w:tblPr>
         <w:tblW w:w="0" w:type="auto"/>
         <w:tblBorders>
-          <w:top w:val="single" w:color="000000" w:themeColor="text1" w:sz="8"/>
-          <w:left w:val="single" w:color="000000" w:themeColor="text1" w:sz="8"/>
-          <w:bottom w:val="single" w:color="000000" w:themeColor="text1" w:sz="8"/>
-          <w:right w:val="single" w:color="000000" w:themeColor="text1" w:sz="8"/>
-          <w:insideH w:val="single" w:color="000000" w:themeColor="text1" w:sz="8"/>
-          <w:insideV w:val="single" w:color="000000" w:themeColor="text1" w:sz="8"/>
+          <w:top w:val="single" w:sz="8" w:space="0" w:color="000000" w:themeColor="text1"/>
+          <w:left w:val="single" w:sz="8" w:space="0" w:color="000000" w:themeColor="text1"/>
+          <w:bottom w:val="single" w:sz="8" w:space="0" w:color="000000" w:themeColor="text1"/>
+          <w:right w:val="single" w:sz="8" w:space="0" w:color="000000" w:themeColor="text1"/>
+          <w:insideH w:val="single" w:sz="8" w:space="0" w:color="000000" w:themeColor="text1"/>
+          <w:insideV w:val="single" w:sz="8" w:space="0" w:color="000000" w:themeColor="text1"/>
         </w:tblBorders>
         <w:tblLook w:val="0600" w:firstRow="0" w:lastRow="0" w:firstColumn="0" w:lastColumn="0" w:noHBand="1" w:noVBand="1"/>
       </w:tblPr>
@@ -3482,30 +3193,31 @@
             <w:pPr>
               <w:widowControl w:val="0"/>
               <w:pBdr>
-                <w:top w:val="nil" w:color="FF000000" w:sz="0" w:space="0"/>
-                <w:left w:val="nil" w:color="FF000000" w:sz="0" w:space="0"/>
-                <w:bottom w:val="nil" w:color="FF000000" w:sz="0" w:space="0"/>
-                <w:right w:val="nil" w:color="FF000000" w:sz="0" w:space="0"/>
-                <w:between w:val="nil" w:color="FF000000" w:sz="0" w:space="0"/>
+                <w:top w:val="nil"/>
+                <w:left w:val="nil"/>
+                <w:bottom w:val="nil"/>
+                <w:right w:val="nil"/>
+                <w:between w:val="nil"/>
               </w:pBdr>
               <w:spacing w:line="240" w:lineRule="auto"/>
               <w:jc w:val="center"/>
               <w:rPr>
-                <w:b w:val="1"/>
-                <w:bCs w:val="1"/>
-                <w:color w:val="000000" w:themeColor="text1" w:themeTint="FF" w:themeShade="FF"/>
+                <w:b/>
+                <w:bCs/>
+                <w:color w:val="000000" w:themeColor="text1"/>
                 <w:sz w:val="24"/>
                 <w:szCs w:val="24"/>
               </w:rPr>
             </w:pPr>
             <w:r>
               <w:rPr>
-                <w:b w:val="1"/>
-                <w:bCs w:val="1"/>
-                <w:color w:val="000000" w:themeColor="text1" w:themeTint="FF" w:themeShade="FF"/>
-                <w:sz w:val="24"/>
-                <w:szCs w:val="24"/>
-              </w:rPr>
+                <w:b/>
+                <w:bCs/>
+                <w:color w:val="000000" w:themeColor="text1"/>
+                <w:sz w:val="24"/>
+                <w:szCs w:val="24"/>
+              </w:rPr>
+              <w:lastRenderedPageBreak/>
               <w:t>Declaração do escopo do Projeto</w:t>
             </w:r>
           </w:p>
@@ -3525,52 +3237,55 @@
             <w:pPr>
               <w:widowControl w:val="0"/>
               <w:pBdr>
-                <w:top w:val="nil" w:color="FF000000" w:sz="0" w:space="0"/>
-                <w:left w:val="nil" w:color="FF000000" w:sz="0" w:space="0"/>
-                <w:bottom w:val="nil" w:color="FF000000" w:sz="0" w:space="0"/>
-                <w:right w:val="nil" w:color="FF000000" w:sz="0" w:space="0"/>
-                <w:between w:val="nil" w:color="FF000000" w:sz="0" w:space="0"/>
+                <w:top w:val="nil"/>
+                <w:left w:val="nil"/>
+                <w:bottom w:val="nil"/>
+                <w:right w:val="nil"/>
+                <w:between w:val="nil"/>
               </w:pBdr>
               <w:spacing w:line="240" w:lineRule="auto"/>
               <w:jc w:val="center"/>
               <w:rPr>
-                <w:b w:val="1"/>
-                <w:bCs w:val="1"/>
-                <w:color w:val="000000" w:themeColor="text1" w:themeTint="FF" w:themeShade="FF"/>
+                <w:b/>
+                <w:bCs/>
+                <w:color w:val="000000" w:themeColor="text1"/>
                 <w:sz w:val="24"/>
                 <w:szCs w:val="24"/>
               </w:rPr>
             </w:pPr>
             <w:r>
+              <w:rPr>
+                <w:noProof/>
+              </w:rPr>
               <w:drawing>
-                <wp:inline wp14:editId="69C946D4" wp14:anchorId="5BDFA8B8">
+                <wp:inline distT="0" distB="0" distL="0" distR="0" wp14:anchorId="5BDFA8B8" wp14:editId="69C946D4">
                   <wp:extent cx="1257300" cy="935355"/>
                   <wp:effectExtent l="0" t="0" r="0" b="0"/>
                   <wp:docPr id="38071148" name="image5.png"/>
                   <wp:cNvGraphicFramePr/>
-                  <a:graphic>
-                    <a:graphicData xmlns:a="http://schemas.openxmlformats.org/drawingml/2006/main" uri="http://schemas.openxmlformats.org/drawingml/2006/picture">
+                  <a:graphic xmlns:a="http://schemas.openxmlformats.org/drawingml/2006/main">
+                    <a:graphicData uri="http://schemas.openxmlformats.org/drawingml/2006/picture">
                       <pic:pic xmlns:pic="http://schemas.openxmlformats.org/drawingml/2006/picture">
-                        <pic:nvPicPr xmlns:pic="http://schemas.openxmlformats.org/drawingml/2006/picture">
-                          <pic:cNvPr xmlns:pic="http://schemas.openxmlformats.org/drawingml/2006/picture" id="0" name="image5.png"/>
-                          <pic:cNvPicPr xmlns:pic="http://schemas.openxmlformats.org/drawingml/2006/picture" preferRelativeResize="0"/>
+                        <pic:nvPicPr>
+                          <pic:cNvPr id="0" name="image5.png"/>
+                          <pic:cNvPicPr preferRelativeResize="0"/>
                         </pic:nvPicPr>
-                        <pic:blipFill xmlns:pic="http://schemas.openxmlformats.org/drawingml/2006/picture">
-                          <a:blip xmlns:r="http://schemas.openxmlformats.org/officeDocument/2006/relationships" xmlns:a="http://schemas.openxmlformats.org/drawingml/2006/main" r:embed="rId8"/>
-                          <a:srcRect xmlns:a="http://schemas.openxmlformats.org/drawingml/2006/main"/>
-                          <a:stretch xmlns:a="http://schemas.openxmlformats.org/drawingml/2006/main">
-                            <a:fillRect xmlns:a="http://schemas.openxmlformats.org/drawingml/2006/main"/>
+                        <pic:blipFill>
+                          <a:blip r:embed="rId8"/>
+                          <a:srcRect/>
+                          <a:stretch>
+                            <a:fillRect/>
                           </a:stretch>
                         </pic:blipFill>
-                        <pic:spPr xmlns:pic="http://schemas.openxmlformats.org/drawingml/2006/picture">
-                          <a:xfrm xmlns:a="http://schemas.openxmlformats.org/drawingml/2006/main">
-                            <a:off xmlns:a="http://schemas.openxmlformats.org/drawingml/2006/main" x="0" y="0"/>
-                            <a:ext xmlns:a="http://schemas.openxmlformats.org/drawingml/2006/main" cx="1257300" cy="935355"/>
+                        <pic:spPr>
+                          <a:xfrm>
+                            <a:off x="0" y="0"/>
+                            <a:ext cx="1257300" cy="935355"/>
                           </a:xfrm>
-                          <a:prstGeom xmlns:a="http://schemas.openxmlformats.org/drawingml/2006/main" prst="rect">
-                            <a:avLst xmlns:a="http://schemas.openxmlformats.org/drawingml/2006/main"/>
+                          <a:prstGeom prst="rect">
+                            <a:avLst/>
                           </a:prstGeom>
-                          <a:ln xmlns:a="http://schemas.openxmlformats.org/drawingml/2006/main"/>
+                          <a:ln/>
                         </pic:spPr>
                       </pic:pic>
                     </a:graphicData>
@@ -3599,27 +3314,27 @@
             <w:pPr>
               <w:widowControl w:val="0"/>
               <w:pBdr>
-                <w:top w:val="nil" w:color="FF000000" w:sz="0" w:space="0"/>
-                <w:left w:val="nil" w:color="FF000000" w:sz="0" w:space="0"/>
-                <w:bottom w:val="nil" w:color="FF000000" w:sz="0" w:space="0"/>
-                <w:right w:val="nil" w:color="FF000000" w:sz="0" w:space="0"/>
-                <w:between w:val="nil" w:color="FF000000" w:sz="0" w:space="0"/>
+                <w:top w:val="nil"/>
+                <w:left w:val="nil"/>
+                <w:bottom w:val="nil"/>
+                <w:right w:val="nil"/>
+                <w:between w:val="nil"/>
               </w:pBdr>
               <w:spacing w:line="240" w:lineRule="auto"/>
               <w:jc w:val="center"/>
               <w:rPr>
-                <w:b w:val="1"/>
-                <w:bCs w:val="1"/>
-                <w:color w:val="000000" w:themeColor="text1" w:themeTint="FF" w:themeShade="FF"/>
+                <w:b/>
+                <w:bCs/>
+                <w:color w:val="000000" w:themeColor="text1"/>
                 <w:sz w:val="24"/>
                 <w:szCs w:val="24"/>
               </w:rPr>
             </w:pPr>
             <w:r>
               <w:rPr>
-                <w:b w:val="1"/>
-                <w:bCs w:val="1"/>
-                <w:color w:val="000000" w:themeColor="text1" w:themeTint="FF" w:themeShade="FF"/>
+                <w:b/>
+                <w:bCs/>
+                <w:color w:val="000000" w:themeColor="text1"/>
                 <w:sz w:val="24"/>
                 <w:szCs w:val="24"/>
               </w:rPr>
@@ -3630,18 +3345,18 @@
             <w:pPr>
               <w:widowControl w:val="0"/>
               <w:pBdr>
-                <w:top w:val="nil" w:color="FF000000" w:sz="0" w:space="0"/>
-                <w:left w:val="nil" w:color="FF000000" w:sz="0" w:space="0"/>
-                <w:bottom w:val="nil" w:color="FF000000" w:sz="0" w:space="0"/>
-                <w:right w:val="nil" w:color="FF000000" w:sz="0" w:space="0"/>
-                <w:between w:val="nil" w:color="FF000000" w:sz="0" w:space="0"/>
+                <w:top w:val="nil"/>
+                <w:left w:val="nil"/>
+                <w:bottom w:val="nil"/>
+                <w:right w:val="nil"/>
+                <w:between w:val="nil"/>
               </w:pBdr>
               <w:spacing w:line="240" w:lineRule="auto"/>
               <w:jc w:val="center"/>
               <w:rPr>
-                <w:b w:val="1"/>
-                <w:bCs w:val="1"/>
-                <w:color w:val="000000" w:themeColor="text1" w:themeTint="FF" w:themeShade="FF"/>
+                <w:b/>
+                <w:bCs/>
+                <w:color w:val="000000" w:themeColor="text1"/>
                 <w:sz w:val="24"/>
                 <w:szCs w:val="24"/>
               </w:rPr>
@@ -3652,7 +3367,6 @@
           <w:tcPr>
             <w:tcW w:w="2832" w:type="dxa"/>
             <w:vMerge/>
-            <w:tcMar/>
           </w:tcPr>
           <w:p/>
         </w:tc>
@@ -3660,17 +3374,16 @@
     </w:tbl>
     <w:p>
       <w:pPr>
-        <w:pStyle w:val="Normal"/>
-        <w:widowControl w:val="0"/>
-        <w:pBdr>
-          <w:top w:val="nil" w:color="FF000000" w:sz="0" w:space="0"/>
-          <w:left w:val="nil" w:color="FF000000" w:sz="0" w:space="0"/>
-          <w:bottom w:val="nil" w:color="FF000000" w:sz="0" w:space="0"/>
-          <w:right w:val="nil" w:color="FF000000" w:sz="0" w:space="0"/>
-          <w:between w:val="nil" w:color="FF000000" w:sz="0" w:space="0"/>
-        </w:pBdr>
-        <w:rPr>
-          <w:color w:val="000000" w:themeColor="text1" w:themeTint="FF" w:themeShade="FF"/>
+        <w:widowControl w:val="0"/>
+        <w:pBdr>
+          <w:top w:val="nil"/>
+          <w:left w:val="nil"/>
+          <w:bottom w:val="nil"/>
+          <w:right w:val="nil"/>
+          <w:between w:val="nil"/>
+        </w:pBdr>
+        <w:rPr>
+          <w:color w:val="000000" w:themeColor="text1"/>
           <w:sz w:val="18"/>
           <w:szCs w:val="18"/>
         </w:rPr>
@@ -3680,16 +3393,16 @@
       <w:pPr>
         <w:widowControl w:val="0"/>
         <w:pBdr>
-          <w:top w:val="nil" w:color="000000" w:sz="0" w:space="0"/>
-          <w:left w:val="nil" w:color="000000" w:sz="0" w:space="0"/>
-          <w:bottom w:val="nil" w:color="000000" w:sz="0" w:space="0"/>
-          <w:right w:val="nil" w:color="000000" w:sz="0" w:space="0"/>
-          <w:between w:val="nil" w:color="000000" w:sz="0" w:space="0"/>
-        </w:pBdr>
-      </w:pPr>
-      <w:r>
-        <w:rPr>
-          <w:color w:val="000000" w:themeColor="text1" w:themeTint="FF" w:themeShade="FF"/>
+          <w:top w:val="nil"/>
+          <w:left w:val="nil"/>
+          <w:bottom w:val="nil"/>
+          <w:right w:val="nil"/>
+          <w:between w:val="nil"/>
+        </w:pBdr>
+      </w:pPr>
+      <w:r>
+        <w:rPr>
+          <w:color w:val="000000" w:themeColor="text1"/>
           <w:sz w:val="18"/>
           <w:szCs w:val="18"/>
         </w:rPr>
@@ -3697,9 +3410,9 @@
       </w:r>
       <w:r>
         <w:rPr>
-          <w:b w:val="1"/>
-          <w:bCs w:val="1"/>
-          <w:color w:val="000000" w:themeColor="text1" w:themeTint="FF" w:themeShade="FF"/>
+          <w:b/>
+          <w:bCs/>
+          <w:color w:val="000000" w:themeColor="text1"/>
           <w:sz w:val="24"/>
           <w:szCs w:val="24"/>
         </w:rPr>
@@ -3707,55 +3420,47 @@
       </w:r>
       <w:r>
         <w:rPr>
-          <w:b w:val="1"/>
-          <w:bCs w:val="1"/>
-          <w:color w:val="000000" w:themeColor="text1" w:themeTint="FF" w:themeShade="FF"/>
-          <w:sz w:val="24"/>
-          <w:szCs w:val="24"/>
-        </w:rPr>
-        <w:t>.2 R</w:t>
-      </w:r>
-      <w:r>
-        <w:rPr>
-          <w:b w:val="1"/>
-          <w:bCs w:val="1"/>
-          <w:color w:val="000000" w:themeColor="text1" w:themeTint="FF" w:themeShade="FF"/>
-          <w:sz w:val="24"/>
-          <w:szCs w:val="24"/>
-        </w:rPr>
-        <w:t>egras de negócios</w:t>
-      </w:r>
-    </w:p>
-    <w:p>
-      <w:pPr>
-        <w:pStyle w:val="Normal"/>
-        <w:widowControl w:val="0"/>
-        <w:pBdr>
-          <w:top w:val="nil" w:color="000000" w:sz="0" w:space="0"/>
-          <w:left w:val="nil" w:color="000000" w:sz="0" w:space="0"/>
-          <w:bottom w:val="nil" w:color="000000" w:sz="0" w:space="0"/>
-          <w:right w:val="nil" w:color="000000" w:sz="0" w:space="0"/>
-          <w:between w:val="nil" w:color="000000" w:sz="0" w:space="0"/>
-        </w:pBdr>
-      </w:pPr>
-      <w:r>
+          <w:b/>
+          <w:bCs/>
+          <w:color w:val="000000" w:themeColor="text1"/>
+          <w:sz w:val="24"/>
+          <w:szCs w:val="24"/>
+        </w:rPr>
+        <w:t>.2 Regras de negócios</w:t>
+      </w:r>
+    </w:p>
+    <w:p>
+      <w:pPr>
+        <w:widowControl w:val="0"/>
+        <w:pBdr>
+          <w:top w:val="nil"/>
+          <w:left w:val="nil"/>
+          <w:bottom w:val="nil"/>
+          <w:right w:val="nil"/>
+          <w:between w:val="nil"/>
+        </w:pBdr>
+      </w:pPr>
+      <w:r>
+        <w:rPr>
+          <w:noProof/>
+        </w:rPr>
         <w:drawing>
-          <wp:inline wp14:editId="786CEAB1" wp14:anchorId="5447F5B5">
+          <wp:inline distT="0" distB="0" distL="0" distR="0" wp14:anchorId="5447F5B5" wp14:editId="786CEAB1">
             <wp:extent cx="6029325" cy="1685925"/>
             <wp:effectExtent l="0" t="0" r="0" b="0"/>
             <wp:docPr id="418855603" name="drawing"/>
             <wp:cNvGraphicFramePr>
-              <a:graphicFrameLocks noChangeAspect="1"/>
+              <a:graphicFrameLocks xmlns:a="http://schemas.openxmlformats.org/drawingml/2006/main" noChangeAspect="1"/>
             </wp:cNvGraphicFramePr>
-            <a:graphic>
-              <a:graphicData xmlns:a="http://schemas.openxmlformats.org/drawingml/2006/main" uri="http://schemas.openxmlformats.org/drawingml/2006/picture">
+            <a:graphic xmlns:a="http://schemas.openxmlformats.org/drawingml/2006/main">
+              <a:graphicData uri="http://schemas.openxmlformats.org/drawingml/2006/picture">
                 <pic:pic xmlns:pic="http://schemas.openxmlformats.org/drawingml/2006/picture">
                   <pic:nvPicPr>
                     <pic:cNvPr id="418855603" name="Picture 418855603"/>
                     <pic:cNvPicPr/>
                   </pic:nvPicPr>
                   <pic:blipFill>
-                    <a:blip xmlns:r="http://schemas.openxmlformats.org/officeDocument/2006/relationships" r:embed="rId794654820">
+                    <a:blip r:embed="rId10">
                       <a:extLst>
                         <a:ext uri="{28A0092B-C50C-407E-A947-70E740481C1C}">
                           <a14:useLocalDpi xmlns:a14="http://schemas.microsoft.com/office/drawing/2010/main"/>
@@ -3783,7 +3488,7 @@
       </w:r>
       <w:r>
         <w:rPr>
-          <w:color w:val="000000" w:themeColor="text1" w:themeTint="FF" w:themeShade="FF"/>
+          <w:color w:val="000000" w:themeColor="text1"/>
           <w:sz w:val="16"/>
           <w:szCs w:val="16"/>
         </w:rPr>
@@ -3800,7 +3505,6 @@
     </w:p>
     <w:p>
       <w:pPr>
-        <w:pStyle w:val="Normal"/>
         <w:widowControl w:val="0"/>
         <w:spacing w:line="240" w:lineRule="auto"/>
         <w:rPr>
@@ -3809,9 +3513,9 @@
       </w:pPr>
       <w:r>
         <w:rPr>
-          <w:b w:val="1"/>
-          <w:bCs w:val="1"/>
-          <w:color w:val="000000" w:themeColor="text1" w:themeTint="FF" w:themeShade="FF"/>
+          <w:b/>
+          <w:bCs/>
+          <w:color w:val="000000" w:themeColor="text1"/>
           <w:sz w:val="24"/>
           <w:szCs w:val="24"/>
         </w:rPr>
@@ -3978,11 +3682,11 @@
       <w:pPr>
         <w:widowControl w:val="0"/>
         <w:pBdr>
-          <w:top w:val="nil" w:color="FF000000" w:sz="0" w:space="0"/>
-          <w:left w:val="nil" w:color="FF000000" w:sz="0" w:space="0"/>
-          <w:bottom w:val="nil" w:color="FF000000" w:sz="0" w:space="0"/>
-          <w:right w:val="nil" w:color="FF000000" w:sz="0" w:space="0"/>
-          <w:between w:val="nil" w:color="FF000000" w:sz="0" w:space="0"/>
+          <w:top w:val="nil"/>
+          <w:left w:val="nil"/>
+          <w:bottom w:val="nil"/>
+          <w:right w:val="nil"/>
+          <w:between w:val="nil"/>
         </w:pBdr>
         <w:ind w:left="360"/>
         <w:rPr>
@@ -3993,7 +3697,7 @@
       </w:pPr>
       <w:r>
         <w:rPr>
-          <w:color w:val="000000" w:themeColor="text1" w:themeTint="FF" w:themeShade="FF"/>
+          <w:color w:val="000000" w:themeColor="text1"/>
           <w:sz w:val="16"/>
           <w:szCs w:val="16"/>
         </w:rPr>
@@ -4002,7 +3706,7 @@
     </w:p>
     <w:p>
       <w:pPr>
-        <w:pStyle w:val="ListParagraph"/>
+        <w:pStyle w:val="PargrafodaLista"/>
         <w:widowControl w:val="0"/>
         <w:pBdr>
           <w:top w:val="nil"/>
@@ -4021,11 +3725,11 @@
     </w:p>
     <w:p>
       <w:pPr>
-        <w:pStyle w:val="ListParagraph"/>
+        <w:pStyle w:val="PargrafodaLista"/>
         <w:widowControl w:val="0"/>
         <w:numPr>
           <w:ilvl w:val="0"/>
-          <w:numId w:val="1"/>
+          <w:numId w:val="2"/>
         </w:numPr>
         <w:pBdr>
           <w:top w:val="nil"/>
@@ -4053,7 +3757,7 @@
     </w:p>
     <w:p>
       <w:pPr>
-        <w:pStyle w:val="ListParagraph"/>
+        <w:pStyle w:val="PargrafodaLista"/>
         <w:rPr>
           <w:b/>
           <w:color w:val="000000"/>
@@ -4151,18 +3855,18 @@
     </w:p>
     <w:p>
       <w:pPr>
-        <w:pStyle w:val="ListParagraph"/>
-        <w:widowControl w:val="0"/>
-        <w:pBdr>
-          <w:top w:val="nil" w:color="FF000000" w:sz="0" w:space="0"/>
-          <w:left w:val="nil" w:color="FF000000" w:sz="0" w:space="0"/>
-          <w:bottom w:val="nil" w:color="FF000000" w:sz="0" w:space="0"/>
-          <w:right w:val="nil" w:color="FF000000" w:sz="0" w:space="0"/>
-          <w:between w:val="nil" w:color="FF000000" w:sz="0" w:space="0"/>
-        </w:pBdr>
-        <w:rPr>
-          <w:b w:val="1"/>
-          <w:bCs w:val="1"/>
+        <w:pStyle w:val="PargrafodaLista"/>
+        <w:widowControl w:val="0"/>
+        <w:pBdr>
+          <w:top w:val="nil"/>
+          <w:left w:val="nil"/>
+          <w:bottom w:val="nil"/>
+          <w:right w:val="nil"/>
+          <w:between w:val="nil"/>
+        </w:pBdr>
+        <w:rPr>
+          <w:b/>
+          <w:bCs/>
           <w:color w:val="000000"/>
           <w:sz w:val="24"/>
           <w:szCs w:val="24"/>
@@ -4171,99 +3875,99 @@
     </w:p>
     <w:p>
       <w:pPr>
-        <w:pStyle w:val="ListParagraph"/>
-        <w:widowControl w:val="0"/>
-        <w:pBdr>
-          <w:top w:val="nil" w:color="FF000000" w:sz="0" w:space="0"/>
-          <w:left w:val="nil" w:color="FF000000" w:sz="0" w:space="0"/>
-          <w:bottom w:val="nil" w:color="FF000000" w:sz="0" w:space="0"/>
-          <w:right w:val="nil" w:color="FF000000" w:sz="0" w:space="0"/>
-          <w:between w:val="nil" w:color="FF000000" w:sz="0" w:space="0"/>
-        </w:pBdr>
-        <w:rPr>
-          <w:b w:val="1"/>
-          <w:bCs w:val="1"/>
-          <w:color w:val="000000" w:themeColor="text1" w:themeTint="FF" w:themeShade="FF"/>
-          <w:sz w:val="24"/>
-          <w:szCs w:val="24"/>
-        </w:rPr>
-      </w:pPr>
-    </w:p>
-    <w:p>
-      <w:pPr>
-        <w:pStyle w:val="ListParagraph"/>
-        <w:widowControl w:val="0"/>
-        <w:pBdr>
-          <w:top w:val="nil" w:color="FF000000" w:sz="0" w:space="0"/>
-          <w:left w:val="nil" w:color="FF000000" w:sz="0" w:space="0"/>
-          <w:bottom w:val="nil" w:color="FF000000" w:sz="0" w:space="0"/>
-          <w:right w:val="nil" w:color="FF000000" w:sz="0" w:space="0"/>
-          <w:between w:val="nil" w:color="FF000000" w:sz="0" w:space="0"/>
-        </w:pBdr>
-        <w:rPr>
-          <w:b w:val="1"/>
-          <w:bCs w:val="1"/>
-          <w:color w:val="000000" w:themeColor="text1" w:themeTint="FF" w:themeShade="FF"/>
-          <w:sz w:val="24"/>
-          <w:szCs w:val="24"/>
-        </w:rPr>
-      </w:pPr>
-    </w:p>
-    <w:p>
-      <w:pPr>
-        <w:pStyle w:val="ListParagraph"/>
-        <w:widowControl w:val="0"/>
-        <w:pBdr>
-          <w:top w:val="nil" w:color="FF000000" w:sz="0" w:space="0"/>
-          <w:left w:val="nil" w:color="FF000000" w:sz="0" w:space="0"/>
-          <w:bottom w:val="nil" w:color="FF000000" w:sz="0" w:space="0"/>
-          <w:right w:val="nil" w:color="FF000000" w:sz="0" w:space="0"/>
-          <w:between w:val="nil" w:color="FF000000" w:sz="0" w:space="0"/>
-        </w:pBdr>
-        <w:rPr>
-          <w:b w:val="1"/>
-          <w:bCs w:val="1"/>
-          <w:color w:val="000000" w:themeColor="text1" w:themeTint="FF" w:themeShade="FF"/>
-          <w:sz w:val="24"/>
-          <w:szCs w:val="24"/>
-        </w:rPr>
-      </w:pPr>
-    </w:p>
-    <w:p>
-      <w:pPr>
-        <w:pStyle w:val="ListParagraph"/>
-        <w:widowControl w:val="0"/>
-        <w:pBdr>
-          <w:top w:val="nil" w:color="FF000000" w:sz="0" w:space="0"/>
-          <w:left w:val="nil" w:color="FF000000" w:sz="0" w:space="0"/>
-          <w:bottom w:val="nil" w:color="FF000000" w:sz="0" w:space="0"/>
-          <w:right w:val="nil" w:color="FF000000" w:sz="0" w:space="0"/>
-          <w:between w:val="nil" w:color="FF000000" w:sz="0" w:space="0"/>
-        </w:pBdr>
-        <w:rPr>
-          <w:b w:val="1"/>
-          <w:bCs w:val="1"/>
-          <w:color w:val="000000" w:themeColor="text1" w:themeTint="FF" w:themeShade="FF"/>
-          <w:sz w:val="24"/>
-          <w:szCs w:val="24"/>
-        </w:rPr>
-      </w:pPr>
-    </w:p>
-    <w:p>
-      <w:pPr>
-        <w:pStyle w:val="ListParagraph"/>
-        <w:widowControl w:val="0"/>
-        <w:pBdr>
-          <w:top w:val="nil" w:color="FF000000" w:sz="0" w:space="0"/>
-          <w:left w:val="nil" w:color="FF000000" w:sz="0" w:space="0"/>
-          <w:bottom w:val="nil" w:color="FF000000" w:sz="0" w:space="0"/>
-          <w:right w:val="nil" w:color="FF000000" w:sz="0" w:space="0"/>
-          <w:between w:val="nil" w:color="FF000000" w:sz="0" w:space="0"/>
-        </w:pBdr>
-        <w:rPr>
-          <w:b w:val="1"/>
-          <w:bCs w:val="1"/>
-          <w:color w:val="000000" w:themeColor="text1" w:themeTint="FF" w:themeShade="FF"/>
+        <w:pStyle w:val="PargrafodaLista"/>
+        <w:widowControl w:val="0"/>
+        <w:pBdr>
+          <w:top w:val="nil"/>
+          <w:left w:val="nil"/>
+          <w:bottom w:val="nil"/>
+          <w:right w:val="nil"/>
+          <w:between w:val="nil"/>
+        </w:pBdr>
+        <w:rPr>
+          <w:b/>
+          <w:bCs/>
+          <w:color w:val="000000" w:themeColor="text1"/>
+          <w:sz w:val="24"/>
+          <w:szCs w:val="24"/>
+        </w:rPr>
+      </w:pPr>
+    </w:p>
+    <w:p>
+      <w:pPr>
+        <w:pStyle w:val="PargrafodaLista"/>
+        <w:widowControl w:val="0"/>
+        <w:pBdr>
+          <w:top w:val="nil"/>
+          <w:left w:val="nil"/>
+          <w:bottom w:val="nil"/>
+          <w:right w:val="nil"/>
+          <w:between w:val="nil"/>
+        </w:pBdr>
+        <w:rPr>
+          <w:b/>
+          <w:bCs/>
+          <w:color w:val="000000" w:themeColor="text1"/>
+          <w:sz w:val="24"/>
+          <w:szCs w:val="24"/>
+        </w:rPr>
+      </w:pPr>
+    </w:p>
+    <w:p>
+      <w:pPr>
+        <w:pStyle w:val="PargrafodaLista"/>
+        <w:widowControl w:val="0"/>
+        <w:pBdr>
+          <w:top w:val="nil"/>
+          <w:left w:val="nil"/>
+          <w:bottom w:val="nil"/>
+          <w:right w:val="nil"/>
+          <w:between w:val="nil"/>
+        </w:pBdr>
+        <w:rPr>
+          <w:b/>
+          <w:bCs/>
+          <w:color w:val="000000" w:themeColor="text1"/>
+          <w:sz w:val="24"/>
+          <w:szCs w:val="24"/>
+        </w:rPr>
+      </w:pPr>
+    </w:p>
+    <w:p>
+      <w:pPr>
+        <w:pStyle w:val="PargrafodaLista"/>
+        <w:widowControl w:val="0"/>
+        <w:pBdr>
+          <w:top w:val="nil"/>
+          <w:left w:val="nil"/>
+          <w:bottom w:val="nil"/>
+          <w:right w:val="nil"/>
+          <w:between w:val="nil"/>
+        </w:pBdr>
+        <w:rPr>
+          <w:b/>
+          <w:bCs/>
+          <w:color w:val="000000" w:themeColor="text1"/>
+          <w:sz w:val="24"/>
+          <w:szCs w:val="24"/>
+        </w:rPr>
+      </w:pPr>
+    </w:p>
+    <w:p>
+      <w:pPr>
+        <w:pStyle w:val="PargrafodaLista"/>
+        <w:widowControl w:val="0"/>
+        <w:pBdr>
+          <w:top w:val="nil"/>
+          <w:left w:val="nil"/>
+          <w:bottom w:val="nil"/>
+          <w:right w:val="nil"/>
+          <w:between w:val="nil"/>
+        </w:pBdr>
+        <w:rPr>
+          <w:b/>
+          <w:bCs/>
+          <w:color w:val="000000" w:themeColor="text1"/>
           <w:sz w:val="24"/>
           <w:szCs w:val="24"/>
         </w:rPr>
@@ -4281,12 +3985,12 @@
       <w:tblPr>
         <w:tblW w:w="0" w:type="auto"/>
         <w:tblBorders>
-          <w:top w:val="single" w:color="000000" w:themeColor="text1" w:sz="8"/>
-          <w:left w:val="single" w:color="000000" w:themeColor="text1" w:sz="8"/>
-          <w:bottom w:val="single" w:color="000000" w:themeColor="text1" w:sz="8"/>
-          <w:right w:val="single" w:color="000000" w:themeColor="text1" w:sz="8"/>
-          <w:insideH w:val="single" w:color="000000" w:themeColor="text1" w:sz="8"/>
-          <w:insideV w:val="single" w:color="000000" w:themeColor="text1" w:sz="8"/>
+          <w:top w:val="single" w:sz="8" w:space="0" w:color="000000" w:themeColor="text1"/>
+          <w:left w:val="single" w:sz="8" w:space="0" w:color="000000" w:themeColor="text1"/>
+          <w:bottom w:val="single" w:sz="8" w:space="0" w:color="000000" w:themeColor="text1"/>
+          <w:right w:val="single" w:sz="8" w:space="0" w:color="000000" w:themeColor="text1"/>
+          <w:insideH w:val="single" w:sz="8" w:space="0" w:color="000000" w:themeColor="text1"/>
+          <w:insideV w:val="single" w:sz="8" w:space="0" w:color="000000" w:themeColor="text1"/>
         </w:tblBorders>
         <w:tblLook w:val="0600" w:firstRow="0" w:lastRow="0" w:firstColumn="0" w:lastColumn="0" w:noHBand="1" w:noVBand="1"/>
       </w:tblPr>
@@ -4312,30 +4016,31 @@
             <w:pPr>
               <w:widowControl w:val="0"/>
               <w:pBdr>
-                <w:top w:val="nil" w:color="FF000000" w:sz="0" w:space="0"/>
-                <w:left w:val="nil" w:color="FF000000" w:sz="0" w:space="0"/>
-                <w:bottom w:val="nil" w:color="FF000000" w:sz="0" w:space="0"/>
-                <w:right w:val="nil" w:color="FF000000" w:sz="0" w:space="0"/>
-                <w:between w:val="nil" w:color="FF000000" w:sz="0" w:space="0"/>
+                <w:top w:val="nil"/>
+                <w:left w:val="nil"/>
+                <w:bottom w:val="nil"/>
+                <w:right w:val="nil"/>
+                <w:between w:val="nil"/>
               </w:pBdr>
               <w:spacing w:line="240" w:lineRule="auto"/>
               <w:jc w:val="center"/>
               <w:rPr>
-                <w:b w:val="1"/>
-                <w:bCs w:val="1"/>
-                <w:color w:val="000000" w:themeColor="text1" w:themeTint="FF" w:themeShade="FF"/>
+                <w:b/>
+                <w:bCs/>
+                <w:color w:val="000000" w:themeColor="text1"/>
                 <w:sz w:val="24"/>
                 <w:szCs w:val="24"/>
               </w:rPr>
             </w:pPr>
             <w:r>
               <w:rPr>
-                <w:b w:val="1"/>
-                <w:bCs w:val="1"/>
-                <w:color w:val="000000" w:themeColor="text1" w:themeTint="FF" w:themeShade="FF"/>
-                <w:sz w:val="24"/>
-                <w:szCs w:val="24"/>
-              </w:rPr>
+                <w:b/>
+                <w:bCs/>
+                <w:color w:val="000000" w:themeColor="text1"/>
+                <w:sz w:val="24"/>
+                <w:szCs w:val="24"/>
+              </w:rPr>
+              <w:lastRenderedPageBreak/>
               <w:t>Declaração do escopo do Projeto</w:t>
             </w:r>
           </w:p>
@@ -4355,52 +4060,55 @@
             <w:pPr>
               <w:widowControl w:val="0"/>
               <w:pBdr>
-                <w:top w:val="nil" w:color="FF000000" w:sz="0" w:space="0"/>
-                <w:left w:val="nil" w:color="FF000000" w:sz="0" w:space="0"/>
-                <w:bottom w:val="nil" w:color="FF000000" w:sz="0" w:space="0"/>
-                <w:right w:val="nil" w:color="FF000000" w:sz="0" w:space="0"/>
-                <w:between w:val="nil" w:color="FF000000" w:sz="0" w:space="0"/>
+                <w:top w:val="nil"/>
+                <w:left w:val="nil"/>
+                <w:bottom w:val="nil"/>
+                <w:right w:val="nil"/>
+                <w:between w:val="nil"/>
               </w:pBdr>
               <w:spacing w:line="240" w:lineRule="auto"/>
               <w:jc w:val="center"/>
               <w:rPr>
-                <w:b w:val="1"/>
-                <w:bCs w:val="1"/>
-                <w:color w:val="000000" w:themeColor="text1" w:themeTint="FF" w:themeShade="FF"/>
+                <w:b/>
+                <w:bCs/>
+                <w:color w:val="000000" w:themeColor="text1"/>
                 <w:sz w:val="24"/>
                 <w:szCs w:val="24"/>
               </w:rPr>
             </w:pPr>
             <w:r>
+              <w:rPr>
+                <w:noProof/>
+              </w:rPr>
               <w:drawing>
-                <wp:inline wp14:editId="68B84CF0" wp14:anchorId="27C1536C">
+                <wp:inline distT="0" distB="0" distL="0" distR="0" wp14:anchorId="27C1536C" wp14:editId="68B84CF0">
                   <wp:extent cx="1257300" cy="935355"/>
                   <wp:effectExtent l="0" t="0" r="0" b="0"/>
                   <wp:docPr id="703445090" name="image5.png"/>
                   <wp:cNvGraphicFramePr/>
-                  <a:graphic>
-                    <a:graphicData xmlns:a="http://schemas.openxmlformats.org/drawingml/2006/main" uri="http://schemas.openxmlformats.org/drawingml/2006/picture">
+                  <a:graphic xmlns:a="http://schemas.openxmlformats.org/drawingml/2006/main">
+                    <a:graphicData uri="http://schemas.openxmlformats.org/drawingml/2006/picture">
                       <pic:pic xmlns:pic="http://schemas.openxmlformats.org/drawingml/2006/picture">
-                        <pic:nvPicPr xmlns:pic="http://schemas.openxmlformats.org/drawingml/2006/picture">
-                          <pic:cNvPr xmlns:pic="http://schemas.openxmlformats.org/drawingml/2006/picture" id="0" name="image5.png"/>
-                          <pic:cNvPicPr xmlns:pic="http://schemas.openxmlformats.org/drawingml/2006/picture" preferRelativeResize="0"/>
+                        <pic:nvPicPr>
+                          <pic:cNvPr id="0" name="image5.png"/>
+                          <pic:cNvPicPr preferRelativeResize="0"/>
                         </pic:nvPicPr>
-                        <pic:blipFill xmlns:pic="http://schemas.openxmlformats.org/drawingml/2006/picture">
-                          <a:blip xmlns:r="http://schemas.openxmlformats.org/officeDocument/2006/relationships" xmlns:a="http://schemas.openxmlformats.org/drawingml/2006/main" r:embed="rId8"/>
-                          <a:srcRect xmlns:a="http://schemas.openxmlformats.org/drawingml/2006/main"/>
-                          <a:stretch xmlns:a="http://schemas.openxmlformats.org/drawingml/2006/main">
-                            <a:fillRect xmlns:a="http://schemas.openxmlformats.org/drawingml/2006/main"/>
+                        <pic:blipFill>
+                          <a:blip r:embed="rId8"/>
+                          <a:srcRect/>
+                          <a:stretch>
+                            <a:fillRect/>
                           </a:stretch>
                         </pic:blipFill>
-                        <pic:spPr xmlns:pic="http://schemas.openxmlformats.org/drawingml/2006/picture">
-                          <a:xfrm xmlns:a="http://schemas.openxmlformats.org/drawingml/2006/main">
-                            <a:off xmlns:a="http://schemas.openxmlformats.org/drawingml/2006/main" x="0" y="0"/>
-                            <a:ext xmlns:a="http://schemas.openxmlformats.org/drawingml/2006/main" cx="1257300" cy="935355"/>
+                        <pic:spPr>
+                          <a:xfrm>
+                            <a:off x="0" y="0"/>
+                            <a:ext cx="1257300" cy="935355"/>
                           </a:xfrm>
-                          <a:prstGeom xmlns:a="http://schemas.openxmlformats.org/drawingml/2006/main" prst="rect">
-                            <a:avLst xmlns:a="http://schemas.openxmlformats.org/drawingml/2006/main"/>
+                          <a:prstGeom prst="rect">
+                            <a:avLst/>
                           </a:prstGeom>
-                          <a:ln xmlns:a="http://schemas.openxmlformats.org/drawingml/2006/main"/>
+                          <a:ln/>
                         </pic:spPr>
                       </pic:pic>
                     </a:graphicData>
@@ -4429,27 +4137,27 @@
             <w:pPr>
               <w:widowControl w:val="0"/>
               <w:pBdr>
-                <w:top w:val="nil" w:color="FF000000" w:sz="0" w:space="0"/>
-                <w:left w:val="nil" w:color="FF000000" w:sz="0" w:space="0"/>
-                <w:bottom w:val="nil" w:color="FF000000" w:sz="0" w:space="0"/>
-                <w:right w:val="nil" w:color="FF000000" w:sz="0" w:space="0"/>
-                <w:between w:val="nil" w:color="FF000000" w:sz="0" w:space="0"/>
+                <w:top w:val="nil"/>
+                <w:left w:val="nil"/>
+                <w:bottom w:val="nil"/>
+                <w:right w:val="nil"/>
+                <w:between w:val="nil"/>
               </w:pBdr>
               <w:spacing w:line="240" w:lineRule="auto"/>
               <w:jc w:val="center"/>
               <w:rPr>
-                <w:b w:val="1"/>
-                <w:bCs w:val="1"/>
-                <w:color w:val="000000" w:themeColor="text1" w:themeTint="FF" w:themeShade="FF"/>
+                <w:b/>
+                <w:bCs/>
+                <w:color w:val="000000" w:themeColor="text1"/>
                 <w:sz w:val="24"/>
                 <w:szCs w:val="24"/>
               </w:rPr>
             </w:pPr>
             <w:r>
               <w:rPr>
-                <w:b w:val="1"/>
-                <w:bCs w:val="1"/>
-                <w:color w:val="000000" w:themeColor="text1" w:themeTint="FF" w:themeShade="FF"/>
+                <w:b/>
+                <w:bCs/>
+                <w:color w:val="000000" w:themeColor="text1"/>
                 <w:sz w:val="24"/>
                 <w:szCs w:val="24"/>
               </w:rPr>
@@ -4460,18 +4168,18 @@
             <w:pPr>
               <w:widowControl w:val="0"/>
               <w:pBdr>
-                <w:top w:val="nil" w:color="FF000000" w:sz="0" w:space="0"/>
-                <w:left w:val="nil" w:color="FF000000" w:sz="0" w:space="0"/>
-                <w:bottom w:val="nil" w:color="FF000000" w:sz="0" w:space="0"/>
-                <w:right w:val="nil" w:color="FF000000" w:sz="0" w:space="0"/>
-                <w:between w:val="nil" w:color="FF000000" w:sz="0" w:space="0"/>
+                <w:top w:val="nil"/>
+                <w:left w:val="nil"/>
+                <w:bottom w:val="nil"/>
+                <w:right w:val="nil"/>
+                <w:between w:val="nil"/>
               </w:pBdr>
               <w:spacing w:line="240" w:lineRule="auto"/>
               <w:jc w:val="center"/>
               <w:rPr>
-                <w:b w:val="1"/>
-                <w:bCs w:val="1"/>
-                <w:color w:val="000000" w:themeColor="text1" w:themeTint="FF" w:themeShade="FF"/>
+                <w:b/>
+                <w:bCs/>
+                <w:color w:val="000000" w:themeColor="text1"/>
                 <w:sz w:val="24"/>
                 <w:szCs w:val="24"/>
               </w:rPr>
@@ -4482,7 +4190,6 @@
           <w:tcPr>
             <w:tcW w:w="2832" w:type="dxa"/>
             <w:vMerge/>
-            <w:tcMar/>
           </w:tcPr>
           <w:p/>
         </w:tc>
@@ -4490,51 +4197,50 @@
     </w:tbl>
     <w:p>
       <w:pPr>
-        <w:pStyle w:val="Normal"/>
-        <w:widowControl w:val="0"/>
-        <w:pBdr>
-          <w:top w:val="nil" w:color="FF000000" w:sz="0" w:space="0"/>
-          <w:left w:val="nil" w:color="FF000000" w:sz="0" w:space="0"/>
-          <w:bottom w:val="nil" w:color="FF000000" w:sz="0" w:space="0"/>
-          <w:right w:val="nil" w:color="FF000000" w:sz="0" w:space="0"/>
-          <w:between w:val="nil" w:color="FF000000" w:sz="0" w:space="0"/>
-        </w:pBdr>
-        <w:rPr>
-          <w:b w:val="1"/>
-          <w:bCs w:val="1"/>
-          <w:color w:val="000000" w:themeColor="text1" w:themeTint="FF" w:themeShade="FF"/>
-          <w:sz w:val="24"/>
-          <w:szCs w:val="24"/>
-        </w:rPr>
-      </w:pPr>
-    </w:p>
-    <w:p>
-      <w:pPr>
-        <w:pStyle w:val="ListParagraph"/>
-        <w:widowControl w:val="0"/>
-        <w:pBdr>
-          <w:top w:val="nil" w:color="FF000000" w:sz="0" w:space="0"/>
-          <w:left w:val="nil" w:color="FF000000" w:sz="0" w:space="0"/>
-          <w:bottom w:val="nil" w:color="FF000000" w:sz="0" w:space="0"/>
-          <w:right w:val="nil" w:color="FF000000" w:sz="0" w:space="0"/>
-          <w:between w:val="nil" w:color="FF000000" w:sz="0" w:space="0"/>
-        </w:pBdr>
-        <w:rPr>
-          <w:b w:val="1"/>
-          <w:bCs w:val="1"/>
-          <w:color w:val="000000" w:themeColor="text1" w:themeTint="FF" w:themeShade="FF"/>
-          <w:sz w:val="24"/>
-          <w:szCs w:val="24"/>
-        </w:rPr>
-      </w:pPr>
-    </w:p>
-    <w:p>
-      <w:pPr>
-        <w:pStyle w:val="ListParagraph"/>
+        <w:widowControl w:val="0"/>
+        <w:pBdr>
+          <w:top w:val="nil"/>
+          <w:left w:val="nil"/>
+          <w:bottom w:val="nil"/>
+          <w:right w:val="nil"/>
+          <w:between w:val="nil"/>
+        </w:pBdr>
+        <w:rPr>
+          <w:b/>
+          <w:bCs/>
+          <w:color w:val="000000" w:themeColor="text1"/>
+          <w:sz w:val="24"/>
+          <w:szCs w:val="24"/>
+        </w:rPr>
+      </w:pPr>
+    </w:p>
+    <w:p>
+      <w:pPr>
+        <w:pStyle w:val="PargrafodaLista"/>
+        <w:widowControl w:val="0"/>
+        <w:pBdr>
+          <w:top w:val="nil"/>
+          <w:left w:val="nil"/>
+          <w:bottom w:val="nil"/>
+          <w:right w:val="nil"/>
+          <w:between w:val="nil"/>
+        </w:pBdr>
+        <w:rPr>
+          <w:b/>
+          <w:bCs/>
+          <w:color w:val="000000" w:themeColor="text1"/>
+          <w:sz w:val="24"/>
+          <w:szCs w:val="24"/>
+        </w:rPr>
+      </w:pPr>
+    </w:p>
+    <w:p>
+      <w:pPr>
+        <w:pStyle w:val="PargrafodaLista"/>
         <w:widowControl w:val="0"/>
         <w:numPr>
           <w:ilvl w:val="0"/>
-          <w:numId w:val="1"/>
+          <w:numId w:val="2"/>
         </w:numPr>
         <w:pBdr>
           <w:top w:val="nil"/>
@@ -4582,7 +4288,7 @@
     </w:p>
     <w:p>
       <w:pPr>
-        <w:pStyle w:val="ListParagraph"/>
+        <w:pStyle w:val="PargrafodaLista"/>
         <w:widowControl w:val="0"/>
         <w:pBdr>
           <w:top w:val="nil"/>
@@ -4601,27 +4307,27 @@
     </w:p>
     <w:p>
       <w:pPr>
-        <w:pStyle w:val="ListParagraph"/>
-        <w:widowControl w:val="0"/>
-        <w:pBdr>
-          <w:top w:val="nil" w:color="FF000000" w:sz="0" w:space="0"/>
-          <w:left w:val="nil" w:color="FF000000" w:sz="0" w:space="0"/>
-          <w:bottom w:val="nil" w:color="FF000000" w:sz="0" w:space="0"/>
-          <w:right w:val="nil" w:color="FF000000" w:sz="0" w:space="0"/>
-          <w:between w:val="nil" w:color="FF000000" w:sz="0" w:space="0"/>
-        </w:pBdr>
-      </w:pPr>
-    </w:p>
-    <w:p>
-      <w:pPr>
-        <w:pStyle w:val="ListParagraph"/>
-        <w:widowControl w:val="0"/>
-        <w:pBdr>
-          <w:top w:val="nil" w:color="FF000000" w:sz="0" w:space="0"/>
-          <w:left w:val="nil" w:color="FF000000" w:sz="0" w:space="0"/>
-          <w:bottom w:val="nil" w:color="FF000000" w:sz="0" w:space="0"/>
-          <w:right w:val="nil" w:color="FF000000" w:sz="0" w:space="0"/>
-          <w:between w:val="nil" w:color="FF000000" w:sz="0" w:space="0"/>
+        <w:pStyle w:val="PargrafodaLista"/>
+        <w:widowControl w:val="0"/>
+        <w:pBdr>
+          <w:top w:val="nil"/>
+          <w:left w:val="nil"/>
+          <w:bottom w:val="nil"/>
+          <w:right w:val="nil"/>
+          <w:between w:val="nil"/>
+        </w:pBdr>
+      </w:pPr>
+    </w:p>
+    <w:p>
+      <w:pPr>
+        <w:pStyle w:val="PargrafodaLista"/>
+        <w:widowControl w:val="0"/>
+        <w:pBdr>
+          <w:top w:val="nil"/>
+          <w:left w:val="nil"/>
+          <w:bottom w:val="nil"/>
+          <w:right w:val="nil"/>
+          <w:between w:val="nil"/>
         </w:pBdr>
         <w:rPr>
           <w:color w:val="000000" w:themeColor="text1"/>
@@ -4630,23 +4336,26 @@
         </w:rPr>
       </w:pPr>
       <w:r>
+        <w:rPr>
+          <w:noProof/>
+        </w:rPr>
         <w:drawing>
-          <wp:inline wp14:editId="3DDF1064" wp14:anchorId="1B39DEFF">
+          <wp:inline distT="0" distB="0" distL="0" distR="0" wp14:anchorId="1B39DEFF" wp14:editId="3DDF1064">
             <wp:extent cx="5648325" cy="2831828"/>
             <wp:effectExtent l="0" t="0" r="0" b="0"/>
             <wp:docPr id="1470118995" name="drawing"/>
             <wp:cNvGraphicFramePr>
-              <a:graphicFrameLocks noChangeAspect="1"/>
+              <a:graphicFrameLocks xmlns:a="http://schemas.openxmlformats.org/drawingml/2006/main" noChangeAspect="1"/>
             </wp:cNvGraphicFramePr>
-            <a:graphic>
-              <a:graphicData xmlns:a="http://schemas.openxmlformats.org/drawingml/2006/main" uri="http://schemas.openxmlformats.org/drawingml/2006/picture">
+            <a:graphic xmlns:a="http://schemas.openxmlformats.org/drawingml/2006/main">
+              <a:graphicData uri="http://schemas.openxmlformats.org/drawingml/2006/picture">
                 <pic:pic xmlns:pic="http://schemas.openxmlformats.org/drawingml/2006/picture">
                   <pic:nvPicPr>
                     <pic:cNvPr id="1580789184" name="Picture 1580789184"/>
                     <pic:cNvPicPr/>
                   </pic:nvPicPr>
                   <pic:blipFill>
-                    <a:blip xmlns:r="http://schemas.openxmlformats.org/officeDocument/2006/relationships" r:embed="rId1353386542">
+                    <a:blip r:embed="rId13">
                       <a:extLst>
                         <a:ext uri="{28A0092B-C50C-407E-A947-70E740481C1C}">
                           <a14:useLocalDpi xmlns:a14="http://schemas.microsoft.com/office/drawing/2010/main"/>
@@ -4658,7 +4367,7 @@
                     </a:stretch>
                   </pic:blipFill>
                   <pic:spPr>
-                    <a:xfrm rot="0">
+                    <a:xfrm>
                       <a:off x="0" y="0"/>
                       <a:ext cx="5648325" cy="2831828"/>
                     </a:xfrm>
@@ -4674,7 +4383,7 @@
       </w:r>
       <w:r>
         <w:rPr>
-          <w:color w:val="000000" w:themeColor="text1" w:themeTint="FF" w:themeShade="FF"/>
+          <w:color w:val="000000" w:themeColor="text1"/>
           <w:sz w:val="16"/>
           <w:szCs w:val="16"/>
         </w:rPr>
@@ -4683,7 +4392,6 @@
     </w:p>
     <w:p>
       <w:pPr>
-        <w:pStyle w:val="Normal"/>
         <w:widowControl w:val="0"/>
         <w:spacing w:line="240" w:lineRule="auto"/>
         <w:rPr>
@@ -4692,9 +4400,9 @@
       </w:pPr>
       <w:r>
         <w:rPr>
-          <w:b w:val="1"/>
-          <w:bCs w:val="1"/>
-          <w:color w:val="000000" w:themeColor="text1" w:themeTint="FF" w:themeShade="FF"/>
+          <w:b/>
+          <w:bCs/>
+          <w:color w:val="000000" w:themeColor="text1"/>
           <w:sz w:val="24"/>
           <w:szCs w:val="24"/>
         </w:rPr>
@@ -4703,32 +4411,32 @@
     </w:p>
     <w:p>
       <w:pPr>
-        <w:pStyle w:val="ListParagraph"/>
+        <w:pStyle w:val="PargrafodaLista"/>
         <w:widowControl w:val="0"/>
         <w:numPr>
           <w:ilvl w:val="0"/>
-          <w:numId w:val="1"/>
+          <w:numId w:val="2"/>
         </w:numPr>
         <w:pBdr>
-          <w:top w:val="nil" w:color="FF000000" w:sz="0" w:space="0"/>
-          <w:left w:val="nil" w:color="FF000000" w:sz="0" w:space="0"/>
-          <w:bottom w:val="nil" w:color="FF000000" w:sz="0" w:space="0"/>
-          <w:right w:val="nil" w:color="FF000000" w:sz="0" w:space="0"/>
-          <w:between w:val="nil" w:color="FF000000" w:sz="0" w:space="0"/>
-        </w:pBdr>
-        <w:rPr>
-          <w:b w:val="1"/>
-          <w:bCs w:val="1"/>
-          <w:color w:val="000000" w:themeColor="text1"/>
-          <w:sz w:val="24"/>
-          <w:szCs w:val="24"/>
-        </w:rPr>
-      </w:pPr>
-      <w:r>
-        <w:rPr>
-          <w:b w:val="1"/>
-          <w:bCs w:val="1"/>
-          <w:color w:val="000000" w:themeColor="text1" w:themeTint="FF" w:themeShade="FF"/>
+          <w:top w:val="nil"/>
+          <w:left w:val="nil"/>
+          <w:bottom w:val="nil"/>
+          <w:right w:val="nil"/>
+          <w:between w:val="nil"/>
+        </w:pBdr>
+        <w:rPr>
+          <w:b/>
+          <w:bCs/>
+          <w:color w:val="000000" w:themeColor="text1"/>
+          <w:sz w:val="24"/>
+          <w:szCs w:val="24"/>
+        </w:rPr>
+      </w:pPr>
+      <w:r>
+        <w:rPr>
+          <w:b/>
+          <w:bCs/>
+          <w:color w:val="000000" w:themeColor="text1"/>
           <w:sz w:val="24"/>
           <w:szCs w:val="24"/>
         </w:rPr>
@@ -4737,40 +4445,42 @@
     </w:p>
     <w:p>
       <w:pPr>
-        <w:pStyle w:val="ListParagraph"/>
-        <w:widowControl w:val="0"/>
-        <w:pBdr>
-          <w:top w:val="nil" w:color="FF000000" w:sz="0" w:space="0"/>
-          <w:left w:val="nil" w:color="FF000000" w:sz="0" w:space="0"/>
-          <w:bottom w:val="nil" w:color="FF000000" w:sz="0" w:space="0"/>
-          <w:right w:val="nil" w:color="FF000000" w:sz="0" w:space="0"/>
-          <w:between w:val="nil" w:color="FF000000" w:sz="0" w:space="0"/>
-        </w:pBdr>
-        <w:ind w:left="720"/>
-        <w:rPr>
-          <w:b w:val="1"/>
-          <w:bCs w:val="1"/>
-          <w:color w:val="000000" w:themeColor="text1" w:themeTint="FF" w:themeShade="FF"/>
-          <w:sz w:val="24"/>
-          <w:szCs w:val="24"/>
-        </w:rPr>
-      </w:pPr>
-    </w:p>
-    <w:p>
-      <w:pPr>
-        <w:pStyle w:val="ListParagraph"/>
-        <w:widowControl w:val="0"/>
-        <w:pBdr>
-          <w:top w:val="nil" w:color="000000" w:sz="0" w:space="0"/>
-          <w:left w:val="nil" w:color="000000" w:sz="0" w:space="0"/>
-          <w:bottom w:val="nil" w:color="000000" w:sz="0" w:space="0"/>
-          <w:right w:val="nil" w:color="000000" w:sz="0" w:space="0"/>
-          <w:between w:val="nil" w:color="000000" w:sz="0" w:space="0"/>
-        </w:pBdr>
-      </w:pPr>
-      <w:r>
+        <w:pStyle w:val="PargrafodaLista"/>
+        <w:widowControl w:val="0"/>
+        <w:pBdr>
+          <w:top w:val="nil"/>
+          <w:left w:val="nil"/>
+          <w:bottom w:val="nil"/>
+          <w:right w:val="nil"/>
+          <w:between w:val="nil"/>
+        </w:pBdr>
+        <w:rPr>
+          <w:b/>
+          <w:bCs/>
+          <w:color w:val="000000" w:themeColor="text1"/>
+          <w:sz w:val="24"/>
+          <w:szCs w:val="24"/>
+        </w:rPr>
+      </w:pPr>
+    </w:p>
+    <w:p>
+      <w:pPr>
+        <w:pStyle w:val="PargrafodaLista"/>
+        <w:widowControl w:val="0"/>
+        <w:pBdr>
+          <w:top w:val="nil"/>
+          <w:left w:val="nil"/>
+          <w:bottom w:val="nil"/>
+          <w:right w:val="nil"/>
+          <w:between w:val="nil"/>
+        </w:pBdr>
+      </w:pPr>
+      <w:r>
+        <w:rPr>
+          <w:noProof/>
+        </w:rPr>
         <w:drawing>
-          <wp:anchor distT="0" distB="0" distL="114300" distR="114300" simplePos="0" relativeHeight="251658240" behindDoc="1" locked="0" layoutInCell="1" allowOverlap="1" wp14:editId="31261053" wp14:anchorId="63196736">
+          <wp:anchor distT="0" distB="0" distL="114300" distR="114300" simplePos="0" relativeHeight="251658240" behindDoc="1" locked="0" layoutInCell="1" allowOverlap="1" wp14:anchorId="63196736" wp14:editId="31261053">
             <wp:simplePos x="0" y="0"/>
             <wp:positionH relativeFrom="column">
               <wp:align>left</wp:align>
@@ -4783,17 +4493,17 @@
             <wp:wrapNone/>
             <wp:docPr id="1925204124" name="drawing"/>
             <wp:cNvGraphicFramePr>
-              <a:graphicFrameLocks noChangeAspect="1"/>
+              <a:graphicFrameLocks xmlns:a="http://schemas.openxmlformats.org/drawingml/2006/main" noChangeAspect="1"/>
             </wp:cNvGraphicFramePr>
-            <a:graphic>
-              <a:graphicData xmlns:a="http://schemas.openxmlformats.org/drawingml/2006/main" uri="http://schemas.openxmlformats.org/drawingml/2006/picture">
+            <a:graphic xmlns:a="http://schemas.openxmlformats.org/drawingml/2006/main">
+              <a:graphicData uri="http://schemas.openxmlformats.org/drawingml/2006/picture">
                 <pic:pic xmlns:pic="http://schemas.openxmlformats.org/drawingml/2006/picture">
                   <pic:nvPicPr>
                     <pic:cNvPr id="2016732651" name="Picture 2016732651"/>
                     <pic:cNvPicPr/>
                   </pic:nvPicPr>
                   <pic:blipFill>
-                    <a:blip xmlns:r="http://schemas.openxmlformats.org/officeDocument/2006/relationships" r:embed="rId187059142">
+                    <a:blip r:embed="rId14">
                       <a:extLst>
                         <a:ext uri="{28A0092B-C50C-407E-A947-70E740481C1C}">
                           <a14:useLocalDpi xmlns:a14="http://schemas.microsoft.com/office/drawing/2010/main"/>
@@ -4805,7 +4515,7 @@
                     </a:stretch>
                   </pic:blipFill>
                   <pic:spPr>
-                    <a:xfrm rot="0">
+                    <a:xfrm>
                       <a:off x="0" y="0"/>
                       <a:ext cx="6038850" cy="820444"/>
                     </a:xfrm>
@@ -4828,199 +4538,199 @@
     </w:p>
     <w:p>
       <w:pPr>
-        <w:pStyle w:val="ListParagraph"/>
-        <w:widowControl w:val="0"/>
-        <w:pBdr>
-          <w:top w:val="nil"/>
-          <w:left w:val="nil"/>
-          <w:bottom w:val="nil"/>
-          <w:right w:val="nil"/>
-          <w:between w:val="nil"/>
-        </w:pBdr>
-        <w:rPr>
-          <w:color w:val="000000" w:themeColor="text1"/>
-        </w:rPr>
-      </w:pPr>
-    </w:p>
-    <w:p>
-      <w:pPr>
-        <w:pStyle w:val="ListParagraph"/>
-        <w:widowControl w:val="0"/>
-        <w:pBdr>
-          <w:top w:val="nil"/>
-          <w:left w:val="nil"/>
-          <w:bottom w:val="nil"/>
-          <w:right w:val="nil"/>
-          <w:between w:val="nil"/>
-        </w:pBdr>
-        <w:rPr>
-          <w:color w:val="000000" w:themeColor="text1"/>
-        </w:rPr>
-      </w:pPr>
-    </w:p>
-    <w:p>
-      <w:pPr>
-        <w:pStyle w:val="ListParagraph"/>
-        <w:widowControl w:val="0"/>
-        <w:pBdr>
-          <w:top w:val="nil"/>
-          <w:left w:val="nil"/>
-          <w:bottom w:val="nil"/>
-          <w:right w:val="nil"/>
-          <w:between w:val="nil"/>
-        </w:pBdr>
-        <w:rPr>
-          <w:color w:val="000000" w:themeColor="text1"/>
-        </w:rPr>
-      </w:pPr>
-    </w:p>
-    <w:p>
-      <w:pPr>
-        <w:pStyle w:val="ListParagraph"/>
-        <w:widowControl w:val="0"/>
-        <w:pBdr>
-          <w:top w:val="nil"/>
-          <w:left w:val="nil"/>
-          <w:bottom w:val="nil"/>
-          <w:right w:val="nil"/>
-          <w:between w:val="nil"/>
-        </w:pBdr>
-        <w:rPr>
-          <w:color w:val="000000" w:themeColor="text1"/>
-        </w:rPr>
-      </w:pPr>
-    </w:p>
-    <w:p>
-      <w:pPr>
-        <w:pStyle w:val="ListParagraph"/>
-        <w:widowControl w:val="0"/>
-        <w:pBdr>
-          <w:top w:val="nil" w:color="FF000000" w:sz="0" w:space="0"/>
-          <w:left w:val="nil" w:color="FF000000" w:sz="0" w:space="0"/>
-          <w:bottom w:val="nil" w:color="FF000000" w:sz="0" w:space="0"/>
-          <w:right w:val="nil" w:color="FF000000" w:sz="0" w:space="0"/>
-          <w:between w:val="nil" w:color="FF000000" w:sz="0" w:space="0"/>
-        </w:pBdr>
-        <w:rPr>
-          <w:color w:val="000000" w:themeColor="text1"/>
-        </w:rPr>
-      </w:pPr>
-    </w:p>
-    <w:p>
-      <w:pPr>
-        <w:pStyle w:val="ListParagraph"/>
-        <w:widowControl w:val="0"/>
-        <w:pBdr>
-          <w:top w:val="nil"/>
-          <w:left w:val="nil"/>
-          <w:bottom w:val="nil"/>
-          <w:right w:val="nil"/>
-          <w:between w:val="nil"/>
-        </w:pBdr>
-        <w:rPr>
-          <w:color w:val="000000" w:themeColor="text1"/>
-        </w:rPr>
-      </w:pPr>
-    </w:p>
-    <w:p>
-      <w:pPr>
-        <w:pStyle w:val="ListParagraph"/>
-        <w:widowControl w:val="0"/>
-        <w:pBdr>
-          <w:top w:val="nil"/>
-          <w:left w:val="nil"/>
-          <w:bottom w:val="nil"/>
-          <w:right w:val="nil"/>
-          <w:between w:val="nil"/>
-        </w:pBdr>
-        <w:rPr>
-          <w:color w:val="000000" w:themeColor="text1"/>
-        </w:rPr>
-      </w:pPr>
-    </w:p>
-    <w:p>
-      <w:pPr>
-        <w:pStyle w:val="ListParagraph"/>
-        <w:widowControl w:val="0"/>
-        <w:pBdr>
-          <w:top w:val="nil"/>
-          <w:left w:val="nil"/>
-          <w:bottom w:val="nil"/>
-          <w:right w:val="nil"/>
-          <w:between w:val="nil"/>
-        </w:pBdr>
-        <w:rPr>
-          <w:color w:val="000000" w:themeColor="text1"/>
-        </w:rPr>
-      </w:pPr>
-    </w:p>
-    <w:p>
-      <w:pPr>
-        <w:pStyle w:val="ListParagraph"/>
-        <w:widowControl w:val="0"/>
-        <w:pBdr>
-          <w:top w:val="nil"/>
-          <w:left w:val="nil"/>
-          <w:bottom w:val="nil"/>
-          <w:right w:val="nil"/>
-          <w:between w:val="nil"/>
-        </w:pBdr>
-        <w:rPr>
-          <w:color w:val="000000" w:themeColor="text1"/>
-        </w:rPr>
-      </w:pPr>
-    </w:p>
-    <w:p>
-      <w:pPr>
-        <w:pStyle w:val="ListParagraph"/>
-        <w:widowControl w:val="0"/>
-        <w:pBdr>
-          <w:top w:val="nil"/>
-          <w:left w:val="nil"/>
-          <w:bottom w:val="nil"/>
-          <w:right w:val="nil"/>
-          <w:between w:val="nil"/>
-        </w:pBdr>
-        <w:rPr>
-          <w:color w:val="000000" w:themeColor="text1"/>
-        </w:rPr>
-      </w:pPr>
-    </w:p>
-    <w:p>
-      <w:pPr>
-        <w:pStyle w:val="ListParagraph"/>
-        <w:widowControl w:val="0"/>
-        <w:pBdr>
-          <w:top w:val="nil"/>
-          <w:left w:val="nil"/>
-          <w:bottom w:val="nil"/>
-          <w:right w:val="nil"/>
-          <w:between w:val="nil"/>
-        </w:pBdr>
-        <w:rPr>
-          <w:color w:val="000000" w:themeColor="text1"/>
-        </w:rPr>
-      </w:pPr>
-    </w:p>
-    <w:p>
-      <w:pPr>
-        <w:pStyle w:val="ListParagraph"/>
-        <w:widowControl w:val="0"/>
-        <w:pBdr>
-          <w:top w:val="nil"/>
-          <w:left w:val="nil"/>
-          <w:bottom w:val="nil"/>
-          <w:right w:val="nil"/>
-          <w:between w:val="nil"/>
-        </w:pBdr>
-        <w:rPr>
-          <w:color w:val="000000" w:themeColor="text1"/>
-        </w:rPr>
-      </w:pPr>
-    </w:p>
-    <w:p>
-      <w:pPr>
-        <w:pStyle w:val="ListParagraph"/>
+        <w:pStyle w:val="PargrafodaLista"/>
+        <w:widowControl w:val="0"/>
+        <w:pBdr>
+          <w:top w:val="nil"/>
+          <w:left w:val="nil"/>
+          <w:bottom w:val="nil"/>
+          <w:right w:val="nil"/>
+          <w:between w:val="nil"/>
+        </w:pBdr>
+        <w:rPr>
+          <w:color w:val="000000" w:themeColor="text1"/>
+        </w:rPr>
+      </w:pPr>
+    </w:p>
+    <w:p>
+      <w:pPr>
+        <w:pStyle w:val="PargrafodaLista"/>
+        <w:widowControl w:val="0"/>
+        <w:pBdr>
+          <w:top w:val="nil"/>
+          <w:left w:val="nil"/>
+          <w:bottom w:val="nil"/>
+          <w:right w:val="nil"/>
+          <w:between w:val="nil"/>
+        </w:pBdr>
+        <w:rPr>
+          <w:color w:val="000000" w:themeColor="text1"/>
+        </w:rPr>
+      </w:pPr>
+    </w:p>
+    <w:p>
+      <w:pPr>
+        <w:pStyle w:val="PargrafodaLista"/>
+        <w:widowControl w:val="0"/>
+        <w:pBdr>
+          <w:top w:val="nil"/>
+          <w:left w:val="nil"/>
+          <w:bottom w:val="nil"/>
+          <w:right w:val="nil"/>
+          <w:between w:val="nil"/>
+        </w:pBdr>
+        <w:rPr>
+          <w:color w:val="000000" w:themeColor="text1"/>
+        </w:rPr>
+      </w:pPr>
+    </w:p>
+    <w:p>
+      <w:pPr>
+        <w:pStyle w:val="PargrafodaLista"/>
+        <w:widowControl w:val="0"/>
+        <w:pBdr>
+          <w:top w:val="nil"/>
+          <w:left w:val="nil"/>
+          <w:bottom w:val="nil"/>
+          <w:right w:val="nil"/>
+          <w:between w:val="nil"/>
+        </w:pBdr>
+        <w:rPr>
+          <w:color w:val="000000" w:themeColor="text1"/>
+        </w:rPr>
+      </w:pPr>
+    </w:p>
+    <w:p>
+      <w:pPr>
+        <w:pStyle w:val="PargrafodaLista"/>
+        <w:widowControl w:val="0"/>
+        <w:pBdr>
+          <w:top w:val="nil"/>
+          <w:left w:val="nil"/>
+          <w:bottom w:val="nil"/>
+          <w:right w:val="nil"/>
+          <w:between w:val="nil"/>
+        </w:pBdr>
+        <w:rPr>
+          <w:color w:val="000000" w:themeColor="text1"/>
+        </w:rPr>
+      </w:pPr>
+    </w:p>
+    <w:p>
+      <w:pPr>
+        <w:pStyle w:val="PargrafodaLista"/>
+        <w:widowControl w:val="0"/>
+        <w:pBdr>
+          <w:top w:val="nil"/>
+          <w:left w:val="nil"/>
+          <w:bottom w:val="nil"/>
+          <w:right w:val="nil"/>
+          <w:between w:val="nil"/>
+        </w:pBdr>
+        <w:rPr>
+          <w:color w:val="000000" w:themeColor="text1"/>
+        </w:rPr>
+      </w:pPr>
+    </w:p>
+    <w:p>
+      <w:pPr>
+        <w:pStyle w:val="PargrafodaLista"/>
+        <w:widowControl w:val="0"/>
+        <w:pBdr>
+          <w:top w:val="nil"/>
+          <w:left w:val="nil"/>
+          <w:bottom w:val="nil"/>
+          <w:right w:val="nil"/>
+          <w:between w:val="nil"/>
+        </w:pBdr>
+        <w:rPr>
+          <w:color w:val="000000" w:themeColor="text1"/>
+        </w:rPr>
+      </w:pPr>
+    </w:p>
+    <w:p>
+      <w:pPr>
+        <w:pStyle w:val="PargrafodaLista"/>
+        <w:widowControl w:val="0"/>
+        <w:pBdr>
+          <w:top w:val="nil"/>
+          <w:left w:val="nil"/>
+          <w:bottom w:val="nil"/>
+          <w:right w:val="nil"/>
+          <w:between w:val="nil"/>
+        </w:pBdr>
+        <w:rPr>
+          <w:color w:val="000000" w:themeColor="text1"/>
+        </w:rPr>
+      </w:pPr>
+    </w:p>
+    <w:p>
+      <w:pPr>
+        <w:pStyle w:val="PargrafodaLista"/>
+        <w:widowControl w:val="0"/>
+        <w:pBdr>
+          <w:top w:val="nil"/>
+          <w:left w:val="nil"/>
+          <w:bottom w:val="nil"/>
+          <w:right w:val="nil"/>
+          <w:between w:val="nil"/>
+        </w:pBdr>
+        <w:rPr>
+          <w:color w:val="000000" w:themeColor="text1"/>
+        </w:rPr>
+      </w:pPr>
+    </w:p>
+    <w:p>
+      <w:pPr>
+        <w:pStyle w:val="PargrafodaLista"/>
+        <w:widowControl w:val="0"/>
+        <w:pBdr>
+          <w:top w:val="nil"/>
+          <w:left w:val="nil"/>
+          <w:bottom w:val="nil"/>
+          <w:right w:val="nil"/>
+          <w:between w:val="nil"/>
+        </w:pBdr>
+        <w:rPr>
+          <w:color w:val="000000" w:themeColor="text1"/>
+        </w:rPr>
+      </w:pPr>
+    </w:p>
+    <w:p>
+      <w:pPr>
+        <w:pStyle w:val="PargrafodaLista"/>
+        <w:widowControl w:val="0"/>
+        <w:pBdr>
+          <w:top w:val="nil"/>
+          <w:left w:val="nil"/>
+          <w:bottom w:val="nil"/>
+          <w:right w:val="nil"/>
+          <w:between w:val="nil"/>
+        </w:pBdr>
+        <w:rPr>
+          <w:color w:val="000000" w:themeColor="text1"/>
+        </w:rPr>
+      </w:pPr>
+    </w:p>
+    <w:p>
+      <w:pPr>
+        <w:pStyle w:val="PargrafodaLista"/>
+        <w:widowControl w:val="0"/>
+        <w:pBdr>
+          <w:top w:val="nil"/>
+          <w:left w:val="nil"/>
+          <w:bottom w:val="nil"/>
+          <w:right w:val="nil"/>
+          <w:between w:val="nil"/>
+        </w:pBdr>
+        <w:rPr>
+          <w:color w:val="000000" w:themeColor="text1"/>
+        </w:rPr>
+      </w:pPr>
+    </w:p>
+    <w:p>
+      <w:pPr>
+        <w:pStyle w:val="PargrafodaLista"/>
         <w:widowControl w:val="0"/>
         <w:pBdr>
           <w:top w:val="nil"/>
@@ -5091,9 +4801,9 @@
         </w:rPr>
         <w:sectPr>
           <w:type w:val="continuous"/>
-          <w:pgSz w:w="11900" w:h="16820" w:orient="portrait"/>
+          <w:pgSz w:w="11900" w:h="16820"/>
           <w:pgMar w:top="708" w:right="697" w:bottom="1723" w:left="1701" w:header="0" w:footer="720" w:gutter="0"/>
-          <w:cols w:equalWidth="0" w:space="720">
+          <w:cols w:space="720" w:equalWidth="0">
             <w:col w:w="9501"/>
           </w:cols>
         </w:sectPr>
@@ -5111,7 +4821,7 @@
         </w:pBdr>
         <w:spacing w:before="442" w:line="240" w:lineRule="auto"/>
         <w:rPr>
-          <w:rFonts w:ascii="Times New Roman" w:hAnsi="Times New Roman" w:eastAsia="Times New Roman" w:cs="Times New Roman"/>
+          <w:rFonts w:ascii="Times New Roman" w:eastAsia="Times New Roman" w:hAnsi="Times New Roman" w:cs="Times New Roman"/>
           <w:b/>
           <w:bCs/>
           <w:color w:val="000000"/>
@@ -5121,13 +4831,14 @@
       </w:pPr>
       <w:r>
         <w:rPr>
-          <w:rFonts w:ascii="Times New Roman" w:hAnsi="Times New Roman" w:eastAsia="Times New Roman" w:cs="Times New Roman"/>
+          <w:rFonts w:ascii="Times New Roman" w:eastAsia="Times New Roman" w:hAnsi="Times New Roman" w:cs="Times New Roman"/>
           <w:b/>
           <w:bCs/>
           <w:color w:val="000000"/>
           <w:sz w:val="24"/>
           <w:szCs w:val="24"/>
         </w:rPr>
+        <w:lastRenderedPageBreak/>
         <w:t xml:space="preserve"> </w:t>
       </w:r>
     </w:p>
@@ -5143,7 +4854,7 @@
         </w:pBdr>
         <w:spacing w:before="588" w:line="240" w:lineRule="auto"/>
         <w:rPr>
-          <w:rFonts w:ascii="Times New Roman" w:hAnsi="Times New Roman" w:eastAsia="Times New Roman" w:cs="Times New Roman"/>
+          <w:rFonts w:ascii="Times New Roman" w:eastAsia="Times New Roman" w:hAnsi="Times New Roman" w:cs="Times New Roman"/>
           <w:b/>
           <w:bCs/>
           <w:color w:val="000000"/>
@@ -5164,7 +4875,7 @@
         </w:pBdr>
         <w:spacing w:before="588" w:line="240" w:lineRule="auto"/>
         <w:rPr>
-          <w:rFonts w:ascii="Times New Roman" w:hAnsi="Times New Roman" w:eastAsia="Times New Roman" w:cs="Times New Roman"/>
+          <w:rFonts w:ascii="Times New Roman" w:eastAsia="Times New Roman" w:hAnsi="Times New Roman" w:cs="Times New Roman"/>
           <w:b/>
           <w:bCs/>
           <w:color w:val="000000"/>
@@ -5186,7 +4897,7 @@
         <w:spacing w:before="135" w:line="343" w:lineRule="auto"/>
         <w:ind w:right="938"/>
         <w:rPr>
-          <w:rFonts w:ascii="Times New Roman" w:hAnsi="Times New Roman" w:eastAsia="Times New Roman" w:cs="Times New Roman"/>
+          <w:rFonts w:ascii="Times New Roman" w:eastAsia="Times New Roman" w:hAnsi="Times New Roman" w:cs="Times New Roman"/>
           <w:color w:val="000000"/>
           <w:sz w:val="24"/>
           <w:szCs w:val="24"/>
@@ -5206,7 +4917,7 @@
         <w:spacing w:before="135" w:line="240" w:lineRule="auto"/>
         <w:ind w:left="378"/>
         <w:rPr>
-          <w:rFonts w:ascii="Times New Roman" w:hAnsi="Times New Roman" w:eastAsia="Times New Roman" w:cs="Times New Roman"/>
+          <w:rFonts w:ascii="Times New Roman" w:eastAsia="Times New Roman" w:hAnsi="Times New Roman" w:cs="Times New Roman"/>
           <w:color w:val="000000"/>
           <w:sz w:val="24"/>
           <w:szCs w:val="24"/>
@@ -5215,9 +4926,9 @@
     </w:p>
     <w:sectPr>
       <w:type w:val="continuous"/>
-      <w:pgSz w:w="11900" w:h="16820" w:orient="portrait"/>
+      <w:pgSz w:w="11900" w:h="16820"/>
       <w:pgMar w:top="708" w:right="697" w:bottom="1723" w:left="1701" w:header="0" w:footer="720" w:gutter="0"/>
-      <w:cols w:equalWidth="0" w:space="720">
+      <w:cols w:space="720" w:equalWidth="0">
         <w:col w:w="9501"/>
       </w:cols>
     </w:sectPr>
@@ -5227,118 +4938,6 @@
 
 <file path=word/numbering.xml><?xml version="1.0" encoding="utf-8"?>
 <w:numbering xmlns:wpc="http://schemas.microsoft.com/office/word/2010/wordprocessingCanvas" xmlns:cx="http://schemas.microsoft.com/office/drawing/2014/chartex" xmlns:cx1="http://schemas.microsoft.com/office/drawing/2015/9/8/chartex" xmlns:cx2="http://schemas.microsoft.com/office/drawing/2015/10/21/chartex" xmlns:cx3="http://schemas.microsoft.com/office/drawing/2016/5/9/chartex" xmlns:cx4="http://schemas.microsoft.com/office/drawing/2016/5/10/chartex" xmlns:cx5="http://schemas.microsoft.com/office/drawing/2016/5/11/chartex" xmlns:cx6="http://schemas.microsoft.com/office/drawing/2016/5/12/chartex" xmlns:cx7="http://schemas.microsoft.com/office/drawing/2016/5/13/chartex" xmlns:cx8="http://schemas.microsoft.com/office/drawing/2016/5/14/chartex" xmlns:mc="http://schemas.openxmlformats.org/markup-compatibility/2006" xmlns:aink="http://schemas.microsoft.com/office/drawing/2016/ink" xmlns:am3d="http://schemas.microsoft.com/office/drawing/2017/model3d" xmlns:o="urn:schemas-microsoft-com:office:office" xmlns:oel="http://schemas.microsoft.com/office/2019/extlst" xmlns:r="http://schemas.openxmlformats.org/officeDocument/2006/relationships" xmlns:m="http://schemas.openxmlformats.org/officeDocument/2006/math" xmlns:v="urn:schemas-microsoft-com:vml" xmlns:wp14="http://schemas.microsoft.com/office/word/2010/wordprocessingDrawing" xmlns:wp="http://schemas.openxmlformats.org/drawingml/2006/wordprocessingDrawing" xmlns:w10="urn:schemas-microsoft-com:office:word" xmlns:w="http://schemas.openxmlformats.org/wordprocessingml/2006/main" xmlns:w14="http://schemas.microsoft.com/office/word/2010/wordml" xmlns:w15="http://schemas.microsoft.com/office/word/2012/wordml" xmlns:w16cex="http://schemas.microsoft.com/office/word/2018/wordml/cex" xmlns:w16cid="http://schemas.microsoft.com/office/word/2016/wordml/cid" xmlns:w16="http://schemas.microsoft.com/office/word/2018/wordml" xmlns:w16du="http://schemas.microsoft.com/office/word/2023/wordml/word16du" xmlns:w16sdtdh="http://schemas.microsoft.com/office/word/2020/wordml/sdtdatahash" xmlns:w16sdtfl="http://schemas.microsoft.com/office/word/2024/wordml/sdtformatlock" xmlns:w16se="http://schemas.microsoft.com/office/word/2015/wordml/symex" xmlns:wpg="http://schemas.microsoft.com/office/word/2010/wordprocessingGroup" xmlns:wpi="http://schemas.microsoft.com/office/word/2010/wordprocessingInk" xmlns:wne="http://schemas.microsoft.com/office/word/2006/wordml" xmlns:wps="http://schemas.microsoft.com/office/word/2010/wordprocessingShape" mc:Ignorable="w14 w15 w16se w16cid w16 w16cex w16sdtdh w16sdtfl w16du wp14">
-  <w:abstractNum xmlns:w="http://schemas.openxmlformats.org/wordprocessingml/2006/main" w:abstractNumId="3">
-    <w:nsid w:val="48fa8905"/>
-    <w:multiLevelType xmlns:w="http://schemas.openxmlformats.org/wordprocessingml/2006/main" w:val="hybridMultilevel"/>
-    <w:lvl xmlns:w="http://schemas.openxmlformats.org/wordprocessingml/2006/main" w:ilvl="0">
-      <w:start w:val="1"/>
-      <w:numFmt w:val="bullet"/>
-      <w:lvlText w:val=""/>
-      <w:lvlJc w:val="left"/>
-      <w:pPr>
-        <w:ind w:left="1080" w:hanging="360"/>
-      </w:pPr>
-      <w:rPr>
-        <w:rFonts w:hint="default" w:ascii="Symbol" w:hAnsi="Symbol"/>
-      </w:rPr>
-    </w:lvl>
-    <w:lvl xmlns:w="http://schemas.openxmlformats.org/wordprocessingml/2006/main" w:ilvl="1">
-      <w:start w:val="1"/>
-      <w:numFmt w:val="bullet"/>
-      <w:lvlText w:val="o"/>
-      <w:lvlJc w:val="left"/>
-      <w:pPr>
-        <w:ind w:left="1800" w:hanging="360"/>
-      </w:pPr>
-      <w:rPr>
-        <w:rFonts w:hint="default" w:ascii="Courier New" w:hAnsi="Courier New"/>
-      </w:rPr>
-    </w:lvl>
-    <w:lvl xmlns:w="http://schemas.openxmlformats.org/wordprocessingml/2006/main" w:ilvl="2">
-      <w:start w:val="1"/>
-      <w:numFmt w:val="bullet"/>
-      <w:lvlText w:val=""/>
-      <w:lvlJc w:val="left"/>
-      <w:pPr>
-        <w:ind w:left="2520" w:hanging="360"/>
-      </w:pPr>
-      <w:rPr>
-        <w:rFonts w:hint="default" w:ascii="Wingdings" w:hAnsi="Wingdings"/>
-      </w:rPr>
-    </w:lvl>
-    <w:lvl xmlns:w="http://schemas.openxmlformats.org/wordprocessingml/2006/main" w:ilvl="3">
-      <w:start w:val="1"/>
-      <w:numFmt w:val="bullet"/>
-      <w:lvlText w:val=""/>
-      <w:lvlJc w:val="left"/>
-      <w:pPr>
-        <w:ind w:left="3240" w:hanging="360"/>
-      </w:pPr>
-      <w:rPr>
-        <w:rFonts w:hint="default" w:ascii="Symbol" w:hAnsi="Symbol"/>
-      </w:rPr>
-    </w:lvl>
-    <w:lvl xmlns:w="http://schemas.openxmlformats.org/wordprocessingml/2006/main" w:ilvl="4">
-      <w:start w:val="1"/>
-      <w:numFmt w:val="bullet"/>
-      <w:lvlText w:val="o"/>
-      <w:lvlJc w:val="left"/>
-      <w:pPr>
-        <w:ind w:left="3960" w:hanging="360"/>
-      </w:pPr>
-      <w:rPr>
-        <w:rFonts w:hint="default" w:ascii="Courier New" w:hAnsi="Courier New"/>
-      </w:rPr>
-    </w:lvl>
-    <w:lvl xmlns:w="http://schemas.openxmlformats.org/wordprocessingml/2006/main" w:ilvl="5">
-      <w:start w:val="1"/>
-      <w:numFmt w:val="bullet"/>
-      <w:lvlText w:val=""/>
-      <w:lvlJc w:val="left"/>
-      <w:pPr>
-        <w:ind w:left="4680" w:hanging="360"/>
-      </w:pPr>
-      <w:rPr>
-        <w:rFonts w:hint="default" w:ascii="Wingdings" w:hAnsi="Wingdings"/>
-      </w:rPr>
-    </w:lvl>
-    <w:lvl xmlns:w="http://schemas.openxmlformats.org/wordprocessingml/2006/main" w:ilvl="6">
-      <w:start w:val="1"/>
-      <w:numFmt w:val="bullet"/>
-      <w:lvlText w:val=""/>
-      <w:lvlJc w:val="left"/>
-      <w:pPr>
-        <w:ind w:left="5400" w:hanging="360"/>
-      </w:pPr>
-      <w:rPr>
-        <w:rFonts w:hint="default" w:ascii="Symbol" w:hAnsi="Symbol"/>
-      </w:rPr>
-    </w:lvl>
-    <w:lvl xmlns:w="http://schemas.openxmlformats.org/wordprocessingml/2006/main" w:ilvl="7">
-      <w:start w:val="1"/>
-      <w:numFmt w:val="bullet"/>
-      <w:lvlText w:val="o"/>
-      <w:lvlJc w:val="left"/>
-      <w:pPr>
-        <w:ind w:left="6120" w:hanging="360"/>
-      </w:pPr>
-      <w:rPr>
-        <w:rFonts w:hint="default" w:ascii="Courier New" w:hAnsi="Courier New"/>
-      </w:rPr>
-    </w:lvl>
-    <w:lvl xmlns:w="http://schemas.openxmlformats.org/wordprocessingml/2006/main" w:ilvl="8">
-      <w:start w:val="1"/>
-      <w:numFmt w:val="bullet"/>
-      <w:lvlText w:val=""/>
-      <w:lvlJc w:val="left"/>
-      <w:pPr>
-        <w:ind w:left="6840" w:hanging="360"/>
-      </w:pPr>
-      <w:rPr>
-        <w:rFonts w:hint="default" w:ascii="Wingdings" w:hAnsi="Wingdings"/>
-      </w:rPr>
-    </w:lvl>
-  </w:abstractNum>
   <w:abstractNum w:abstractNumId="0" w15:restartNumberingAfterBreak="0">
     <w:nsid w:val="238852EA"/>
     <w:multiLevelType w:val="multilevel"/>
@@ -5461,6 +5060,119 @@
     </w:lvl>
   </w:abstractNum>
   <w:abstractNum w:abstractNumId="1" w15:restartNumberingAfterBreak="0">
+    <w:nsid w:val="48FA8905"/>
+    <w:multiLevelType w:val="hybridMultilevel"/>
+    <w:tmpl w:val="6DF84862"/>
+    <w:lvl w:ilvl="0" w:tplc="3A88F95A">
+      <w:start w:val="1"/>
+      <w:numFmt w:val="bullet"/>
+      <w:lvlText w:val=""/>
+      <w:lvlJc w:val="left"/>
+      <w:pPr>
+        <w:ind w:left="1080" w:hanging="360"/>
+      </w:pPr>
+      <w:rPr>
+        <w:rFonts w:ascii="Symbol" w:hAnsi="Symbol" w:hint="default"/>
+      </w:rPr>
+    </w:lvl>
+    <w:lvl w:ilvl="1" w:tplc="8BF470E6">
+      <w:start w:val="1"/>
+      <w:numFmt w:val="bullet"/>
+      <w:lvlText w:val="o"/>
+      <w:lvlJc w:val="left"/>
+      <w:pPr>
+        <w:ind w:left="1800" w:hanging="360"/>
+      </w:pPr>
+      <w:rPr>
+        <w:rFonts w:ascii="Courier New" w:hAnsi="Courier New" w:hint="default"/>
+      </w:rPr>
+    </w:lvl>
+    <w:lvl w:ilvl="2" w:tplc="C7B293BC">
+      <w:start w:val="1"/>
+      <w:numFmt w:val="bullet"/>
+      <w:lvlText w:val=""/>
+      <w:lvlJc w:val="left"/>
+      <w:pPr>
+        <w:ind w:left="2520" w:hanging="360"/>
+      </w:pPr>
+      <w:rPr>
+        <w:rFonts w:ascii="Wingdings" w:hAnsi="Wingdings" w:hint="default"/>
+      </w:rPr>
+    </w:lvl>
+    <w:lvl w:ilvl="3" w:tplc="3D34557A">
+      <w:start w:val="1"/>
+      <w:numFmt w:val="bullet"/>
+      <w:lvlText w:val=""/>
+      <w:lvlJc w:val="left"/>
+      <w:pPr>
+        <w:ind w:left="3240" w:hanging="360"/>
+      </w:pPr>
+      <w:rPr>
+        <w:rFonts w:ascii="Symbol" w:hAnsi="Symbol" w:hint="default"/>
+      </w:rPr>
+    </w:lvl>
+    <w:lvl w:ilvl="4" w:tplc="B25A9E90">
+      <w:start w:val="1"/>
+      <w:numFmt w:val="bullet"/>
+      <w:lvlText w:val="o"/>
+      <w:lvlJc w:val="left"/>
+      <w:pPr>
+        <w:ind w:left="3960" w:hanging="360"/>
+      </w:pPr>
+      <w:rPr>
+        <w:rFonts w:ascii="Courier New" w:hAnsi="Courier New" w:hint="default"/>
+      </w:rPr>
+    </w:lvl>
+    <w:lvl w:ilvl="5" w:tplc="9588EB1A">
+      <w:start w:val="1"/>
+      <w:numFmt w:val="bullet"/>
+      <w:lvlText w:val=""/>
+      <w:lvlJc w:val="left"/>
+      <w:pPr>
+        <w:ind w:left="4680" w:hanging="360"/>
+      </w:pPr>
+      <w:rPr>
+        <w:rFonts w:ascii="Wingdings" w:hAnsi="Wingdings" w:hint="default"/>
+      </w:rPr>
+    </w:lvl>
+    <w:lvl w:ilvl="6" w:tplc="DDAEF8E2">
+      <w:start w:val="1"/>
+      <w:numFmt w:val="bullet"/>
+      <w:lvlText w:val=""/>
+      <w:lvlJc w:val="left"/>
+      <w:pPr>
+        <w:ind w:left="5400" w:hanging="360"/>
+      </w:pPr>
+      <w:rPr>
+        <w:rFonts w:ascii="Symbol" w:hAnsi="Symbol" w:hint="default"/>
+      </w:rPr>
+    </w:lvl>
+    <w:lvl w:ilvl="7" w:tplc="8E20D676">
+      <w:start w:val="1"/>
+      <w:numFmt w:val="bullet"/>
+      <w:lvlText w:val="o"/>
+      <w:lvlJc w:val="left"/>
+      <w:pPr>
+        <w:ind w:left="6120" w:hanging="360"/>
+      </w:pPr>
+      <w:rPr>
+        <w:rFonts w:ascii="Courier New" w:hAnsi="Courier New" w:hint="default"/>
+      </w:rPr>
+    </w:lvl>
+    <w:lvl w:ilvl="8" w:tplc="F58ECC5E">
+      <w:start w:val="1"/>
+      <w:numFmt w:val="bullet"/>
+      <w:lvlText w:val=""/>
+      <w:lvlJc w:val="left"/>
+      <w:pPr>
+        <w:ind w:left="6840" w:hanging="360"/>
+      </w:pPr>
+      <w:rPr>
+        <w:rFonts w:ascii="Wingdings" w:hAnsi="Wingdings" w:hint="default"/>
+      </w:rPr>
+    </w:lvl>
+  </w:abstractNum>
+  <w:abstractNum w:abstractNumId="2" w15:restartNumberingAfterBreak="0">
     <w:nsid w:val="526BA5F5"/>
     <w:multiLevelType w:val="hybridMultilevel"/>
     <w:tmpl w:val="FFFFFFFF"/>
@@ -5546,7 +5258,7 @@
       </w:pPr>
     </w:lvl>
   </w:abstractNum>
-  <w:abstractNum w:abstractNumId="2" w15:restartNumberingAfterBreak="0">
+  <w:abstractNum w:abstractNumId="3" w15:restartNumberingAfterBreak="0">
     <w:nsid w:val="7E2DE34B"/>
     <w:multiLevelType w:val="multilevel"/>
     <w:tmpl w:val="FFFFFFFF"/>
@@ -5632,17 +5344,17 @@
       </w:pPr>
     </w:lvl>
   </w:abstractNum>
-  <w:num w:numId="4">
-    <w:abstractNumId w:val="3"/>
+  <w:num w:numId="1" w16cid:durableId="2019115684">
+    <w:abstractNumId w:val="1"/>
   </w:num>
-  <w:num w:numId="1" w16cid:durableId="670833023">
+  <w:num w:numId="2" w16cid:durableId="670833023">
     <w:abstractNumId w:val="0"/>
   </w:num>
-  <w:num w:numId="2" w16cid:durableId="2015060839">
-    <w:abstractNumId w:val="1"/>
+  <w:num w:numId="3" w16cid:durableId="2015060839">
+    <w:abstractNumId w:val="2"/>
   </w:num>
-  <w:num w:numId="3" w16cid:durableId="262342005">
-    <w:abstractNumId w:val="2"/>
+  <w:num w:numId="4" w16cid:durableId="262342005">
+    <w:abstractNumId w:val="3"/>
   </w:num>
 </w:numbering>
 </file>
@@ -5652,7 +5364,7 @@
   <w:docDefaults>
     <w:rPrDefault>
       <w:rPr>
-        <w:rFonts w:ascii="Arial" w:hAnsi="Arial" w:eastAsia="Arial" w:cs="Arial"/>
+        <w:rFonts w:ascii="Arial" w:eastAsia="Arial" w:hAnsi="Arial" w:cs="Arial"/>
         <w:sz w:val="22"/>
         <w:szCs w:val="22"/>
         <w:lang w:val="pt-BR" w:eastAsia="pt-BR" w:bidi="ar-SA"/>
@@ -5667,14 +5379,14 @@
   <w:latentStyles w:defLockedState="0" w:defUIPriority="99" w:defSemiHidden="0" w:defUnhideWhenUsed="0" w:defQFormat="0" w:count="376">
     <w:lsdException w:name="Normal" w:uiPriority="0" w:qFormat="1"/>
     <w:lsdException w:name="heading 1" w:uiPriority="9" w:qFormat="1"/>
-    <w:lsdException w:name="heading 2" w:uiPriority="9" w:semiHidden="1" w:unhideWhenUsed="1" w:qFormat="1"/>
-    <w:lsdException w:name="heading 3" w:uiPriority="9" w:semiHidden="1" w:unhideWhenUsed="1" w:qFormat="1"/>
-    <w:lsdException w:name="heading 4" w:uiPriority="9" w:semiHidden="1" w:unhideWhenUsed="1" w:qFormat="1"/>
-    <w:lsdException w:name="heading 5" w:uiPriority="9" w:semiHidden="1" w:unhideWhenUsed="1" w:qFormat="1"/>
-    <w:lsdException w:name="heading 6" w:uiPriority="9" w:semiHidden="1" w:unhideWhenUsed="1" w:qFormat="1"/>
-    <w:lsdException w:name="heading 7" w:uiPriority="9" w:semiHidden="1" w:unhideWhenUsed="1" w:qFormat="1"/>
-    <w:lsdException w:name="heading 8" w:uiPriority="9" w:semiHidden="1" w:unhideWhenUsed="1" w:qFormat="1"/>
-    <w:lsdException w:name="heading 9" w:uiPriority="9" w:semiHidden="1" w:unhideWhenUsed="1" w:qFormat="1"/>
+    <w:lsdException w:name="heading 2" w:semiHidden="1" w:uiPriority="9" w:unhideWhenUsed="1" w:qFormat="1"/>
+    <w:lsdException w:name="heading 3" w:semiHidden="1" w:uiPriority="9" w:unhideWhenUsed="1" w:qFormat="1"/>
+    <w:lsdException w:name="heading 4" w:semiHidden="1" w:uiPriority="9" w:unhideWhenUsed="1" w:qFormat="1"/>
+    <w:lsdException w:name="heading 5" w:semiHidden="1" w:uiPriority="9" w:unhideWhenUsed="1" w:qFormat="1"/>
+    <w:lsdException w:name="heading 6" w:semiHidden="1" w:uiPriority="9" w:unhideWhenUsed="1" w:qFormat="1"/>
+    <w:lsdException w:name="heading 7" w:semiHidden="1" w:uiPriority="9" w:unhideWhenUsed="1" w:qFormat="1"/>
+    <w:lsdException w:name="heading 8" w:semiHidden="1" w:uiPriority="9" w:unhideWhenUsed="1" w:qFormat="1"/>
+    <w:lsdException w:name="heading 9" w:semiHidden="1" w:uiPriority="9" w:unhideWhenUsed="1" w:qFormat="1"/>
     <w:lsdException w:name="index 1" w:semiHidden="1" w:unhideWhenUsed="1"/>
     <w:lsdException w:name="index 2" w:semiHidden="1" w:unhideWhenUsed="1"/>
     <w:lsdException w:name="index 3" w:semiHidden="1" w:unhideWhenUsed="1"/>
@@ -5684,22 +5396,22 @@
     <w:lsdException w:name="index 7" w:semiHidden="1" w:unhideWhenUsed="1"/>
     <w:lsdException w:name="index 8" w:semiHidden="1" w:unhideWhenUsed="1"/>
     <w:lsdException w:name="index 9" w:semiHidden="1" w:unhideWhenUsed="1"/>
-    <w:lsdException w:name="toc 1" w:uiPriority="39" w:semiHidden="1" w:unhideWhenUsed="1"/>
-    <w:lsdException w:name="toc 2" w:uiPriority="39" w:semiHidden="1" w:unhideWhenUsed="1"/>
-    <w:lsdException w:name="toc 3" w:uiPriority="39" w:semiHidden="1" w:unhideWhenUsed="1"/>
-    <w:lsdException w:name="toc 4" w:uiPriority="39" w:semiHidden="1" w:unhideWhenUsed="1"/>
-    <w:lsdException w:name="toc 5" w:uiPriority="39" w:semiHidden="1" w:unhideWhenUsed="1"/>
-    <w:lsdException w:name="toc 6" w:uiPriority="39" w:semiHidden="1" w:unhideWhenUsed="1"/>
-    <w:lsdException w:name="toc 7" w:uiPriority="39" w:semiHidden="1" w:unhideWhenUsed="1"/>
-    <w:lsdException w:name="toc 8" w:uiPriority="39" w:semiHidden="1" w:unhideWhenUsed="1"/>
-    <w:lsdException w:name="toc 9" w:uiPriority="39" w:semiHidden="1" w:unhideWhenUsed="1"/>
+    <w:lsdException w:name="toc 1" w:semiHidden="1" w:uiPriority="39" w:unhideWhenUsed="1"/>
+    <w:lsdException w:name="toc 2" w:semiHidden="1" w:uiPriority="39" w:unhideWhenUsed="1"/>
+    <w:lsdException w:name="toc 3" w:semiHidden="1" w:uiPriority="39" w:unhideWhenUsed="1"/>
+    <w:lsdException w:name="toc 4" w:semiHidden="1" w:uiPriority="39" w:unhideWhenUsed="1"/>
+    <w:lsdException w:name="toc 5" w:semiHidden="1" w:uiPriority="39" w:unhideWhenUsed="1"/>
+    <w:lsdException w:name="toc 6" w:semiHidden="1" w:uiPriority="39" w:unhideWhenUsed="1"/>
+    <w:lsdException w:name="toc 7" w:semiHidden="1" w:uiPriority="39" w:unhideWhenUsed="1"/>
+    <w:lsdException w:name="toc 8" w:semiHidden="1" w:uiPriority="39" w:unhideWhenUsed="1"/>
+    <w:lsdException w:name="toc 9" w:semiHidden="1" w:uiPriority="39" w:unhideWhenUsed="1"/>
     <w:lsdException w:name="Normal Indent" w:semiHidden="1" w:unhideWhenUsed="1"/>
     <w:lsdException w:name="footnote text" w:semiHidden="1" w:unhideWhenUsed="1"/>
     <w:lsdException w:name="annotation text" w:semiHidden="1" w:unhideWhenUsed="1"/>
     <w:lsdException w:name="header" w:semiHidden="1" w:unhideWhenUsed="1"/>
     <w:lsdException w:name="footer" w:semiHidden="1" w:unhideWhenUsed="1"/>
     <w:lsdException w:name="index heading" w:semiHidden="1" w:unhideWhenUsed="1"/>
-    <w:lsdException w:name="caption" w:uiPriority="35" w:semiHidden="1" w:unhideWhenUsed="1" w:qFormat="1"/>
+    <w:lsdException w:name="caption" w:semiHidden="1" w:uiPriority="35" w:unhideWhenUsed="1" w:qFormat="1"/>
     <w:lsdException w:name="table of figures" w:semiHidden="1" w:unhideWhenUsed="1"/>
     <w:lsdException w:name="envelope address" w:semiHidden="1" w:unhideWhenUsed="1"/>
     <w:lsdException w:name="envelope return" w:semiHidden="1" w:unhideWhenUsed="1"/>
@@ -5730,7 +5442,7 @@
     <w:lsdException w:name="Title" w:uiPriority="10" w:qFormat="1"/>
     <w:lsdException w:name="Closing" w:semiHidden="1" w:unhideWhenUsed="1"/>
     <w:lsdException w:name="Signature" w:semiHidden="1" w:unhideWhenUsed="1"/>
-    <w:lsdException w:name="Default Paragraph Font" w:uiPriority="1" w:semiHidden="1" w:unhideWhenUsed="1"/>
+    <w:lsdException w:name="Default Paragraph Font" w:semiHidden="1" w:uiPriority="1" w:unhideWhenUsed="1"/>
     <w:lsdException w:name="Body Text" w:semiHidden="1" w:unhideWhenUsed="1"/>
     <w:lsdException w:name="Body Text Indent" w:semiHidden="1" w:unhideWhenUsed="1"/>
     <w:lsdException w:name="List Continue" w:semiHidden="1" w:unhideWhenUsed="1"/>
@@ -5930,8 +5642,8 @@
     <w:lsdException w:name="Subtle Reference" w:uiPriority="31" w:qFormat="1"/>
     <w:lsdException w:name="Intense Reference" w:uiPriority="32" w:qFormat="1"/>
     <w:lsdException w:name="Book Title" w:uiPriority="33" w:qFormat="1"/>
-    <w:lsdException w:name="Bibliography" w:uiPriority="37" w:semiHidden="1" w:unhideWhenUsed="1"/>
-    <w:lsdException w:name="TOC Heading" w:uiPriority="39" w:semiHidden="1" w:unhideWhenUsed="1" w:qFormat="1"/>
+    <w:lsdException w:name="Bibliography" w:semiHidden="1" w:uiPriority="37" w:unhideWhenUsed="1"/>
+    <w:lsdException w:name="TOC Heading" w:semiHidden="1" w:uiPriority="39" w:unhideWhenUsed="1" w:qFormat="1"/>
     <w:lsdException w:name="Plain Table 1" w:uiPriority="41"/>
     <w:lsdException w:name="Plain Table 2" w:uiPriority="42"/>
     <w:lsdException w:name="Plain Table 3" w:uiPriority="43"/>
@@ -6042,11 +5754,11 @@
     <w:lsdException w:name="Unresolved Mention" w:semiHidden="1" w:unhideWhenUsed="1"/>
     <w:lsdException w:name="Smart Link" w:semiHidden="1" w:unhideWhenUsed="1"/>
   </w:latentStyles>
-  <w:style w:type="paragraph" w:styleId="Normal" w:default="1">
+  <w:style w:type="paragraph" w:default="1" w:styleId="Normal">
     <w:name w:val="Normal"/>
     <w:qFormat/>
   </w:style>
-  <w:style w:type="paragraph" w:styleId="Heading1">
+  <w:style w:type="paragraph" w:styleId="Ttulo1">
     <w:name w:val="heading 1"/>
     <w:basedOn w:val="Normal"/>
     <w:next w:val="Normal"/>
@@ -6065,7 +5777,7 @@
       <w:szCs w:val="48"/>
     </w:rPr>
   </w:style>
-  <w:style w:type="paragraph" w:styleId="Heading2">
+  <w:style w:type="paragraph" w:styleId="Ttulo2">
     <w:name w:val="heading 2"/>
     <w:basedOn w:val="Normal"/>
     <w:next w:val="Normal"/>
@@ -6086,7 +5798,7 @@
       <w:szCs w:val="36"/>
     </w:rPr>
   </w:style>
-  <w:style w:type="paragraph" w:styleId="Heading3">
+  <w:style w:type="paragraph" w:styleId="Ttulo3">
     <w:name w:val="heading 3"/>
     <w:basedOn w:val="Normal"/>
     <w:next w:val="Normal"/>
@@ -6107,7 +5819,7 @@
       <w:szCs w:val="28"/>
     </w:rPr>
   </w:style>
-  <w:style w:type="paragraph" w:styleId="Heading4">
+  <w:style w:type="paragraph" w:styleId="Ttulo4">
     <w:name w:val="heading 4"/>
     <w:basedOn w:val="Normal"/>
     <w:next w:val="Normal"/>
@@ -6128,7 +5840,7 @@
       <w:szCs w:val="24"/>
     </w:rPr>
   </w:style>
-  <w:style w:type="paragraph" w:styleId="Heading5">
+  <w:style w:type="paragraph" w:styleId="Ttulo5">
     <w:name w:val="heading 5"/>
     <w:basedOn w:val="Normal"/>
     <w:next w:val="Normal"/>
@@ -6147,7 +5859,7 @@
       <w:bCs/>
     </w:rPr>
   </w:style>
-  <w:style w:type="paragraph" w:styleId="Heading6">
+  <w:style w:type="paragraph" w:styleId="Ttulo6">
     <w:name w:val="heading 6"/>
     <w:basedOn w:val="Normal"/>
     <w:next w:val="Normal"/>
@@ -6168,13 +5880,13 @@
       <w:szCs w:val="20"/>
     </w:rPr>
   </w:style>
-  <w:style w:type="character" w:styleId="DefaultParagraphFont" w:default="1">
+  <w:style w:type="character" w:default="1" w:styleId="Fontepargpadro">
     <w:name w:val="Default Paragraph Font"/>
     <w:uiPriority w:val="1"/>
     <w:semiHidden/>
     <w:unhideWhenUsed/>
   </w:style>
-  <w:style w:type="table" w:styleId="TableNormal" w:default="1">
+  <w:style w:type="table" w:default="1" w:styleId="Tabelanormal">
     <w:name w:val="Normal Table"/>
     <w:uiPriority w:val="99"/>
     <w:semiHidden/>
@@ -6189,13 +5901,13 @@
       </w:tblCellMar>
     </w:tblPr>
   </w:style>
-  <w:style w:type="numbering" w:styleId="NoList" w:default="1">
+  <w:style w:type="numbering" w:default="1" w:styleId="Semlista">
     <w:name w:val="No List"/>
     <w:uiPriority w:val="99"/>
     <w:semiHidden/>
     <w:unhideWhenUsed/>
   </w:style>
-  <w:style w:type="table" w:styleId="TableNormal0" w:customStyle="1">
+  <w:style w:type="table" w:customStyle="1" w:styleId="TableNormal">
     <w:name w:val="TableNormal"/>
     <w:tblPr>
       <w:tblCellMar>
@@ -6206,7 +5918,7 @@
       </w:tblCellMar>
     </w:tblPr>
   </w:style>
-  <w:style w:type="paragraph" w:styleId="Title">
+  <w:style w:type="paragraph" w:styleId="Ttulo">
     <w:name w:val="Title"/>
     <w:basedOn w:val="Normal"/>
     <w:next w:val="Normal"/>
@@ -6224,7 +5936,7 @@
       <w:szCs w:val="72"/>
     </w:rPr>
   </w:style>
-  <w:style w:type="paragraph" w:styleId="Subtitle">
+  <w:style w:type="paragraph" w:styleId="Subttulo">
     <w:name w:val="Subtitle"/>
     <w:basedOn w:val="Normal"/>
     <w:next w:val="Normal"/>
@@ -6236,7 +5948,7 @@
       <w:spacing w:before="360" w:after="80"/>
     </w:pPr>
     <w:rPr>
-      <w:rFonts w:ascii="Georgia" w:hAnsi="Georgia" w:eastAsia="Georgia" w:cs="Georgia"/>
+      <w:rFonts w:ascii="Georgia" w:eastAsia="Georgia" w:hAnsi="Georgia" w:cs="Georgia"/>
       <w:i/>
       <w:iCs/>
       <w:color w:val="666666"/>
@@ -6244,42 +5956,42 @@
       <w:szCs w:val="48"/>
     </w:rPr>
   </w:style>
-  <w:style w:type="table" w:styleId="a" w:customStyle="1">
-    <w:basedOn w:val="TableNormal0"/>
+  <w:style w:type="table" w:customStyle="1" w:styleId="a">
+    <w:basedOn w:val="TableNormal"/>
     <w:tblPr>
       <w:tblStyleRowBandSize w:val="1"/>
       <w:tblStyleColBandSize w:val="1"/>
     </w:tblPr>
   </w:style>
-  <w:style w:type="table" w:styleId="a0" w:customStyle="1">
-    <w:basedOn w:val="TableNormal0"/>
+  <w:style w:type="table" w:customStyle="1" w:styleId="a0">
+    <w:basedOn w:val="TableNormal"/>
     <w:tblPr>
       <w:tblStyleRowBandSize w:val="1"/>
       <w:tblStyleColBandSize w:val="1"/>
     </w:tblPr>
   </w:style>
-  <w:style w:type="table" w:styleId="a1" w:customStyle="1">
-    <w:basedOn w:val="TableNormal0"/>
+  <w:style w:type="table" w:customStyle="1" w:styleId="a1">
+    <w:basedOn w:val="TableNormal"/>
     <w:tblPr>
       <w:tblStyleRowBandSize w:val="1"/>
       <w:tblStyleColBandSize w:val="1"/>
     </w:tblPr>
   </w:style>
-  <w:style w:type="table" w:styleId="a2" w:customStyle="1">
-    <w:basedOn w:val="TableNormal0"/>
+  <w:style w:type="table" w:customStyle="1" w:styleId="a2">
+    <w:basedOn w:val="TableNormal"/>
     <w:tblPr>
       <w:tblStyleRowBandSize w:val="1"/>
       <w:tblStyleColBandSize w:val="1"/>
     </w:tblPr>
   </w:style>
-  <w:style w:type="table" w:styleId="a3" w:customStyle="1">
-    <w:basedOn w:val="TableNormal0"/>
+  <w:style w:type="table" w:customStyle="1" w:styleId="a3">
+    <w:basedOn w:val="TableNormal"/>
     <w:tblPr>
       <w:tblStyleRowBandSize w:val="1"/>
       <w:tblStyleColBandSize w:val="1"/>
     </w:tblPr>
   </w:style>
-  <w:style w:type="paragraph" w:styleId="ListParagraph">
+  <w:style w:type="paragraph" w:styleId="PargrafodaLista">
     <w:name w:val="List Paragraph"/>
     <w:basedOn w:val="Normal"/>
     <w:uiPriority w:val="34"/>
@@ -6290,7 +6002,7 @@
       <w:contextualSpacing/>
     </w:pPr>
   </w:style>
-  <w:style w:type="paragraph" w:styleId="NoSpacing">
+  <w:style w:type="paragraph" w:styleId="SemEspaamento">
     <w:name w:val="No Spacing"/>
     <w:uiPriority w:val="1"/>
     <w:qFormat/>
@@ -6299,9 +6011,9 @@
       <w:spacing w:line="240" w:lineRule="auto"/>
     </w:pPr>
   </w:style>
-  <w:style w:type="table" w:styleId="TableGrid">
+  <w:style w:type="table" w:styleId="Tabelacomgrade">
     <w:name w:val="Table Grid"/>
-    <w:basedOn w:val="TableNormal"/>
+    <w:basedOn w:val="Tabelanormal"/>
     <w:uiPriority w:val="59"/>
     <w:rsid w:val="00FB4123"/>
     <w:pPr>
@@ -6309,12 +6021,12 @@
     </w:pPr>
     <w:tblPr>
       <w:tblBorders>
-        <w:top w:val="single" w:color="000000" w:themeColor="text1" w:sz="4" w:space="0"/>
-        <w:left w:val="single" w:color="000000" w:themeColor="text1" w:sz="4" w:space="0"/>
-        <w:bottom w:val="single" w:color="000000" w:themeColor="text1" w:sz="4" w:space="0"/>
-        <w:right w:val="single" w:color="000000" w:themeColor="text1" w:sz="4" w:space="0"/>
-        <w:insideH w:val="single" w:color="000000" w:themeColor="text1" w:sz="4" w:space="0"/>
-        <w:insideV w:val="single" w:color="000000" w:themeColor="text1" w:sz="4" w:space="0"/>
+        <w:top w:val="single" w:sz="4" w:space="0" w:color="000000" w:themeColor="text1"/>
+        <w:left w:val="single" w:sz="4" w:space="0" w:color="000000" w:themeColor="text1"/>
+        <w:bottom w:val="single" w:sz="4" w:space="0" w:color="000000" w:themeColor="text1"/>
+        <w:right w:val="single" w:sz="4" w:space="0" w:color="000000" w:themeColor="text1"/>
+        <w:insideH w:val="single" w:sz="4" w:space="0" w:color="000000" w:themeColor="text1"/>
+        <w:insideV w:val="single" w:sz="4" w:space="0" w:color="000000" w:themeColor="text1"/>
       </w:tblBorders>
     </w:tblPr>
   </w:style>
@@ -6651,14 +6363,6 @@
 </file>
 
 <file path=customXml/item2.xml><?xml version="1.0" encoding="utf-8"?>
-<p:properties xmlns:p="http://schemas.microsoft.com/office/2006/metadata/properties" xmlns:xsi="http://www.w3.org/2001/XMLSchema-instance" xmlns:pc="http://schemas.microsoft.com/office/infopath/2007/PartnerControls">
-  <documentManagement>
-    <_activity xmlns="a3b8b72c-03c5-44cc-b194-c2c6e47f62f8" xsi:nil="true"/>
-  </documentManagement>
-</p:properties>
-</file>
-
-<file path=customXml/item3.xml><?xml version="1.0" encoding="utf-8"?>
 <ct:contentTypeSchema xmlns:ct="http://schemas.microsoft.com/office/2006/metadata/contentType" xmlns:ma="http://schemas.microsoft.com/office/2006/metadata/properties/metaAttributes" ct:_="" ma:_="" ma:contentTypeName="Documento" ma:contentTypeID="0x0101005BF2985CFFB49349BE60D97B0A45B726" ma:contentTypeVersion="15" ma:contentTypeDescription="Crie um novo documento." ma:contentTypeScope="" ma:versionID="d24e9181a21e45c7186a6fe956e4addd">
   <xsd:schema xmlns:xsd="http://www.w3.org/2001/XMLSchema" xmlns:xs="http://www.w3.org/2001/XMLSchema" xmlns:p="http://schemas.microsoft.com/office/2006/metadata/properties" xmlns:ns3="a3b8b72c-03c5-44cc-b194-c2c6e47f62f8" xmlns:ns4="50ec6b0d-6caf-4fb2-be3f-c78322c6073f" targetNamespace="http://schemas.microsoft.com/office/2006/metadata/properties" ma:root="true" ma:fieldsID="8f0e5358839eddf8f586ecbcad9734bb" ns3:_="" ns4:_="">
     <xsd:import namespace="a3b8b72c-03c5-44cc-b194-c2c6e47f62f8"/>
@@ -6893,6 +6597,14 @@
 </ct:contentTypeSchema>
 </file>
 
+<file path=customXml/item3.xml><?xml version="1.0" encoding="utf-8"?>
+<p:properties xmlns:p="http://schemas.microsoft.com/office/2006/metadata/properties" xmlns:xsi="http://www.w3.org/2001/XMLSchema-instance" xmlns:pc="http://schemas.microsoft.com/office/infopath/2007/PartnerControls">
+  <documentManagement>
+    <_activity xmlns="a3b8b72c-03c5-44cc-b194-c2c6e47f62f8" xsi:nil="true"/>
+  </documentManagement>
+</p:properties>
+</file>
+
 <file path=customXml/itemProps1.xml><?xml version="1.0" encoding="utf-8"?>
 <ds:datastoreItem xmlns:ds="http://schemas.openxmlformats.org/officeDocument/2006/customXml" ds:itemID="{9EB0741B-F6BC-462C-ADE9-8A19F0D2A797}">
   <ds:schemaRefs>
@@ -6902,16 +6614,6 @@
 </file>
 
 <file path=customXml/itemProps2.xml><?xml version="1.0" encoding="utf-8"?>
-<ds:datastoreItem xmlns:ds="http://schemas.openxmlformats.org/officeDocument/2006/customXml" ds:itemID="{BAA471BA-09C8-4BB8-8432-03574986359C}">
-  <ds:schemaRefs>
-    <ds:schemaRef ds:uri="http://schemas.microsoft.com/office/2006/metadata/properties"/>
-    <ds:schemaRef ds:uri="http://schemas.microsoft.com/office/infopath/2007/PartnerControls"/>
-    <ds:schemaRef ds:uri="a3b8b72c-03c5-44cc-b194-c2c6e47f62f8"/>
-  </ds:schemaRefs>
-</ds:datastoreItem>
-</file>
-
-<file path=customXml/itemProps3.xml><?xml version="1.0" encoding="utf-8"?>
 <ds:datastoreItem xmlns:ds="http://schemas.openxmlformats.org/officeDocument/2006/customXml" ds:itemID="{C158FAF7-C932-4DEC-9B9C-39F76D3DA621}">
   <ds:schemaRefs>
     <ds:schemaRef ds:uri="http://schemas.microsoft.com/office/2006/metadata/contentType"/>
@@ -6928,4 +6630,14 @@
     <ds:schemaRef ds:uri="http://schemas.microsoft.com/internal/obd"/>
   </ds:schemaRefs>
 </ds:datastoreItem>
+</file>
+
+<file path=customXml/itemProps3.xml><?xml version="1.0" encoding="utf-8"?>
+<ds:datastoreItem xmlns:ds="http://schemas.openxmlformats.org/officeDocument/2006/customXml" ds:itemID="{BAA471BA-09C8-4BB8-8432-03574986359C}">
+  <ds:schemaRefs>
+    <ds:schemaRef ds:uri="http://schemas.microsoft.com/office/2006/metadata/properties"/>
+    <ds:schemaRef ds:uri="http://schemas.microsoft.com/office/infopath/2007/PartnerControls"/>
+    <ds:schemaRef ds:uri="a3b8b72c-03c5-44cc-b194-c2c6e47f62f8"/>
+  </ds:schemaRefs>
+</ds:datastoreItem>
 </file>
</xml_diff>

<commit_message>
Adição da Documentação Atualizada, Adição do chat bot nas paginas
</commit_message>
<xml_diff>
--- a/DOC/Escopo Patinhas Felizes.docx
+++ b/DOC/Escopo Patinhas Felizes.docx
@@ -678,7 +678,23 @@
                 <w:sz w:val="24"/>
                 <w:szCs w:val="24"/>
               </w:rPr>
-              <w:t xml:space="preserve">Maria, </w:t>
+              <w:t>Maria</w:t>
+            </w:r>
+            <w:r>
+              <w:rPr>
+                <w:color w:val="000000" w:themeColor="text1"/>
+                <w:sz w:val="24"/>
+                <w:szCs w:val="24"/>
+              </w:rPr>
+              <w:t xml:space="preserve"> C</w:t>
+            </w:r>
+            <w:r>
+              <w:rPr>
+                <w:color w:val="000000" w:themeColor="text1"/>
+                <w:sz w:val="24"/>
+                <w:szCs w:val="24"/>
+              </w:rPr>
+              <w:t xml:space="preserve">, </w:t>
             </w:r>
             <w:r>
               <w:rPr>
@@ -6354,15 +6370,6 @@
 </file>
 
 <file path=customXml/item1.xml><?xml version="1.0" encoding="utf-8"?>
-<?mso-contentType ?>
-<FormTemplates xmlns="http://schemas.microsoft.com/sharepoint/v3/contenttype/forms">
-  <Display>DocumentLibraryForm</Display>
-  <Edit>DocumentLibraryForm</Edit>
-  <New>DocumentLibraryForm</New>
-</FormTemplates>
-</file>
-
-<file path=customXml/item2.xml><?xml version="1.0" encoding="utf-8"?>
 <ct:contentTypeSchema xmlns:ct="http://schemas.microsoft.com/office/2006/metadata/contentType" xmlns:ma="http://schemas.microsoft.com/office/2006/metadata/properties/metaAttributes" ct:_="" ma:_="" ma:contentTypeName="Documento" ma:contentTypeID="0x0101005BF2985CFFB49349BE60D97B0A45B726" ma:contentTypeVersion="15" ma:contentTypeDescription="Crie um novo documento." ma:contentTypeScope="" ma:versionID="d24e9181a21e45c7186a6fe956e4addd">
   <xsd:schema xmlns:xsd="http://www.w3.org/2001/XMLSchema" xmlns:xs="http://www.w3.org/2001/XMLSchema" xmlns:p="http://schemas.microsoft.com/office/2006/metadata/properties" xmlns:ns3="a3b8b72c-03c5-44cc-b194-c2c6e47f62f8" xmlns:ns4="50ec6b0d-6caf-4fb2-be3f-c78322c6073f" targetNamespace="http://schemas.microsoft.com/office/2006/metadata/properties" ma:root="true" ma:fieldsID="8f0e5358839eddf8f586ecbcad9734bb" ns3:_="" ns4:_="">
     <xsd:import namespace="a3b8b72c-03c5-44cc-b194-c2c6e47f62f8"/>
@@ -6597,6 +6604,15 @@
 </ct:contentTypeSchema>
 </file>
 
+<file path=customXml/item2.xml><?xml version="1.0" encoding="utf-8"?>
+<?mso-contentType ?>
+<FormTemplates xmlns="http://schemas.microsoft.com/sharepoint/v3/contenttype/forms">
+  <Display>DocumentLibraryForm</Display>
+  <Edit>DocumentLibraryForm</Edit>
+  <New>DocumentLibraryForm</New>
+</FormTemplates>
+</file>
+
 <file path=customXml/item3.xml><?xml version="1.0" encoding="utf-8"?>
 <p:properties xmlns:p="http://schemas.microsoft.com/office/2006/metadata/properties" xmlns:xsi="http://www.w3.org/2001/XMLSchema-instance" xmlns:pc="http://schemas.microsoft.com/office/infopath/2007/PartnerControls">
   <documentManagement>
@@ -6606,14 +6622,6 @@
 </file>
 
 <file path=customXml/itemProps1.xml><?xml version="1.0" encoding="utf-8"?>
-<ds:datastoreItem xmlns:ds="http://schemas.openxmlformats.org/officeDocument/2006/customXml" ds:itemID="{9EB0741B-F6BC-462C-ADE9-8A19F0D2A797}">
-  <ds:schemaRefs>
-    <ds:schemaRef ds:uri="http://schemas.microsoft.com/sharepoint/v3/contenttype/forms"/>
-  </ds:schemaRefs>
-</ds:datastoreItem>
-</file>
-
-<file path=customXml/itemProps2.xml><?xml version="1.0" encoding="utf-8"?>
 <ds:datastoreItem xmlns:ds="http://schemas.openxmlformats.org/officeDocument/2006/customXml" ds:itemID="{C158FAF7-C932-4DEC-9B9C-39F76D3DA621}">
   <ds:schemaRefs>
     <ds:schemaRef ds:uri="http://schemas.microsoft.com/office/2006/metadata/contentType"/>
@@ -6632,6 +6640,14 @@
 </ds:datastoreItem>
 </file>
 
+<file path=customXml/itemProps2.xml><?xml version="1.0" encoding="utf-8"?>
+<ds:datastoreItem xmlns:ds="http://schemas.openxmlformats.org/officeDocument/2006/customXml" ds:itemID="{9EB0741B-F6BC-462C-ADE9-8A19F0D2A797}">
+  <ds:schemaRefs>
+    <ds:schemaRef ds:uri="http://schemas.microsoft.com/sharepoint/v3/contenttype/forms"/>
+  </ds:schemaRefs>
+</ds:datastoreItem>
+</file>
+
 <file path=customXml/itemProps3.xml><?xml version="1.0" encoding="utf-8"?>
 <ds:datastoreItem xmlns:ds="http://schemas.openxmlformats.org/officeDocument/2006/customXml" ds:itemID="{BAA471BA-09C8-4BB8-8432-03574986359C}">
   <ds:schemaRefs>

</xml_diff>